<commit_message>
Agregue entidades del modelo
</commit_message>
<xml_diff>
--- a/MusicStore.docx
+++ b/MusicStore.docx
@@ -72,8 +72,13 @@
           <w:numId w:val="1"/>
         </w:numPr>
       </w:pPr>
-      <w:r>
-        <w:t xml:space="preserve">nombreUsuario </w:t>
+      <w:proofErr w:type="spellStart"/>
+      <w:r>
+        <w:t>nombreUsuario</w:t>
+      </w:r>
+      <w:proofErr w:type="spellEnd"/>
+      <w:r>
+        <w:t xml:space="preserve"> </w:t>
       </w:r>
     </w:p>
     <w:p>
@@ -198,7 +203,7 @@
         </w:numPr>
       </w:pPr>
       <w:r>
-        <w:t xml:space="preserve">marca </w:t>
+        <w:t xml:space="preserve">precio </w:t>
       </w:r>
     </w:p>
     <w:p>
@@ -209,7 +214,7 @@
         </w:numPr>
       </w:pPr>
       <w:r>
-        <w:t xml:space="preserve">precio </w:t>
+        <w:t xml:space="preserve">stock </w:t>
       </w:r>
     </w:p>
     <w:p>
@@ -220,7 +225,7 @@
         </w:numPr>
       </w:pPr>
       <w:r>
-        <w:t xml:space="preserve">stock </w:t>
+        <w:t xml:space="preserve">categoría </w:t>
       </w:r>
     </w:p>
     <w:p>
@@ -231,7 +236,7 @@
         </w:numPr>
       </w:pPr>
       <w:r>
-        <w:t xml:space="preserve">categoría </w:t>
+        <w:t>proveedor</w:t>
       </w:r>
     </w:p>
     <w:p>
@@ -241,20 +246,11 @@
           <w:numId w:val="3"/>
         </w:numPr>
       </w:pPr>
-      <w:r>
-        <w:t>proveedor</w:t>
-      </w:r>
-    </w:p>
-    <w:p>
-      <w:pPr>
-        <w:numPr>
-          <w:ilvl w:val="0"/>
-          <w:numId w:val="3"/>
-        </w:numPr>
-      </w:pPr>
+      <w:proofErr w:type="spellStart"/>
       <w:r>
         <w:t>descripcion</w:t>
       </w:r>
+      <w:proofErr w:type="spellEnd"/>
     </w:p>
     <w:p/>
     <w:p>
@@ -306,6 +302,7 @@
         <w:t>email</w:t>
       </w:r>
     </w:p>
+    <w:p/>
     <w:p>
       <w:r>
         <w:lastRenderedPageBreak/>
@@ -405,21 +402,36 @@
         </w:numPr>
       </w:pPr>
       <w:r>
-        <w:t>lista de</w:t>
+        <w:t xml:space="preserve">lista </w:t>
+      </w:r>
+      <w:proofErr w:type="spellStart"/>
+      <w:r>
+        <w:t>de</w:t>
       </w:r>
       <w:r>
         <w:t>talleVenta</w:t>
       </w:r>
+      <w:proofErr w:type="spellEnd"/>
     </w:p>
     <w:p/>
     <w:p>
-      <w:r>
-        <w:t xml:space="preserve">DetalleVenta &lt;- no es ABM </w:t>
-      </w:r>
-    </w:p>
-    <w:p>
-      <w:r>
-        <w:t xml:space="preserve">nroRenglon </w:t>
+      <w:proofErr w:type="spellStart"/>
+      <w:r>
+        <w:t>DetalleVenta</w:t>
+      </w:r>
+      <w:proofErr w:type="spellEnd"/>
+      <w:r>
+        <w:t xml:space="preserve"> &lt;- no es ABM </w:t>
+      </w:r>
+    </w:p>
+    <w:p>
+      <w:proofErr w:type="spellStart"/>
+      <w:r>
+        <w:t>nroRenglon</w:t>
+      </w:r>
+      <w:proofErr w:type="spellEnd"/>
+      <w:r>
+        <w:t xml:space="preserve"> </w:t>
       </w:r>
     </w:p>
     <w:p>
@@ -428,14 +440,21 @@
       </w:r>
     </w:p>
     <w:p>
-      <w:r>
-        <w:t xml:space="preserve">subTotal </w:t>
-      </w:r>
-    </w:p>
-    <w:p>
+      <w:proofErr w:type="spellStart"/>
+      <w:r>
+        <w:t>subTotal</w:t>
+      </w:r>
+      <w:proofErr w:type="spellEnd"/>
+      <w:r>
+        <w:t xml:space="preserve"> </w:t>
+      </w:r>
+    </w:p>
+    <w:p>
+      <w:proofErr w:type="spellStart"/>
       <w:r>
         <w:t>precioUnitario</w:t>
       </w:r>
+      <w:proofErr w:type="spellEnd"/>
     </w:p>
     <w:p>
       <w:pPr>
@@ -456,7 +475,23 @@
         <w:t>clases normales</w:t>
       </w:r>
       <w:r>
-        <w:t xml:space="preserve"> (usuario, cliente, proovedor, etc) van en </w:t>
+        <w:t xml:space="preserve"> (usuario, cliente, </w:t>
+      </w:r>
+      <w:proofErr w:type="spellStart"/>
+      <w:r>
+        <w:t>proovedor</w:t>
+      </w:r>
+      <w:proofErr w:type="spellEnd"/>
+      <w:r>
+        <w:t xml:space="preserve">, </w:t>
+      </w:r>
+      <w:proofErr w:type="spellStart"/>
+      <w:r>
+        <w:t>etc</w:t>
+      </w:r>
+      <w:proofErr w:type="spellEnd"/>
+      <w:r>
+        <w:t xml:space="preserve">) van en </w:t>
       </w:r>
       <w:r>
         <w:t xml:space="preserve">el </w:t>
@@ -513,17 +548,24 @@
       <w:r>
         <w:t xml:space="preserve"> va la lógica que trabaja con esas clases, por ejemplo: </w:t>
       </w:r>
+      <w:proofErr w:type="spellStart"/>
       <w:r>
         <w:t>UsuarioService</w:t>
       </w:r>
+      <w:proofErr w:type="spellEnd"/>
       <w:r>
         <w:t xml:space="preserve"> va a tener métodos como: </w:t>
       </w:r>
     </w:p>
     <w:p>
+      <w:proofErr w:type="spellStart"/>
       <w:proofErr w:type="gramStart"/>
       <w:r>
-        <w:t>iniciarSesion(</w:t>
+        <w:t>iniciarSesion</w:t>
+      </w:r>
+      <w:proofErr w:type="spellEnd"/>
+      <w:r>
+        <w:t>(</w:t>
       </w:r>
       <w:proofErr w:type="gramEnd"/>
       <w:r>
@@ -531,9 +573,14 @@
       </w:r>
     </w:p>
     <w:p>
+      <w:proofErr w:type="spellStart"/>
       <w:proofErr w:type="gramStart"/>
       <w:r>
-        <w:t>agregarusuario(</w:t>
+        <w:t>agregarusuario</w:t>
+      </w:r>
+      <w:proofErr w:type="spellEnd"/>
+      <w:r>
+        <w:t>(</w:t>
       </w:r>
       <w:proofErr w:type="gramEnd"/>
       <w:r>
@@ -541,9 +588,14 @@
       </w:r>
     </w:p>
     <w:p>
+      <w:proofErr w:type="spellStart"/>
       <w:proofErr w:type="gramStart"/>
       <w:r>
-        <w:t>eliminarUsuario(</w:t>
+        <w:t>eliminarUsuario</w:t>
+      </w:r>
+      <w:proofErr w:type="spellEnd"/>
+      <w:r>
+        <w:t>(</w:t>
       </w:r>
       <w:proofErr w:type="gramEnd"/>
       <w:r>
@@ -579,8 +631,13 @@
           <w:numId w:val="6"/>
         </w:numPr>
       </w:pPr>
-      <w:r>
-        <w:t xml:space="preserve">UsuarioService → </w:t>
+      <w:proofErr w:type="spellStart"/>
+      <w:r>
+        <w:t>UsuarioService</w:t>
+      </w:r>
+      <w:proofErr w:type="spellEnd"/>
+      <w:r>
+        <w:t xml:space="preserve"> → </w:t>
       </w:r>
       <w:r>
         <w:rPr>
@@ -653,14 +710,18 @@
       </w:r>
     </w:p>
     <w:p>
+      <w:proofErr w:type="spellStart"/>
       <w:r>
         <w:t>FrmProductos</w:t>
       </w:r>
-    </w:p>
-    <w:p>
+      <w:proofErr w:type="spellEnd"/>
+    </w:p>
+    <w:p>
+      <w:proofErr w:type="spellStart"/>
       <w:r>
         <w:t>FrmClientes</w:t>
       </w:r>
+      <w:proofErr w:type="spellEnd"/>
     </w:p>
     <w:p/>
     <w:p>
@@ -2222,6 +2283,7 @@
   <w:style w:type="character" w:default="1" w:styleId="Fuentedeprrafopredeter">
     <w:name w:val="Default Paragraph Font"/>
     <w:uiPriority w:val="1"/>
+    <w:semiHidden/>
     <w:unhideWhenUsed/>
   </w:style>
   <w:style w:type="table" w:default="1" w:styleId="Tablanormal">

</xml_diff>

<commit_message>
Implemente persistencia mediante serializacion
</commit_message>
<xml_diff>
--- a/MusicStore.docx
+++ b/MusicStore.docx
@@ -546,47 +546,32 @@
     </w:p>
     <w:p>
       <w:proofErr w:type="spellStart"/>
-      <w:proofErr w:type="gramStart"/>
       <w:r>
         <w:t>iniciarSesion</w:t>
       </w:r>
       <w:proofErr w:type="spellEnd"/>
       <w:r>
-        <w:t>(</w:t>
-      </w:r>
-      <w:proofErr w:type="gramEnd"/>
-      <w:r>
-        <w:t>)</w:t>
+        <w:t>()</w:t>
       </w:r>
     </w:p>
     <w:p>
       <w:proofErr w:type="spellStart"/>
-      <w:proofErr w:type="gramStart"/>
       <w:r>
         <w:t>agregarusuario</w:t>
       </w:r>
       <w:proofErr w:type="spellEnd"/>
       <w:r>
-        <w:t>(</w:t>
-      </w:r>
-      <w:proofErr w:type="gramEnd"/>
-      <w:r>
-        <w:t>)</w:t>
+        <w:t>()</w:t>
       </w:r>
     </w:p>
     <w:p>
       <w:proofErr w:type="spellStart"/>
-      <w:proofErr w:type="gramStart"/>
       <w:r>
         <w:t>eliminarUsuario</w:t>
       </w:r>
       <w:proofErr w:type="spellEnd"/>
       <w:r>
-        <w:t>(</w:t>
-      </w:r>
-      <w:proofErr w:type="gramEnd"/>
-      <w:r>
-        <w:t>)</w:t>
+        <w:t>()</w:t>
       </w:r>
     </w:p>
     <w:p/>
@@ -883,25 +868,18 @@
         <w:t xml:space="preserve"> </w:t>
       </w:r>
       <w:proofErr w:type="spellStart"/>
-      <w:proofErr w:type="gramStart"/>
       <w:r>
         <w:t>data.getUsuarios</w:t>
       </w:r>
       <w:proofErr w:type="spellEnd"/>
-      <w:proofErr w:type="gramEnd"/>
-      <w:r>
-        <w:t>(</w:t>
-      </w:r>
-      <w:proofErr w:type="gramStart"/>
-      <w:r>
-        <w:t>).</w:t>
+      <w:r>
+        <w:t>().</w:t>
       </w:r>
       <w:proofErr w:type="spellStart"/>
       <w:r>
         <w:t>add</w:t>
       </w:r>
       <w:proofErr w:type="spellEnd"/>
-      <w:proofErr w:type="gramEnd"/>
       <w:r>
         <w:t>(usuario);</w:t>
       </w:r>
@@ -1009,7 +987,1012 @@
         <w:t>En consecuencia, Data solo mantiene una lista de Venta, y cada venta administra internamente sus propios detalles.</w:t>
       </w:r>
     </w:p>
+    <w:p>
+      <w:r>
+        <w:t>-----------------------------------------------------------------------------------------------------------------------------------------------------------</w:t>
+      </w:r>
+    </w:p>
+    <w:p>
+      <w:pPr>
+        <w:rPr>
+          <w:sz w:val="24"/>
+          <w:szCs w:val="24"/>
+        </w:rPr>
+      </w:pPr>
+      <w:r>
+        <w:rPr>
+          <w:sz w:val="24"/>
+          <w:szCs w:val="24"/>
+          <w:highlight w:val="green"/>
+        </w:rPr>
+        <w:t>Serialización:</w:t>
+      </w:r>
+    </w:p>
+    <w:p>
+      <w:r>
+        <w:rPr>
+          <w:u w:val="single" w:color="00B050"/>
+        </w:rPr>
+        <w:t>Serializar significa</w:t>
+      </w:r>
+      <w:r>
+        <w:t>:</w:t>
+      </w:r>
+      <w:r>
+        <w:t xml:space="preserve"> </w:t>
+      </w:r>
+      <w:r>
+        <w:rPr>
+          <w:b/>
+          <w:bCs/>
+        </w:rPr>
+        <w:t>Transformar un objeto de Java en una secuencia de bytes para poder guardarlo en un archivo.</w:t>
+      </w:r>
+    </w:p>
     <w:p/>
+    <w:p>
+      <w:r>
+        <w:rPr>
+          <w:highlight w:val="green"/>
+        </w:rPr>
+        <w:t>+</w:t>
+      </w:r>
+      <w:r>
+        <w:t xml:space="preserve"> </w:t>
+      </w:r>
+      <w:r>
+        <w:t xml:space="preserve">¿Por qué usamos </w:t>
+      </w:r>
+      <w:r>
+        <w:t>implements Serializable</w:t>
+      </w:r>
+      <w:r>
+        <w:t>?</w:t>
+      </w:r>
+    </w:p>
+    <w:p>
+      <w:r>
+        <w:t>Porque Java necesita saber qué clases puede convertir en bytes.</w:t>
+      </w:r>
+      <w:r>
+        <w:t xml:space="preserve"> </w:t>
+      </w:r>
+      <w:r>
+        <w:t>Si una clase no implementa esa interfaz y tratamos de guardarla, Java lanzará una excepción.</w:t>
+      </w:r>
+    </w:p>
+    <w:p>
+      <w:r>
+        <w:rPr>
+          <w:highlight w:val="green"/>
+        </w:rPr>
+        <w:lastRenderedPageBreak/>
+        <w:t>¿Qué pasa con Data?</w:t>
+      </w:r>
+    </w:p>
+    <w:p>
+      <w:r>
+        <w:t>Nosotros no vamos a guardar:</w:t>
+      </w:r>
+      <w:r>
+        <w:t xml:space="preserve"> </w:t>
+      </w:r>
+      <w:r>
+        <w:t>Usuario</w:t>
+      </w:r>
+      <w:r>
+        <w:t xml:space="preserve">, </w:t>
+      </w:r>
+      <w:r>
+        <w:t>Cliente</w:t>
+      </w:r>
+      <w:r>
+        <w:t xml:space="preserve">, </w:t>
+      </w:r>
+      <w:r>
+        <w:t>Producto</w:t>
+      </w:r>
+      <w:r>
+        <w:t xml:space="preserve">, </w:t>
+      </w:r>
+      <w:r>
+        <w:t>Venta uno por uno.</w:t>
+      </w:r>
+    </w:p>
+    <w:p>
+      <w:r>
+        <w:t>Vamos a guardar un único objeto</w:t>
+      </w:r>
+      <w:r>
+        <w:t xml:space="preserve"> </w:t>
+      </w:r>
+      <w:r>
+        <w:t>Data</w:t>
+      </w:r>
+      <w:r>
+        <w:t>, el cual contiene:</w:t>
+      </w:r>
+    </w:p>
+    <w:p>
+      <w:r>
+        <w:t>Data</w:t>
+      </w:r>
+    </w:p>
+    <w:p>
+      <w:r>
+        <w:t>│</w:t>
+      </w:r>
+    </w:p>
+    <w:p>
+      <w:r>
+        <w:rPr>
+          <w:rFonts w:ascii="MS Gothic" w:eastAsia="MS Gothic" w:hAnsi="MS Gothic" w:cs="MS Gothic" w:hint="eastAsia"/>
+        </w:rPr>
+        <w:t>├</w:t>
+      </w:r>
+      <w:r>
+        <w:rPr>
+          <w:rFonts w:ascii="Calibri" w:hAnsi="Calibri" w:cs="Calibri"/>
+        </w:rPr>
+        <w:t>──</w:t>
+      </w:r>
+      <w:r>
+        <w:t xml:space="preserve"> usuarios</w:t>
+      </w:r>
+    </w:p>
+    <w:p>
+      <w:r>
+        <w:rPr>
+          <w:rFonts w:ascii="MS Gothic" w:eastAsia="MS Gothic" w:hAnsi="MS Gothic" w:cs="MS Gothic" w:hint="eastAsia"/>
+        </w:rPr>
+        <w:t>├</w:t>
+      </w:r>
+      <w:r>
+        <w:rPr>
+          <w:rFonts w:ascii="Calibri" w:hAnsi="Calibri" w:cs="Calibri"/>
+        </w:rPr>
+        <w:t>──</w:t>
+      </w:r>
+      <w:r>
+        <w:t xml:space="preserve"> clientes</w:t>
+      </w:r>
+    </w:p>
+    <w:p>
+      <w:r>
+        <w:rPr>
+          <w:rFonts w:ascii="MS Gothic" w:eastAsia="MS Gothic" w:hAnsi="MS Gothic" w:cs="MS Gothic" w:hint="eastAsia"/>
+        </w:rPr>
+        <w:t>├</w:t>
+      </w:r>
+      <w:r>
+        <w:rPr>
+          <w:rFonts w:ascii="Calibri" w:hAnsi="Calibri" w:cs="Calibri"/>
+        </w:rPr>
+        <w:t>──</w:t>
+      </w:r>
+      <w:r>
+        <w:t xml:space="preserve"> productos</w:t>
+      </w:r>
+    </w:p>
+    <w:p>
+      <w:r>
+        <w:rPr>
+          <w:rFonts w:ascii="MS Gothic" w:eastAsia="MS Gothic" w:hAnsi="MS Gothic" w:cs="MS Gothic" w:hint="eastAsia"/>
+        </w:rPr>
+        <w:t>├</w:t>
+      </w:r>
+      <w:r>
+        <w:rPr>
+          <w:rFonts w:ascii="Calibri" w:hAnsi="Calibri" w:cs="Calibri"/>
+        </w:rPr>
+        <w:t>──</w:t>
+      </w:r>
+      <w:r>
+        <w:t xml:space="preserve"> proveedores</w:t>
+      </w:r>
+    </w:p>
+    <w:p>
+      <w:r>
+        <w:rPr>
+          <w:rFonts w:ascii="MS Gothic" w:eastAsia="MS Gothic" w:hAnsi="MS Gothic" w:cs="MS Gothic" w:hint="eastAsia"/>
+        </w:rPr>
+        <w:t>├</w:t>
+      </w:r>
+      <w:r>
+        <w:rPr>
+          <w:rFonts w:ascii="Calibri" w:hAnsi="Calibri" w:cs="Calibri"/>
+        </w:rPr>
+        <w:t>──</w:t>
+      </w:r>
+      <w:r>
+        <w:t xml:space="preserve"> </w:t>
+      </w:r>
+      <w:proofErr w:type="spellStart"/>
+      <w:r>
+        <w:t>categorias</w:t>
+      </w:r>
+      <w:proofErr w:type="spellEnd"/>
+    </w:p>
+    <w:p>
+      <w:r>
+        <w:t>└── ventas</w:t>
+      </w:r>
+    </w:p>
+    <w:p>
+      <w:r>
+        <w:t xml:space="preserve">        │</w:t>
+      </w:r>
+    </w:p>
+    <w:p>
+      <w:r>
+        <w:t xml:space="preserve">        </w:t>
+      </w:r>
+      <w:r>
+        <w:rPr>
+          <w:rFonts w:ascii="MS Gothic" w:eastAsia="MS Gothic" w:hAnsi="MS Gothic" w:cs="MS Gothic" w:hint="eastAsia"/>
+        </w:rPr>
+        <w:t>├</w:t>
+      </w:r>
+      <w:r>
+        <w:rPr>
+          <w:rFonts w:ascii="Calibri" w:hAnsi="Calibri" w:cs="Calibri"/>
+        </w:rPr>
+        <w:t>──</w:t>
+      </w:r>
+      <w:r>
+        <w:t xml:space="preserve"> detalle</w:t>
+      </w:r>
+    </w:p>
+    <w:p>
+      <w:r>
+        <w:t xml:space="preserve">        </w:t>
+      </w:r>
+      <w:r>
+        <w:rPr>
+          <w:rFonts w:ascii="MS Gothic" w:eastAsia="MS Gothic" w:hAnsi="MS Gothic" w:cs="MS Gothic" w:hint="eastAsia"/>
+        </w:rPr>
+        <w:t>├</w:t>
+      </w:r>
+      <w:r>
+        <w:rPr>
+          <w:rFonts w:ascii="Calibri" w:hAnsi="Calibri" w:cs="Calibri"/>
+        </w:rPr>
+        <w:t>──</w:t>
+      </w:r>
+      <w:r>
+        <w:t xml:space="preserve"> detalle</w:t>
+      </w:r>
+    </w:p>
+    <w:p>
+      <w:r>
+        <w:t xml:space="preserve">        └── detalle</w:t>
+      </w:r>
+    </w:p>
+    <w:p/>
+    <w:p>
+      <w:r>
+        <w:t xml:space="preserve">Como </w:t>
+      </w:r>
+      <w:r>
+        <w:rPr>
+          <w:b/>
+          <w:bCs/>
+        </w:rPr>
+        <w:t>todos esos objetos también implementan Serializable</w:t>
+      </w:r>
+      <w:r>
+        <w:t>, Java recorre automáticamente todo el árbol de objetos y lo guarda.</w:t>
+      </w:r>
+    </w:p>
+    <w:p>
+      <w:proofErr w:type="spellStart"/>
+      <w:r>
+        <w:t>Persistencia.guardar</w:t>
+      </w:r>
+      <w:proofErr w:type="spellEnd"/>
+      <w:r>
+        <w:t>(data);</w:t>
+      </w:r>
+    </w:p>
+    <w:p/>
+    <w:p>
+      <w:pPr>
+        <w:rPr>
+          <w:sz w:val="24"/>
+          <w:szCs w:val="24"/>
+        </w:rPr>
+      </w:pPr>
+      <w:r>
+        <w:rPr>
+          <w:sz w:val="24"/>
+          <w:szCs w:val="24"/>
+          <w:highlight w:val="green"/>
+        </w:rPr>
+        <w:t>¿Qué clases usa Java?</w:t>
+      </w:r>
+    </w:p>
+    <w:p>
+      <w:r>
+        <w:rPr>
+          <w:highlight w:val="green"/>
+        </w:rPr>
+        <w:t>+</w:t>
+      </w:r>
+      <w:r>
+        <w:t xml:space="preserve"> File </w:t>
+      </w:r>
+      <w:r>
+        <w:rPr>
+          <w:color w:val="00B050"/>
+        </w:rPr>
+        <w:sym w:font="Wingdings" w:char="F0E0"/>
+      </w:r>
+      <w:r>
+        <w:t xml:space="preserve"> representa un archivo, no guarda nada, solo representa la ruta del archivo.</w:t>
+      </w:r>
+    </w:p>
+    <w:p>
+      <w:pPr>
+        <w:rPr>
+          <w:lang w:val="en-US"/>
+        </w:rPr>
+      </w:pPr>
+      <w:r>
+        <w:rPr>
+          <w:lang w:val="en-US"/>
+        </w:rPr>
+        <w:t xml:space="preserve">File </w:t>
+      </w:r>
+      <w:proofErr w:type="spellStart"/>
+      <w:r>
+        <w:rPr>
+          <w:lang w:val="en-US"/>
+        </w:rPr>
+        <w:t>archivo</w:t>
+      </w:r>
+      <w:proofErr w:type="spellEnd"/>
+      <w:r>
+        <w:rPr>
+          <w:lang w:val="en-US"/>
+        </w:rPr>
+        <w:t xml:space="preserve"> = new File("musicstore.dat");</w:t>
+      </w:r>
+    </w:p>
+    <w:p>
+      <w:pPr>
+        <w:rPr>
+          <w:lang w:val="en-US"/>
+        </w:rPr>
+      </w:pPr>
+    </w:p>
+    <w:p>
+      <w:r>
+        <w:rPr>
+          <w:highlight w:val="green"/>
+        </w:rPr>
+        <w:t>+</w:t>
+      </w:r>
+      <w:r>
+        <w:t xml:space="preserve"> </w:t>
+      </w:r>
+      <w:proofErr w:type="spellStart"/>
+      <w:r>
+        <w:t>FileOutputStream</w:t>
+      </w:r>
+      <w:proofErr w:type="spellEnd"/>
+      <w:r>
+        <w:t xml:space="preserve"> </w:t>
+      </w:r>
+      <w:r>
+        <w:rPr>
+          <w:color w:val="00B050"/>
+        </w:rPr>
+        <w:sym w:font="Wingdings" w:char="F0E0"/>
+      </w:r>
+      <w:r>
+        <w:t xml:space="preserve"> </w:t>
+      </w:r>
+      <w:r>
+        <w:t>abre un archivo para escribir.</w:t>
+      </w:r>
+    </w:p>
+    <w:p/>
+    <w:p>
+      <w:r>
+        <w:rPr>
+          <w:highlight w:val="green"/>
+        </w:rPr>
+        <w:t>+</w:t>
+      </w:r>
+      <w:r>
+        <w:t xml:space="preserve"> </w:t>
+      </w:r>
+      <w:proofErr w:type="spellStart"/>
+      <w:r>
+        <w:t>ObjectOutputStream</w:t>
+      </w:r>
+      <w:proofErr w:type="spellEnd"/>
+      <w:r>
+        <w:t xml:space="preserve"> </w:t>
+      </w:r>
+      <w:r>
+        <w:rPr>
+          <w:color w:val="00B050"/>
+        </w:rPr>
+        <w:sym w:font="Wingdings" w:char="F0E0"/>
+      </w:r>
+      <w:r>
+        <w:t xml:space="preserve"> es el encargado de serializar objetos.</w:t>
+      </w:r>
+      <w:r>
+        <w:t xml:space="preserve"> A</w:t>
+      </w:r>
+      <w:r>
+        <w:t>utomáticamente convierte Data en bytes.</w:t>
+      </w:r>
+    </w:p>
+    <w:p>
+      <w:proofErr w:type="spellStart"/>
+      <w:r>
+        <w:t>output.writeObject</w:t>
+      </w:r>
+      <w:proofErr w:type="spellEnd"/>
+      <w:r>
+        <w:t>(data);</w:t>
+      </w:r>
+    </w:p>
+    <w:p/>
+    <w:p>
+      <w:r>
+        <w:rPr>
+          <w:highlight w:val="green"/>
+        </w:rPr>
+        <w:t>+</w:t>
+      </w:r>
+      <w:r>
+        <w:t xml:space="preserve"> </w:t>
+      </w:r>
+      <w:proofErr w:type="spellStart"/>
+      <w:r>
+        <w:t>ObjectInputStream</w:t>
+      </w:r>
+      <w:proofErr w:type="spellEnd"/>
+      <w:r>
+        <w:t xml:space="preserve"> </w:t>
+      </w:r>
+      <w:r>
+        <w:rPr>
+          <w:color w:val="00B050"/>
+        </w:rPr>
+        <w:sym w:font="Wingdings" w:char="F0E0"/>
+      </w:r>
+      <w:r>
+        <w:rPr>
+          <w:color w:val="00B050"/>
+        </w:rPr>
+        <w:t xml:space="preserve"> </w:t>
+      </w:r>
+      <w:r>
+        <w:t xml:space="preserve">hace el proceso inverso, lee un archivo y reconstruye el objeto. </w:t>
+      </w:r>
+    </w:p>
+    <w:p>
+      <w:pPr>
+        <w:rPr>
+          <w:lang w:val="en-US"/>
+        </w:rPr>
+      </w:pPr>
+      <w:r>
+        <w:rPr>
+          <w:lang w:val="en-US"/>
+        </w:rPr>
+        <w:t xml:space="preserve">Data </w:t>
+      </w:r>
+      <w:proofErr w:type="spellStart"/>
+      <w:r>
+        <w:rPr>
+          <w:lang w:val="en-US"/>
+        </w:rPr>
+        <w:t>data</w:t>
+      </w:r>
+      <w:proofErr w:type="spellEnd"/>
+      <w:r>
+        <w:rPr>
+          <w:lang w:val="en-US"/>
+        </w:rPr>
+        <w:t xml:space="preserve"> = (Data) </w:t>
+      </w:r>
+      <w:proofErr w:type="spellStart"/>
+      <w:r>
+        <w:rPr>
+          <w:lang w:val="en-US"/>
+        </w:rPr>
+        <w:t>input.readObject</w:t>
+      </w:r>
+      <w:proofErr w:type="spellEnd"/>
+      <w:r>
+        <w:rPr>
+          <w:lang w:val="en-US"/>
+        </w:rPr>
+        <w:t>();</w:t>
+      </w:r>
+    </w:p>
+    <w:p>
+      <w:pPr>
+        <w:rPr>
+          <w:sz w:val="24"/>
+          <w:szCs w:val="24"/>
+          <w:lang w:val="en-US"/>
+        </w:rPr>
+      </w:pPr>
+    </w:p>
+    <w:p>
+      <w:pPr>
+        <w:rPr>
+          <w:sz w:val="24"/>
+          <w:szCs w:val="24"/>
+          <w:lang w:val="en-US"/>
+        </w:rPr>
+      </w:pPr>
+    </w:p>
+    <w:p>
+      <w:pPr>
+        <w:rPr>
+          <w:sz w:val="24"/>
+          <w:szCs w:val="24"/>
+          <w:highlight w:val="green"/>
+        </w:rPr>
+      </w:pPr>
+    </w:p>
+    <w:p>
+      <w:pPr>
+        <w:rPr>
+          <w:sz w:val="24"/>
+          <w:szCs w:val="24"/>
+          <w:lang w:val="en-US"/>
+        </w:rPr>
+      </w:pPr>
+      <w:r>
+        <w:rPr>
+          <w:sz w:val="24"/>
+          <w:szCs w:val="24"/>
+          <w:highlight w:val="green"/>
+          <w:lang w:val="en-US"/>
+        </w:rPr>
+        <w:lastRenderedPageBreak/>
+        <w:t>¿</w:t>
+      </w:r>
+      <w:proofErr w:type="spellStart"/>
+      <w:r>
+        <w:rPr>
+          <w:sz w:val="24"/>
+          <w:szCs w:val="24"/>
+          <w:highlight w:val="green"/>
+          <w:lang w:val="en-US"/>
+        </w:rPr>
+        <w:t>Qué</w:t>
+      </w:r>
+      <w:proofErr w:type="spellEnd"/>
+      <w:r>
+        <w:rPr>
+          <w:sz w:val="24"/>
+          <w:szCs w:val="24"/>
+          <w:highlight w:val="green"/>
+          <w:lang w:val="en-US"/>
+        </w:rPr>
+        <w:t xml:space="preserve"> es </w:t>
+      </w:r>
+      <w:proofErr w:type="spellStart"/>
+      <w:r>
+        <w:rPr>
+          <w:sz w:val="24"/>
+          <w:szCs w:val="24"/>
+          <w:highlight w:val="green"/>
+          <w:lang w:val="en-US"/>
+        </w:rPr>
+        <w:t>writeObject</w:t>
+      </w:r>
+      <w:proofErr w:type="spellEnd"/>
+      <w:r>
+        <w:rPr>
+          <w:sz w:val="24"/>
+          <w:szCs w:val="24"/>
+          <w:highlight w:val="green"/>
+          <w:lang w:val="en-US"/>
+        </w:rPr>
+        <w:t>()?</w:t>
+      </w:r>
+    </w:p>
+    <w:p>
+      <w:pPr>
+        <w:rPr>
+          <w:lang w:val="en-US"/>
+        </w:rPr>
+      </w:pPr>
+      <w:proofErr w:type="spellStart"/>
+      <w:r>
+        <w:rPr>
+          <w:lang w:val="en-US"/>
+        </w:rPr>
+        <w:t>output.writeObject</w:t>
+      </w:r>
+      <w:proofErr w:type="spellEnd"/>
+      <w:r>
+        <w:rPr>
+          <w:lang w:val="en-US"/>
+        </w:rPr>
+        <w:t>(data);</w:t>
+      </w:r>
+    </w:p>
+    <w:p>
+      <w:r>
+        <w:t>Con una sola línea guarda:</w:t>
+      </w:r>
+    </w:p>
+    <w:p>
+      <w:pPr>
+        <w:numPr>
+          <w:ilvl w:val="0"/>
+          <w:numId w:val="8"/>
+        </w:numPr>
+      </w:pPr>
+      <w:r>
+        <w:t xml:space="preserve">usuarios </w:t>
+      </w:r>
+    </w:p>
+    <w:p>
+      <w:pPr>
+        <w:numPr>
+          <w:ilvl w:val="0"/>
+          <w:numId w:val="8"/>
+        </w:numPr>
+      </w:pPr>
+      <w:r>
+        <w:t xml:space="preserve">clientes </w:t>
+      </w:r>
+    </w:p>
+    <w:p>
+      <w:pPr>
+        <w:numPr>
+          <w:ilvl w:val="0"/>
+          <w:numId w:val="8"/>
+        </w:numPr>
+      </w:pPr>
+      <w:r>
+        <w:t xml:space="preserve">productos </w:t>
+      </w:r>
+    </w:p>
+    <w:p>
+      <w:pPr>
+        <w:numPr>
+          <w:ilvl w:val="0"/>
+          <w:numId w:val="8"/>
+        </w:numPr>
+      </w:pPr>
+      <w:r>
+        <w:t xml:space="preserve">proveedores </w:t>
+      </w:r>
+    </w:p>
+    <w:p>
+      <w:pPr>
+        <w:numPr>
+          <w:ilvl w:val="0"/>
+          <w:numId w:val="8"/>
+        </w:numPr>
+      </w:pPr>
+      <w:r>
+        <w:t xml:space="preserve">categorías </w:t>
+      </w:r>
+    </w:p>
+    <w:p>
+      <w:pPr>
+        <w:numPr>
+          <w:ilvl w:val="0"/>
+          <w:numId w:val="8"/>
+        </w:numPr>
+      </w:pPr>
+      <w:r>
+        <w:t>ventas</w:t>
+      </w:r>
+    </w:p>
+    <w:p>
+      <w:pPr>
+        <w:rPr>
+          <w:sz w:val="24"/>
+          <w:szCs w:val="24"/>
+        </w:rPr>
+      </w:pPr>
+      <w:r>
+        <w:rPr>
+          <w:sz w:val="24"/>
+          <w:szCs w:val="24"/>
+          <w:highlight w:val="green"/>
+        </w:rPr>
+        <w:t xml:space="preserve">¿Y </w:t>
+      </w:r>
+      <w:proofErr w:type="spellStart"/>
+      <w:r>
+        <w:rPr>
+          <w:sz w:val="24"/>
+          <w:szCs w:val="24"/>
+          <w:highlight w:val="green"/>
+        </w:rPr>
+        <w:t>readObject</w:t>
+      </w:r>
+      <w:proofErr w:type="spellEnd"/>
+      <w:r>
+        <w:rPr>
+          <w:sz w:val="24"/>
+          <w:szCs w:val="24"/>
+          <w:highlight w:val="green"/>
+        </w:rPr>
+        <w:t>()?</w:t>
+      </w:r>
+    </w:p>
+    <w:p>
+      <w:r>
+        <w:t>Hace exactamente lo contrario.</w:t>
+      </w:r>
+      <w:r>
+        <w:t xml:space="preserve"> Reconstruye todo el objeto.</w:t>
+      </w:r>
+    </w:p>
+    <w:p>
+      <w:r>
+        <w:t xml:space="preserve">Data </w:t>
+      </w:r>
+      <w:proofErr w:type="spellStart"/>
+      <w:r>
+        <w:t>data</w:t>
+      </w:r>
+      <w:proofErr w:type="spellEnd"/>
+      <w:r>
+        <w:t xml:space="preserve"> = (Data) </w:t>
+      </w:r>
+      <w:proofErr w:type="spellStart"/>
+      <w:r>
+        <w:t>input.readObject</w:t>
+      </w:r>
+      <w:proofErr w:type="spellEnd"/>
+      <w:r>
+        <w:t>();</w:t>
+      </w:r>
+    </w:p>
+    <w:p>
+      <w:pPr>
+        <w:rPr>
+          <w:sz w:val="24"/>
+          <w:szCs w:val="24"/>
+        </w:rPr>
+      </w:pPr>
+    </w:p>
+    <w:p>
+      <w:pPr>
+        <w:rPr>
+          <w:sz w:val="24"/>
+          <w:szCs w:val="24"/>
+        </w:rPr>
+      </w:pPr>
+      <w:r>
+        <w:rPr>
+          <w:sz w:val="24"/>
+          <w:szCs w:val="24"/>
+        </w:rPr>
+        <w:t>Recibo un objeto Data</w:t>
+      </w:r>
+    </w:p>
+    <w:p>
+      <w:pPr>
+        <w:rPr>
+          <w:sz w:val="24"/>
+          <w:szCs w:val="24"/>
+        </w:rPr>
+      </w:pPr>
+      <w:r>
+        <w:rPr>
+          <w:sz w:val="24"/>
+          <w:szCs w:val="24"/>
+        </w:rPr>
+        <w:t xml:space="preserve">        │</w:t>
+      </w:r>
+    </w:p>
+    <w:p>
+      <w:pPr>
+        <w:rPr>
+          <w:sz w:val="24"/>
+          <w:szCs w:val="24"/>
+        </w:rPr>
+      </w:pPr>
+      <w:r>
+        <w:rPr>
+          <w:sz w:val="24"/>
+          <w:szCs w:val="24"/>
+        </w:rPr>
+        <w:t xml:space="preserve">        </w:t>
+      </w:r>
+      <w:r>
+        <w:rPr>
+          <w:rFonts w:ascii="Arial" w:hAnsi="Arial" w:cs="Arial"/>
+          <w:sz w:val="24"/>
+          <w:szCs w:val="24"/>
+        </w:rPr>
+        <w:t>▼</w:t>
+      </w:r>
+    </w:p>
+    <w:p>
+      <w:pPr>
+        <w:rPr>
+          <w:sz w:val="24"/>
+          <w:szCs w:val="24"/>
+        </w:rPr>
+      </w:pPr>
+      <w:r>
+        <w:rPr>
+          <w:sz w:val="24"/>
+          <w:szCs w:val="24"/>
+        </w:rPr>
+        <w:t>Abro el archivo musicstore.dat</w:t>
+      </w:r>
+    </w:p>
+    <w:p>
+      <w:pPr>
+        <w:rPr>
+          <w:sz w:val="24"/>
+          <w:szCs w:val="24"/>
+        </w:rPr>
+      </w:pPr>
+      <w:r>
+        <w:rPr>
+          <w:sz w:val="24"/>
+          <w:szCs w:val="24"/>
+        </w:rPr>
+        <w:t xml:space="preserve">        │</w:t>
+      </w:r>
+    </w:p>
+    <w:p>
+      <w:pPr>
+        <w:rPr>
+          <w:sz w:val="24"/>
+          <w:szCs w:val="24"/>
+        </w:rPr>
+      </w:pPr>
+      <w:r>
+        <w:rPr>
+          <w:sz w:val="24"/>
+          <w:szCs w:val="24"/>
+        </w:rPr>
+        <w:t xml:space="preserve">        </w:t>
+      </w:r>
+      <w:r>
+        <w:rPr>
+          <w:rFonts w:ascii="Arial" w:hAnsi="Arial" w:cs="Arial"/>
+          <w:sz w:val="24"/>
+          <w:szCs w:val="24"/>
+        </w:rPr>
+        <w:t>▼</w:t>
+      </w:r>
+    </w:p>
+    <w:p>
+      <w:pPr>
+        <w:rPr>
+          <w:sz w:val="24"/>
+          <w:szCs w:val="24"/>
+        </w:rPr>
+      </w:pPr>
+      <w:r>
+        <w:rPr>
+          <w:sz w:val="24"/>
+          <w:szCs w:val="24"/>
+        </w:rPr>
+        <w:t>Convierto el objeto en bytes</w:t>
+      </w:r>
+    </w:p>
+    <w:p>
+      <w:pPr>
+        <w:rPr>
+          <w:sz w:val="24"/>
+          <w:szCs w:val="24"/>
+        </w:rPr>
+      </w:pPr>
+      <w:r>
+        <w:rPr>
+          <w:sz w:val="24"/>
+          <w:szCs w:val="24"/>
+        </w:rPr>
+        <w:t xml:space="preserve">        │</w:t>
+      </w:r>
+    </w:p>
+    <w:p>
+      <w:pPr>
+        <w:rPr>
+          <w:sz w:val="24"/>
+          <w:szCs w:val="24"/>
+        </w:rPr>
+      </w:pPr>
+      <w:r>
+        <w:rPr>
+          <w:sz w:val="24"/>
+          <w:szCs w:val="24"/>
+        </w:rPr>
+        <w:t xml:space="preserve">        </w:t>
+      </w:r>
+      <w:r>
+        <w:rPr>
+          <w:rFonts w:ascii="Arial" w:hAnsi="Arial" w:cs="Arial"/>
+          <w:sz w:val="24"/>
+          <w:szCs w:val="24"/>
+        </w:rPr>
+        <w:t>▼</w:t>
+      </w:r>
+    </w:p>
+    <w:p>
+      <w:pPr>
+        <w:rPr>
+          <w:sz w:val="24"/>
+          <w:szCs w:val="24"/>
+        </w:rPr>
+      </w:pPr>
+      <w:r>
+        <w:rPr>
+          <w:sz w:val="24"/>
+          <w:szCs w:val="24"/>
+        </w:rPr>
+        <w:t>Escribo esos bytes en el archivo</w:t>
+      </w:r>
+    </w:p>
+    <w:p>
+      <w:pPr>
+        <w:rPr>
+          <w:sz w:val="24"/>
+          <w:szCs w:val="24"/>
+        </w:rPr>
+      </w:pPr>
+      <w:r>
+        <w:rPr>
+          <w:sz w:val="24"/>
+          <w:szCs w:val="24"/>
+        </w:rPr>
+        <w:t xml:space="preserve">        │</w:t>
+      </w:r>
+    </w:p>
+    <w:p>
+      <w:pPr>
+        <w:rPr>
+          <w:sz w:val="24"/>
+          <w:szCs w:val="24"/>
+        </w:rPr>
+      </w:pPr>
+      <w:r>
+        <w:rPr>
+          <w:sz w:val="24"/>
+          <w:szCs w:val="24"/>
+        </w:rPr>
+        <w:t xml:space="preserve">        </w:t>
+      </w:r>
+      <w:r>
+        <w:rPr>
+          <w:rFonts w:ascii="Arial" w:hAnsi="Arial" w:cs="Arial"/>
+          <w:sz w:val="24"/>
+          <w:szCs w:val="24"/>
+        </w:rPr>
+        <w:t>▼</w:t>
+      </w:r>
+    </w:p>
+    <w:p>
+      <w:pPr>
+        <w:rPr>
+          <w:sz w:val="24"/>
+          <w:szCs w:val="24"/>
+        </w:rPr>
+      </w:pPr>
+      <w:r>
+        <w:rPr>
+          <w:sz w:val="24"/>
+          <w:szCs w:val="24"/>
+        </w:rPr>
+        <w:t>Cierro el archivo</w:t>
+      </w:r>
+    </w:p>
     <w:sectPr>
       <w:pgSz w:w="11906" w:h="16838"/>
       <w:pgMar w:top="720" w:right="720" w:bottom="720" w:left="720" w:header="708" w:footer="708" w:gutter="0"/>
@@ -1023,6 +2006,155 @@
 <file path=word/numbering.xml><?xml version="1.0" encoding="utf-8"?>
 <w:numbering xmlns:wpc="http://schemas.microsoft.com/office/word/2010/wordprocessingCanvas" xmlns:cx="http://schemas.microsoft.com/office/drawing/2014/chartex" xmlns:cx1="http://schemas.microsoft.com/office/drawing/2015/9/8/chartex" xmlns:cx2="http://schemas.microsoft.com/office/drawing/2015/10/21/chartex" xmlns:cx3="http://schemas.microsoft.com/office/drawing/2016/5/9/chartex" xmlns:cx4="http://schemas.microsoft.com/office/drawing/2016/5/10/chartex" xmlns:cx5="http://schemas.microsoft.com/office/drawing/2016/5/11/chartex" xmlns:cx6="http://schemas.microsoft.com/office/drawing/2016/5/12/chartex" xmlns:cx7="http://schemas.microsoft.com/office/drawing/2016/5/13/chartex" xmlns:cx8="http://schemas.microsoft.com/office/drawing/2016/5/14/chartex" xmlns:mc="http://schemas.openxmlformats.org/markup-compatibility/2006" xmlns:aink="http://schemas.microsoft.com/office/drawing/2016/ink" xmlns:am3d="http://schemas.microsoft.com/office/drawing/2017/model3d" xmlns:o="urn:schemas-microsoft-com:office:office" xmlns:oel="http://schemas.microsoft.com/office/2019/extlst" xmlns:r="http://schemas.openxmlformats.org/officeDocument/2006/relationships" xmlns:m="http://schemas.openxmlformats.org/officeDocument/2006/math" xmlns:v="urn:schemas-microsoft-com:vml" xmlns:wp14="http://schemas.microsoft.com/office/word/2010/wordprocessingDrawing" xmlns:wp="http://schemas.openxmlformats.org/drawingml/2006/wordprocessingDrawing" xmlns:w10="urn:schemas-microsoft-com:office:word" xmlns:w="http://schemas.openxmlformats.org/wordprocessingml/2006/main" xmlns:w14="http://schemas.microsoft.com/office/word/2010/wordml" xmlns:w15="http://schemas.microsoft.com/office/word/2012/wordml" xmlns:w16cex="http://schemas.microsoft.com/office/word/2018/wordml/cex" xmlns:w16cid="http://schemas.microsoft.com/office/word/2016/wordml/cid" xmlns:w16="http://schemas.microsoft.com/office/word/2018/wordml" xmlns:w16du="http://schemas.microsoft.com/office/word/2023/wordml/word16du" xmlns:w16sdtdh="http://schemas.microsoft.com/office/word/2020/wordml/sdtdatahash" xmlns:w16sdtfl="http://schemas.microsoft.com/office/word/2024/wordml/sdtformatlock" xmlns:w16se="http://schemas.microsoft.com/office/word/2015/wordml/symex" xmlns:wpg="http://schemas.microsoft.com/office/word/2010/wordprocessingGroup" xmlns:wpi="http://schemas.microsoft.com/office/word/2010/wordprocessingInk" xmlns:wne="http://schemas.microsoft.com/office/word/2006/wordml" xmlns:wps="http://schemas.microsoft.com/office/word/2010/wordprocessingShape" mc:Ignorable="w14 w15 w16se w16cid w16 w16cex w16sdtdh w16sdtfl w16du wp14">
   <w:abstractNum w:abstractNumId="0" w15:restartNumberingAfterBreak="0">
+    <w:nsid w:val="05AE1EDD"/>
+    <w:multiLevelType w:val="multilevel"/>
+    <w:tmpl w:val="7EBA4E58"/>
+    <w:lvl w:ilvl="0">
+      <w:start w:val="1"/>
+      <w:numFmt w:val="bullet"/>
+      <w:lvlText w:val=""/>
+      <w:lvlJc w:val="left"/>
+      <w:pPr>
+        <w:tabs>
+          <w:tab w:val="num" w:pos="720"/>
+        </w:tabs>
+        <w:ind w:left="720" w:hanging="360"/>
+      </w:pPr>
+      <w:rPr>
+        <w:rFonts w:ascii="Symbol" w:hAnsi="Symbol" w:hint="default"/>
+        <w:sz w:val="20"/>
+      </w:rPr>
+    </w:lvl>
+    <w:lvl w:ilvl="1" w:tentative="1">
+      <w:start w:val="1"/>
+      <w:numFmt w:val="bullet"/>
+      <w:lvlText w:val="o"/>
+      <w:lvlJc w:val="left"/>
+      <w:pPr>
+        <w:tabs>
+          <w:tab w:val="num" w:pos="1440"/>
+        </w:tabs>
+        <w:ind w:left="1440" w:hanging="360"/>
+      </w:pPr>
+      <w:rPr>
+        <w:rFonts w:ascii="Courier New" w:hAnsi="Courier New" w:hint="default"/>
+        <w:sz w:val="20"/>
+      </w:rPr>
+    </w:lvl>
+    <w:lvl w:ilvl="2" w:tentative="1">
+      <w:start w:val="1"/>
+      <w:numFmt w:val="bullet"/>
+      <w:lvlText w:val=""/>
+      <w:lvlJc w:val="left"/>
+      <w:pPr>
+        <w:tabs>
+          <w:tab w:val="num" w:pos="2160"/>
+        </w:tabs>
+        <w:ind w:left="2160" w:hanging="360"/>
+      </w:pPr>
+      <w:rPr>
+        <w:rFonts w:ascii="Wingdings" w:hAnsi="Wingdings" w:hint="default"/>
+        <w:sz w:val="20"/>
+      </w:rPr>
+    </w:lvl>
+    <w:lvl w:ilvl="3" w:tentative="1">
+      <w:start w:val="1"/>
+      <w:numFmt w:val="bullet"/>
+      <w:lvlText w:val=""/>
+      <w:lvlJc w:val="left"/>
+      <w:pPr>
+        <w:tabs>
+          <w:tab w:val="num" w:pos="2880"/>
+        </w:tabs>
+        <w:ind w:left="2880" w:hanging="360"/>
+      </w:pPr>
+      <w:rPr>
+        <w:rFonts w:ascii="Wingdings" w:hAnsi="Wingdings" w:hint="default"/>
+        <w:sz w:val="20"/>
+      </w:rPr>
+    </w:lvl>
+    <w:lvl w:ilvl="4" w:tentative="1">
+      <w:start w:val="1"/>
+      <w:numFmt w:val="bullet"/>
+      <w:lvlText w:val=""/>
+      <w:lvlJc w:val="left"/>
+      <w:pPr>
+        <w:tabs>
+          <w:tab w:val="num" w:pos="3600"/>
+        </w:tabs>
+        <w:ind w:left="3600" w:hanging="360"/>
+      </w:pPr>
+      <w:rPr>
+        <w:rFonts w:ascii="Wingdings" w:hAnsi="Wingdings" w:hint="default"/>
+        <w:sz w:val="20"/>
+      </w:rPr>
+    </w:lvl>
+    <w:lvl w:ilvl="5" w:tentative="1">
+      <w:start w:val="1"/>
+      <w:numFmt w:val="bullet"/>
+      <w:lvlText w:val=""/>
+      <w:lvlJc w:val="left"/>
+      <w:pPr>
+        <w:tabs>
+          <w:tab w:val="num" w:pos="4320"/>
+        </w:tabs>
+        <w:ind w:left="4320" w:hanging="360"/>
+      </w:pPr>
+      <w:rPr>
+        <w:rFonts w:ascii="Wingdings" w:hAnsi="Wingdings" w:hint="default"/>
+        <w:sz w:val="20"/>
+      </w:rPr>
+    </w:lvl>
+    <w:lvl w:ilvl="6" w:tentative="1">
+      <w:start w:val="1"/>
+      <w:numFmt w:val="bullet"/>
+      <w:lvlText w:val=""/>
+      <w:lvlJc w:val="left"/>
+      <w:pPr>
+        <w:tabs>
+          <w:tab w:val="num" w:pos="5040"/>
+        </w:tabs>
+        <w:ind w:left="5040" w:hanging="360"/>
+      </w:pPr>
+      <w:rPr>
+        <w:rFonts w:ascii="Wingdings" w:hAnsi="Wingdings" w:hint="default"/>
+        <w:sz w:val="20"/>
+      </w:rPr>
+    </w:lvl>
+    <w:lvl w:ilvl="7" w:tentative="1">
+      <w:start w:val="1"/>
+      <w:numFmt w:val="bullet"/>
+      <w:lvlText w:val=""/>
+      <w:lvlJc w:val="left"/>
+      <w:pPr>
+        <w:tabs>
+          <w:tab w:val="num" w:pos="5760"/>
+        </w:tabs>
+        <w:ind w:left="5760" w:hanging="360"/>
+      </w:pPr>
+      <w:rPr>
+        <w:rFonts w:ascii="Wingdings" w:hAnsi="Wingdings" w:hint="default"/>
+        <w:sz w:val="20"/>
+      </w:rPr>
+    </w:lvl>
+    <w:lvl w:ilvl="8" w:tentative="1">
+      <w:start w:val="1"/>
+      <w:numFmt w:val="bullet"/>
+      <w:lvlText w:val=""/>
+      <w:lvlJc w:val="left"/>
+      <w:pPr>
+        <w:tabs>
+          <w:tab w:val="num" w:pos="6480"/>
+        </w:tabs>
+        <w:ind w:left="6480" w:hanging="360"/>
+      </w:pPr>
+      <w:rPr>
+        <w:rFonts w:ascii="Wingdings" w:hAnsi="Wingdings" w:hint="default"/>
+        <w:sz w:val="20"/>
+      </w:rPr>
+    </w:lvl>
+  </w:abstractNum>
+  <w:abstractNum w:abstractNumId="1" w15:restartNumberingAfterBreak="0">
     <w:nsid w:val="1F000989"/>
     <w:multiLevelType w:val="multilevel"/>
     <w:tmpl w:val="FC7819B8"/>
@@ -1171,7 +2303,7 @@
       </w:rPr>
     </w:lvl>
   </w:abstractNum>
-  <w:abstractNum w:abstractNumId="1" w15:restartNumberingAfterBreak="0">
+  <w:abstractNum w:abstractNumId="2" w15:restartNumberingAfterBreak="0">
     <w:nsid w:val="342C4ACE"/>
     <w:multiLevelType w:val="multilevel"/>
     <w:tmpl w:val="1646E12C"/>
@@ -1320,7 +2452,7 @@
       </w:rPr>
     </w:lvl>
   </w:abstractNum>
-  <w:abstractNum w:abstractNumId="2" w15:restartNumberingAfterBreak="0">
+  <w:abstractNum w:abstractNumId="3" w15:restartNumberingAfterBreak="0">
     <w:nsid w:val="3A0646E3"/>
     <w:multiLevelType w:val="multilevel"/>
     <w:tmpl w:val="917A7900"/>
@@ -1469,7 +2601,7 @@
       </w:rPr>
     </w:lvl>
   </w:abstractNum>
-  <w:abstractNum w:abstractNumId="3" w15:restartNumberingAfterBreak="0">
+  <w:abstractNum w:abstractNumId="4" w15:restartNumberingAfterBreak="0">
     <w:nsid w:val="445D7695"/>
     <w:multiLevelType w:val="multilevel"/>
     <w:tmpl w:val="100E4850"/>
@@ -1618,10 +2750,10 @@
       </w:rPr>
     </w:lvl>
   </w:abstractNum>
-  <w:abstractNum w:abstractNumId="4" w15:restartNumberingAfterBreak="0">
+  <w:abstractNum w:abstractNumId="5" w15:restartNumberingAfterBreak="0">
     <w:nsid w:val="46B14014"/>
     <w:multiLevelType w:val="multilevel"/>
-    <w:tmpl w:val="E8C446C0"/>
+    <w:tmpl w:val="9E2EF664"/>
     <w:lvl w:ilvl="0">
       <w:start w:val="1"/>
       <w:numFmt w:val="bullet"/>
@@ -1638,6 +2770,151 @@
         <w:sz w:val="20"/>
       </w:rPr>
     </w:lvl>
+    <w:lvl w:ilvl="1">
+      <w:start w:val="1"/>
+      <w:numFmt w:val="decimal"/>
+      <w:lvlText w:val="%2."/>
+      <w:lvlJc w:val="left"/>
+      <w:pPr>
+        <w:ind w:left="1440" w:hanging="360"/>
+      </w:pPr>
+      <w:rPr>
+        <w:rFonts w:hint="default"/>
+      </w:rPr>
+    </w:lvl>
+    <w:lvl w:ilvl="2" w:tentative="1">
+      <w:start w:val="1"/>
+      <w:numFmt w:val="bullet"/>
+      <w:lvlText w:val=""/>
+      <w:lvlJc w:val="left"/>
+      <w:pPr>
+        <w:tabs>
+          <w:tab w:val="num" w:pos="2160"/>
+        </w:tabs>
+        <w:ind w:left="2160" w:hanging="360"/>
+      </w:pPr>
+      <w:rPr>
+        <w:rFonts w:ascii="Wingdings" w:hAnsi="Wingdings" w:hint="default"/>
+        <w:sz w:val="20"/>
+      </w:rPr>
+    </w:lvl>
+    <w:lvl w:ilvl="3" w:tentative="1">
+      <w:start w:val="1"/>
+      <w:numFmt w:val="bullet"/>
+      <w:lvlText w:val=""/>
+      <w:lvlJc w:val="left"/>
+      <w:pPr>
+        <w:tabs>
+          <w:tab w:val="num" w:pos="2880"/>
+        </w:tabs>
+        <w:ind w:left="2880" w:hanging="360"/>
+      </w:pPr>
+      <w:rPr>
+        <w:rFonts w:ascii="Wingdings" w:hAnsi="Wingdings" w:hint="default"/>
+        <w:sz w:val="20"/>
+      </w:rPr>
+    </w:lvl>
+    <w:lvl w:ilvl="4" w:tentative="1">
+      <w:start w:val="1"/>
+      <w:numFmt w:val="bullet"/>
+      <w:lvlText w:val=""/>
+      <w:lvlJc w:val="left"/>
+      <w:pPr>
+        <w:tabs>
+          <w:tab w:val="num" w:pos="3600"/>
+        </w:tabs>
+        <w:ind w:left="3600" w:hanging="360"/>
+      </w:pPr>
+      <w:rPr>
+        <w:rFonts w:ascii="Wingdings" w:hAnsi="Wingdings" w:hint="default"/>
+        <w:sz w:val="20"/>
+      </w:rPr>
+    </w:lvl>
+    <w:lvl w:ilvl="5" w:tentative="1">
+      <w:start w:val="1"/>
+      <w:numFmt w:val="bullet"/>
+      <w:lvlText w:val=""/>
+      <w:lvlJc w:val="left"/>
+      <w:pPr>
+        <w:tabs>
+          <w:tab w:val="num" w:pos="4320"/>
+        </w:tabs>
+        <w:ind w:left="4320" w:hanging="360"/>
+      </w:pPr>
+      <w:rPr>
+        <w:rFonts w:ascii="Wingdings" w:hAnsi="Wingdings" w:hint="default"/>
+        <w:sz w:val="20"/>
+      </w:rPr>
+    </w:lvl>
+    <w:lvl w:ilvl="6" w:tentative="1">
+      <w:start w:val="1"/>
+      <w:numFmt w:val="bullet"/>
+      <w:lvlText w:val=""/>
+      <w:lvlJc w:val="left"/>
+      <w:pPr>
+        <w:tabs>
+          <w:tab w:val="num" w:pos="5040"/>
+        </w:tabs>
+        <w:ind w:left="5040" w:hanging="360"/>
+      </w:pPr>
+      <w:rPr>
+        <w:rFonts w:ascii="Wingdings" w:hAnsi="Wingdings" w:hint="default"/>
+        <w:sz w:val="20"/>
+      </w:rPr>
+    </w:lvl>
+    <w:lvl w:ilvl="7" w:tentative="1">
+      <w:start w:val="1"/>
+      <w:numFmt w:val="bullet"/>
+      <w:lvlText w:val=""/>
+      <w:lvlJc w:val="left"/>
+      <w:pPr>
+        <w:tabs>
+          <w:tab w:val="num" w:pos="5760"/>
+        </w:tabs>
+        <w:ind w:left="5760" w:hanging="360"/>
+      </w:pPr>
+      <w:rPr>
+        <w:rFonts w:ascii="Wingdings" w:hAnsi="Wingdings" w:hint="default"/>
+        <w:sz w:val="20"/>
+      </w:rPr>
+    </w:lvl>
+    <w:lvl w:ilvl="8" w:tentative="1">
+      <w:start w:val="1"/>
+      <w:numFmt w:val="bullet"/>
+      <w:lvlText w:val=""/>
+      <w:lvlJc w:val="left"/>
+      <w:pPr>
+        <w:tabs>
+          <w:tab w:val="num" w:pos="6480"/>
+        </w:tabs>
+        <w:ind w:left="6480" w:hanging="360"/>
+      </w:pPr>
+      <w:rPr>
+        <w:rFonts w:ascii="Wingdings" w:hAnsi="Wingdings" w:hint="default"/>
+        <w:sz w:val="20"/>
+      </w:rPr>
+    </w:lvl>
+  </w:abstractNum>
+  <w:abstractNum w:abstractNumId="6" w15:restartNumberingAfterBreak="0">
+    <w:nsid w:val="4B6F3692"/>
+    <w:multiLevelType w:val="multilevel"/>
+    <w:tmpl w:val="8290525E"/>
+    <w:lvl w:ilvl="0">
+      <w:start w:val="1"/>
+      <w:numFmt w:val="bullet"/>
+      <w:lvlText w:val=""/>
+      <w:lvlJc w:val="left"/>
+      <w:pPr>
+        <w:tabs>
+          <w:tab w:val="num" w:pos="720"/>
+        </w:tabs>
+        <w:ind w:left="720" w:hanging="360"/>
+      </w:pPr>
+      <w:rPr>
+        <w:rFonts w:ascii="Symbol" w:hAnsi="Symbol" w:hint="default"/>
+        <w:sz w:val="20"/>
+      </w:rPr>
+    </w:lvl>
     <w:lvl w:ilvl="1" w:tentative="1">
       <w:start w:val="1"/>
       <w:numFmt w:val="bullet"/>
@@ -1767,7 +3044,7 @@
       </w:rPr>
     </w:lvl>
   </w:abstractNum>
-  <w:abstractNum w:abstractNumId="5" w15:restartNumberingAfterBreak="0">
+  <w:abstractNum w:abstractNumId="7" w15:restartNumberingAfterBreak="0">
     <w:nsid w:val="60736DEF"/>
     <w:multiLevelType w:val="multilevel"/>
     <w:tmpl w:val="90F8F976"/>
@@ -1917,22 +3194,28 @@
     </w:lvl>
   </w:abstractNum>
   <w:num w:numId="1" w16cid:durableId="1049961354">
+    <w:abstractNumId w:val="4"/>
+  </w:num>
+  <w:num w:numId="2" w16cid:durableId="1438983142">
+    <w:abstractNumId w:val="7"/>
+  </w:num>
+  <w:num w:numId="3" w16cid:durableId="1080371069">
+    <w:abstractNumId w:val="5"/>
+  </w:num>
+  <w:num w:numId="4" w16cid:durableId="1988321102">
+    <w:abstractNumId w:val="2"/>
+  </w:num>
+  <w:num w:numId="5" w16cid:durableId="878123686">
     <w:abstractNumId w:val="3"/>
   </w:num>
-  <w:num w:numId="2" w16cid:durableId="1438983142">
-    <w:abstractNumId w:val="5"/>
-  </w:num>
-  <w:num w:numId="3" w16cid:durableId="1080371069">
-    <w:abstractNumId w:val="4"/>
-  </w:num>
-  <w:num w:numId="4" w16cid:durableId="1988321102">
+  <w:num w:numId="6" w16cid:durableId="2042976483">
     <w:abstractNumId w:val="1"/>
   </w:num>
-  <w:num w:numId="5" w16cid:durableId="878123686">
-    <w:abstractNumId w:val="2"/>
+  <w:num w:numId="7" w16cid:durableId="1801338708">
+    <w:abstractNumId w:val="0"/>
   </w:num>
-  <w:num w:numId="6" w16cid:durableId="2042976483">
-    <w:abstractNumId w:val="0"/>
+  <w:num w:numId="8" w16cid:durableId="475074607">
+    <w:abstractNumId w:val="6"/>
   </w:num>
 </w:numbering>
 </file>

</xml_diff>

<commit_message>
Implemente login de usuarios
</commit_message>
<xml_diff>
--- a/MusicStore.docx
+++ b/MusicStore.docx
@@ -72,13 +72,8 @@
           <w:numId w:val="1"/>
         </w:numPr>
       </w:pPr>
-      <w:proofErr w:type="spellStart"/>
-      <w:r>
-        <w:t>nombreUsuario</w:t>
-      </w:r>
-      <w:proofErr w:type="spellEnd"/>
-      <w:r>
-        <w:t xml:space="preserve"> </w:t>
+      <w:r>
+        <w:t xml:space="preserve">nombreUsuario </w:t>
       </w:r>
     </w:p>
     <w:p>
@@ -389,36 +384,21 @@
         </w:numPr>
       </w:pPr>
       <w:r>
-        <w:t xml:space="preserve">lista </w:t>
-      </w:r>
-      <w:proofErr w:type="spellStart"/>
-      <w:r>
-        <w:t>de</w:t>
+        <w:t>lista de</w:t>
       </w:r>
       <w:r>
         <w:t>talleVenta</w:t>
       </w:r>
-      <w:proofErr w:type="spellEnd"/>
     </w:p>
     <w:p/>
     <w:p>
-      <w:proofErr w:type="spellStart"/>
-      <w:r>
-        <w:t>DetalleVenta</w:t>
-      </w:r>
-      <w:proofErr w:type="spellEnd"/>
-      <w:r>
-        <w:t xml:space="preserve"> &lt;- no es ABM </w:t>
-      </w:r>
-    </w:p>
-    <w:p>
-      <w:proofErr w:type="spellStart"/>
-      <w:r>
-        <w:t>nroRenglon</w:t>
-      </w:r>
-      <w:proofErr w:type="spellEnd"/>
-      <w:r>
-        <w:t xml:space="preserve"> </w:t>
+      <w:r>
+        <w:t xml:space="preserve">DetalleVenta &lt;- no es ABM </w:t>
+      </w:r>
+    </w:p>
+    <w:p>
+      <w:r>
+        <w:t xml:space="preserve">nroRenglon </w:t>
       </w:r>
     </w:p>
     <w:p>
@@ -427,21 +407,14 @@
       </w:r>
     </w:p>
     <w:p>
-      <w:proofErr w:type="spellStart"/>
-      <w:r>
-        <w:t>subTotal</w:t>
-      </w:r>
-      <w:proofErr w:type="spellEnd"/>
-      <w:r>
-        <w:t xml:space="preserve"> </w:t>
-      </w:r>
-    </w:p>
-    <w:p>
-      <w:proofErr w:type="spellStart"/>
+      <w:r>
+        <w:t xml:space="preserve">subTotal </w:t>
+      </w:r>
+    </w:p>
+    <w:p>
       <w:r>
         <w:t>precioUnitario</w:t>
       </w:r>
-      <w:proofErr w:type="spellEnd"/>
     </w:p>
     <w:p>
       <w:pPr>
@@ -462,23 +435,7 @@
         <w:t>clases normales</w:t>
       </w:r>
       <w:r>
-        <w:t xml:space="preserve"> (usuario, cliente, </w:t>
-      </w:r>
-      <w:proofErr w:type="spellStart"/>
-      <w:r>
-        <w:t>proovedor</w:t>
-      </w:r>
-      <w:proofErr w:type="spellEnd"/>
-      <w:r>
-        <w:t xml:space="preserve">, </w:t>
-      </w:r>
-      <w:proofErr w:type="spellStart"/>
-      <w:r>
-        <w:t>etc</w:t>
-      </w:r>
-      <w:proofErr w:type="spellEnd"/>
-      <w:r>
-        <w:t xml:space="preserve">) van en </w:t>
+        <w:t xml:space="preserve"> (usuario, cliente, proovedor, etc) van en </w:t>
       </w:r>
       <w:r>
         <w:t xml:space="preserve">el </w:t>
@@ -535,43 +492,26 @@
       <w:r>
         <w:t xml:space="preserve"> va la lógica que trabaja con esas clases, por ejemplo: </w:t>
       </w:r>
-      <w:proofErr w:type="spellStart"/>
       <w:r>
         <w:t>UsuarioService</w:t>
       </w:r>
-      <w:proofErr w:type="spellEnd"/>
       <w:r>
         <w:t xml:space="preserve"> va a tener métodos como: </w:t>
       </w:r>
     </w:p>
     <w:p>
-      <w:proofErr w:type="spellStart"/>
-      <w:r>
-        <w:t>iniciarSesion</w:t>
-      </w:r>
-      <w:proofErr w:type="spellEnd"/>
-      <w:r>
-        <w:t>()</w:t>
-      </w:r>
-    </w:p>
-    <w:p>
-      <w:proofErr w:type="spellStart"/>
-      <w:r>
-        <w:t>agregarusuario</w:t>
-      </w:r>
-      <w:proofErr w:type="spellEnd"/>
-      <w:r>
-        <w:t>()</w:t>
-      </w:r>
-    </w:p>
-    <w:p>
-      <w:proofErr w:type="spellStart"/>
-      <w:r>
-        <w:t>eliminarUsuario</w:t>
-      </w:r>
-      <w:proofErr w:type="spellEnd"/>
-      <w:r>
-        <w:t>()</w:t>
+      <w:r>
+        <w:t>iniciarSesion()</w:t>
+      </w:r>
+    </w:p>
+    <w:p>
+      <w:r>
+        <w:t>agregarusuario()</w:t>
+      </w:r>
+    </w:p>
+    <w:p>
+      <w:r>
+        <w:t>eliminarUsuario()</w:t>
       </w:r>
     </w:p>
     <w:p/>
@@ -603,13 +543,8 @@
           <w:numId w:val="6"/>
         </w:numPr>
       </w:pPr>
-      <w:proofErr w:type="spellStart"/>
-      <w:r>
-        <w:t>UsuarioService</w:t>
-      </w:r>
-      <w:proofErr w:type="spellEnd"/>
-      <w:r>
-        <w:t xml:space="preserve"> → </w:t>
+      <w:r>
+        <w:t xml:space="preserve">UsuarioService → </w:t>
       </w:r>
       <w:r>
         <w:rPr>
@@ -682,18 +617,14 @@
       </w:r>
     </w:p>
     <w:p>
-      <w:proofErr w:type="spellStart"/>
       <w:r>
         <w:t>FrmProductos</w:t>
       </w:r>
-      <w:proofErr w:type="spellEnd"/>
-    </w:p>
-    <w:p>
-      <w:proofErr w:type="spellStart"/>
+    </w:p>
+    <w:p>
       <w:r>
         <w:t>FrmClientes</w:t>
       </w:r>
-      <w:proofErr w:type="spellEnd"/>
     </w:p>
     <w:p/>
     <w:p>
@@ -759,15 +690,7 @@
         <w:t xml:space="preserve"> </w:t>
       </w:r>
       <w:r>
-        <w:t xml:space="preserve">La clase Data no contiene lógica de negocio. Su única responsabilidad es mantener en memoria todas las colecciones principales del sistema para que posteriormente la clase Persistencia pueda serializarlas y </w:t>
-      </w:r>
-      <w:proofErr w:type="spellStart"/>
-      <w:r>
-        <w:t>deserializarlas</w:t>
-      </w:r>
-      <w:proofErr w:type="spellEnd"/>
-      <w:r>
-        <w:t xml:space="preserve"> en un único archivo (musicstore.dat).</w:t>
+        <w:t>La clase Data no contiene lógica de negocio. Su única responsabilidad es mantener en memoria todas las colecciones principales del sistema para que posteriormente la clase Persistencia pueda serializarlas y deserializarlas en un único archivo (musicstore.dat).</w:t>
       </w:r>
     </w:p>
     <w:p>
@@ -806,529 +729,538 @@
           <w:bCs/>
           <w:highlight w:val="cyan"/>
         </w:rPr>
-        <w:t xml:space="preserve">¿Por qué la clase Data no tiene </w:t>
-      </w:r>
-      <w:proofErr w:type="spellStart"/>
+        <w:t>¿Por qué la clase Data no tiene setters?</w:t>
+      </w:r>
+    </w:p>
+    <w:p>
+      <w:r>
+        <w:rPr>
+          <w:b/>
+          <w:bCs/>
+          <w:color w:val="00B0F0"/>
+        </w:rPr>
+        <w:t xml:space="preserve">- </w:t>
+      </w:r>
+      <w:r>
+        <w:t>La clase Data actúa como un contenedor de todas las listas del sistema (usuarios, clientes, productos, etc.). Su función es mantener estos datos en memoria mientras la aplicación está en ejecución.</w:t>
+      </w:r>
+    </w:p>
+    <w:p>
+      <w:r>
+        <w:t xml:space="preserve">Por este motivo, la clase solo posee </w:t>
+      </w:r>
+      <w:r>
+        <w:rPr>
+          <w:b/>
+          <w:bCs/>
+        </w:rPr>
+        <w:t>getters</w:t>
+      </w:r>
+      <w:r>
+        <w:t>. Los getters permiten acceder a las listas para agregar, modificar o eliminar elementos, por ejemplo:</w:t>
+      </w:r>
+      <w:r>
+        <w:t xml:space="preserve"> </w:t>
+      </w:r>
+      <w:r>
+        <w:t>data.getUsuarios().add(usuario);</w:t>
+      </w:r>
+    </w:p>
+    <w:p>
+      <w:r>
+        <w:rPr>
+          <w:b/>
+          <w:bCs/>
+          <w:color w:val="00B0F0"/>
+        </w:rPr>
+        <w:t xml:space="preserve">- </w:t>
+      </w:r>
+      <w:r>
+        <w:t xml:space="preserve">No se implementan </w:t>
+      </w:r>
+      <w:r>
+        <w:rPr>
+          <w:b/>
+          <w:bCs/>
+        </w:rPr>
+        <w:t>setters</w:t>
+      </w:r>
+      <w:r>
+        <w:t xml:space="preserve"> porque en ningún momento del sistema será necesario reemplazar una lista completa por otra distinta. Mantener siempre la misma instancia de cada lista evita reemplazos accidentales y simplifica el diseño de la aplicación.</w:t>
+      </w:r>
+    </w:p>
+    <w:p>
+      <w:r>
+        <w:rPr>
+          <w:b/>
+          <w:bCs/>
+        </w:rPr>
+        <w:t>Conclusión:</w:t>
+      </w:r>
+      <w:r>
+        <w:t xml:space="preserve"> necesitamos acceder a la lista, pero no reemplazarla.</w:t>
+      </w:r>
+    </w:p>
+    <w:p/>
+    <w:p>
+      <w:pPr>
+        <w:rPr>
+          <w:b/>
+          <w:bCs/>
+        </w:rPr>
+      </w:pPr>
       <w:r>
         <w:rPr>
           <w:b/>
           <w:bCs/>
           <w:highlight w:val="cyan"/>
         </w:rPr>
-        <w:t>setters</w:t>
-      </w:r>
-      <w:proofErr w:type="spellEnd"/>
+        <w:t>¿Por qué Data no tiene una lista de DetalleVenta?</w:t>
+      </w:r>
+    </w:p>
+    <w:p>
+      <w:r>
+        <w:t>La clase DetalleVenta representa cada uno de los productos que forman parte de una venta. Debido a esto, cada objeto Venta ya posee su propia colección de detalles:</w:t>
+      </w:r>
+    </w:p>
+    <w:p>
+      <w:r>
+        <w:t>Por lo tanto, no es necesario que Data almacene otra lista de DetalleVenta. Si existiera una lista adicional, la misma información estaría almacenada en dos lugares diferentes, generando redundancia y aumentando el riesgo de inconsistencias.</w:t>
+      </w:r>
+    </w:p>
+    <w:p>
+      <w:r>
+        <w:t>En consecuencia, Data solo mantiene una lista de Venta, y cada venta administra internamente sus propios detalles.</w:t>
+      </w:r>
+    </w:p>
+    <w:p>
+      <w:r>
+        <w:t>-----------------------------------------------------------------------------------------------------------------------------------------------------------</w:t>
+      </w:r>
+    </w:p>
+    <w:p>
+      <w:pPr>
+        <w:rPr>
+          <w:sz w:val="24"/>
+          <w:szCs w:val="24"/>
+        </w:rPr>
+      </w:pPr>
+      <w:r>
+        <w:rPr>
+          <w:sz w:val="24"/>
+          <w:szCs w:val="24"/>
+          <w:highlight w:val="green"/>
+        </w:rPr>
+        <w:t>Serialización:</w:t>
+      </w:r>
+    </w:p>
+    <w:p>
+      <w:r>
+        <w:rPr>
+          <w:u w:val="single" w:color="00B050"/>
+        </w:rPr>
+        <w:t>Serializar significa</w:t>
+      </w:r>
+      <w:r>
+        <w:t>:</w:t>
+      </w:r>
+      <w:r>
+        <w:t xml:space="preserve"> </w:t>
+      </w:r>
       <w:r>
         <w:rPr>
           <w:b/>
           <w:bCs/>
-          <w:highlight w:val="cyan"/>
-        </w:rPr>
+        </w:rPr>
+        <w:t>Transformar un objeto de Java en una secuencia de bytes para poder guardarlo en un archivo.</w:t>
+      </w:r>
+    </w:p>
+    <w:p/>
+    <w:p>
+      <w:r>
+        <w:rPr>
+          <w:highlight w:val="green"/>
+        </w:rPr>
+        <w:t>+</w:t>
+      </w:r>
+      <w:r>
+        <w:t xml:space="preserve"> </w:t>
+      </w:r>
+      <w:r>
+        <w:t xml:space="preserve">¿Por qué usamos </w:t>
+      </w:r>
+      <w:r>
+        <w:t>implements Serializable</w:t>
+      </w:r>
+      <w:r>
         <w:t>?</w:t>
       </w:r>
     </w:p>
     <w:p>
+      <w:r>
+        <w:t>Porque Java necesita saber qué clases puede convertir en bytes.</w:t>
+      </w:r>
+      <w:r>
+        <w:t xml:space="preserve"> </w:t>
+      </w:r>
+      <w:r>
+        <w:t>Si una clase no implementa esa interfaz y tratamos de guardarla, Java lanzará una excepción.</w:t>
+      </w:r>
+    </w:p>
+    <w:p>
+      <w:r>
+        <w:rPr>
+          <w:highlight w:val="green"/>
+        </w:rPr>
+        <w:lastRenderedPageBreak/>
+        <w:t>¿Qué pasa con Data?</w:t>
+      </w:r>
+    </w:p>
+    <w:p>
+      <w:r>
+        <w:t>Nosotros no vamos a guardar:</w:t>
+      </w:r>
+      <w:r>
+        <w:t xml:space="preserve"> </w:t>
+      </w:r>
+      <w:r>
+        <w:t>Usuario</w:t>
+      </w:r>
+      <w:r>
+        <w:t xml:space="preserve">, </w:t>
+      </w:r>
+      <w:r>
+        <w:t>Cliente</w:t>
+      </w:r>
+      <w:r>
+        <w:t xml:space="preserve">, </w:t>
+      </w:r>
+      <w:r>
+        <w:t>Producto</w:t>
+      </w:r>
+      <w:r>
+        <w:t xml:space="preserve">, </w:t>
+      </w:r>
+      <w:r>
+        <w:t>Venta uno por uno.</w:t>
+      </w:r>
+    </w:p>
+    <w:p>
+      <w:r>
+        <w:t>Vamos a guardar un único objeto</w:t>
+      </w:r>
+      <w:r>
+        <w:t xml:space="preserve"> </w:t>
+      </w:r>
+      <w:r>
+        <w:t>Data</w:t>
+      </w:r>
+      <w:r>
+        <w:t>, el cual contiene:</w:t>
+      </w:r>
+    </w:p>
+    <w:p>
+      <w:r>
+        <w:t>Data</w:t>
+      </w:r>
+    </w:p>
+    <w:p>
+      <w:r>
+        <w:t>│</w:t>
+      </w:r>
+    </w:p>
+    <w:p>
+      <w:r>
+        <w:rPr>
+          <w:rFonts w:ascii="MS Gothic" w:eastAsia="MS Gothic" w:hAnsi="MS Gothic" w:cs="MS Gothic" w:hint="eastAsia"/>
+        </w:rPr>
+        <w:t>├</w:t>
+      </w:r>
+      <w:r>
+        <w:rPr>
+          <w:rFonts w:ascii="Calibri" w:hAnsi="Calibri" w:cs="Calibri"/>
+        </w:rPr>
+        <w:t>──</w:t>
+      </w:r>
+      <w:r>
+        <w:t xml:space="preserve"> usuarios</w:t>
+      </w:r>
+    </w:p>
+    <w:p>
+      <w:r>
+        <w:rPr>
+          <w:rFonts w:ascii="MS Gothic" w:eastAsia="MS Gothic" w:hAnsi="MS Gothic" w:cs="MS Gothic" w:hint="eastAsia"/>
+        </w:rPr>
+        <w:t>├</w:t>
+      </w:r>
+      <w:r>
+        <w:rPr>
+          <w:rFonts w:ascii="Calibri" w:hAnsi="Calibri" w:cs="Calibri"/>
+        </w:rPr>
+        <w:t>──</w:t>
+      </w:r>
+      <w:r>
+        <w:t xml:space="preserve"> clientes</w:t>
+      </w:r>
+    </w:p>
+    <w:p>
+      <w:r>
+        <w:rPr>
+          <w:rFonts w:ascii="MS Gothic" w:eastAsia="MS Gothic" w:hAnsi="MS Gothic" w:cs="MS Gothic" w:hint="eastAsia"/>
+        </w:rPr>
+        <w:t>├</w:t>
+      </w:r>
+      <w:r>
+        <w:rPr>
+          <w:rFonts w:ascii="Calibri" w:hAnsi="Calibri" w:cs="Calibri"/>
+        </w:rPr>
+        <w:t>──</w:t>
+      </w:r>
+      <w:r>
+        <w:t xml:space="preserve"> productos</w:t>
+      </w:r>
+    </w:p>
+    <w:p>
+      <w:r>
+        <w:rPr>
+          <w:rFonts w:ascii="MS Gothic" w:eastAsia="MS Gothic" w:hAnsi="MS Gothic" w:cs="MS Gothic" w:hint="eastAsia"/>
+        </w:rPr>
+        <w:t>├</w:t>
+      </w:r>
+      <w:r>
+        <w:rPr>
+          <w:rFonts w:ascii="Calibri" w:hAnsi="Calibri" w:cs="Calibri"/>
+        </w:rPr>
+        <w:t>──</w:t>
+      </w:r>
+      <w:r>
+        <w:t xml:space="preserve"> proveedores</w:t>
+      </w:r>
+    </w:p>
+    <w:p>
+      <w:r>
+        <w:rPr>
+          <w:rFonts w:ascii="MS Gothic" w:eastAsia="MS Gothic" w:hAnsi="MS Gothic" w:cs="MS Gothic" w:hint="eastAsia"/>
+        </w:rPr>
+        <w:t>├</w:t>
+      </w:r>
+      <w:r>
+        <w:rPr>
+          <w:rFonts w:ascii="Calibri" w:hAnsi="Calibri" w:cs="Calibri"/>
+        </w:rPr>
+        <w:t>──</w:t>
+      </w:r>
+      <w:r>
+        <w:t xml:space="preserve"> categorias</w:t>
+      </w:r>
+    </w:p>
+    <w:p>
+      <w:r>
+        <w:t>└── ventas</w:t>
+      </w:r>
+    </w:p>
+    <w:p>
+      <w:r>
+        <w:t xml:space="preserve">        │</w:t>
+      </w:r>
+    </w:p>
+    <w:p>
+      <w:r>
+        <w:t xml:space="preserve">        </w:t>
+      </w:r>
+      <w:r>
+        <w:rPr>
+          <w:rFonts w:ascii="MS Gothic" w:eastAsia="MS Gothic" w:hAnsi="MS Gothic" w:cs="MS Gothic" w:hint="eastAsia"/>
+        </w:rPr>
+        <w:t>├</w:t>
+      </w:r>
+      <w:r>
+        <w:rPr>
+          <w:rFonts w:ascii="Calibri" w:hAnsi="Calibri" w:cs="Calibri"/>
+        </w:rPr>
+        <w:t>──</w:t>
+      </w:r>
+      <w:r>
+        <w:t xml:space="preserve"> detalle</w:t>
+      </w:r>
+    </w:p>
+    <w:p>
+      <w:r>
+        <w:t xml:space="preserve">        </w:t>
+      </w:r>
+      <w:r>
+        <w:rPr>
+          <w:rFonts w:ascii="MS Gothic" w:eastAsia="MS Gothic" w:hAnsi="MS Gothic" w:cs="MS Gothic" w:hint="eastAsia"/>
+        </w:rPr>
+        <w:t>├</w:t>
+      </w:r>
+      <w:r>
+        <w:rPr>
+          <w:rFonts w:ascii="Calibri" w:hAnsi="Calibri" w:cs="Calibri"/>
+        </w:rPr>
+        <w:t>──</w:t>
+      </w:r>
+      <w:r>
+        <w:t xml:space="preserve"> detalle</w:t>
+      </w:r>
+    </w:p>
+    <w:p>
+      <w:r>
+        <w:t xml:space="preserve">        └── detalle</w:t>
+      </w:r>
+    </w:p>
+    <w:p/>
+    <w:p>
+      <w:r>
+        <w:t xml:space="preserve">Como </w:t>
+      </w:r>
       <w:r>
         <w:rPr>
           <w:b/>
           <w:bCs/>
-          <w:color w:val="00B0F0"/>
-        </w:rPr>
-        <w:t xml:space="preserve">- </w:t>
-      </w:r>
-      <w:r>
-        <w:t>La clase Data actúa como un contenedor de todas las listas del sistema (usuarios, clientes, productos, etc.). Su función es mantener estos datos en memoria mientras la aplicación está en ejecución.</w:t>
-      </w:r>
-    </w:p>
-    <w:p>
-      <w:r>
-        <w:t xml:space="preserve">Por este motivo, la clase solo posee </w:t>
-      </w:r>
-      <w:proofErr w:type="spellStart"/>
-      <w:r>
-        <w:rPr>
-          <w:b/>
-          <w:bCs/>
-        </w:rPr>
-        <w:t>getters</w:t>
-      </w:r>
-      <w:proofErr w:type="spellEnd"/>
-      <w:r>
-        <w:t xml:space="preserve">. Los </w:t>
-      </w:r>
-      <w:proofErr w:type="spellStart"/>
-      <w:r>
-        <w:t>getters</w:t>
-      </w:r>
-      <w:proofErr w:type="spellEnd"/>
-      <w:r>
-        <w:t xml:space="preserve"> permiten acceder a las listas para agregar, modificar o eliminar elementos, por ejemplo:</w:t>
-      </w:r>
-      <w:r>
+        </w:rPr>
+        <w:t>todos esos objetos también implementan Serializable</w:t>
+      </w:r>
+      <w:r>
+        <w:t>, Java recorre automáticamente todo el árbol de objetos y lo guarda.</w:t>
+      </w:r>
+    </w:p>
+    <w:p>
+      <w:r>
+        <w:t>Persistencia.guardar(data);</w:t>
+      </w:r>
+    </w:p>
+    <w:p/>
+    <w:p>
+      <w:pPr>
+        <w:rPr>
+          <w:sz w:val="24"/>
+          <w:szCs w:val="24"/>
+        </w:rPr>
+      </w:pPr>
+      <w:r>
+        <w:rPr>
+          <w:sz w:val="24"/>
+          <w:szCs w:val="24"/>
+          <w:highlight w:val="green"/>
+        </w:rPr>
+        <w:t>¿Qué clases usa Java?</w:t>
+      </w:r>
+    </w:p>
+    <w:p>
+      <w:r>
+        <w:rPr>
+          <w:highlight w:val="green"/>
+        </w:rPr>
+        <w:t>+</w:t>
+      </w:r>
+      <w:r>
+        <w:t xml:space="preserve"> File </w:t>
+      </w:r>
+      <w:r>
+        <w:rPr>
+          <w:color w:val="00B050"/>
+        </w:rPr>
+        <w:sym w:font="Wingdings" w:char="F0E0"/>
+      </w:r>
+      <w:r>
+        <w:t xml:space="preserve"> representa un archivo, no guarda nada, solo representa la ruta del archivo.</w:t>
+      </w:r>
+    </w:p>
+    <w:p>
+      <w:pPr>
+        <w:rPr>
+          <w:lang w:val="en-US"/>
+        </w:rPr>
+      </w:pPr>
+      <w:r>
+        <w:rPr>
+          <w:lang w:val="en-US"/>
+        </w:rPr>
+        <w:t>File archivo = new File("musicstore.dat");</w:t>
+      </w:r>
+    </w:p>
+    <w:p>
+      <w:pPr>
+        <w:rPr>
+          <w:lang w:val="en-US"/>
+        </w:rPr>
+      </w:pPr>
+    </w:p>
+    <w:p>
+      <w:r>
+        <w:rPr>
+          <w:highlight w:val="green"/>
+        </w:rPr>
+        <w:t>+</w:t>
+      </w:r>
+      <w:r>
+        <w:t xml:space="preserve"> FileOutputStream </w:t>
+      </w:r>
+      <w:r>
+        <w:rPr>
+          <w:color w:val="00B050"/>
+        </w:rPr>
+        <w:sym w:font="Wingdings" w:char="F0E0"/>
+      </w:r>
+      <w:r>
+        <w:t xml:space="preserve"> abre un archivo para escribir.</w:t>
+      </w:r>
+    </w:p>
+    <w:p/>
+    <w:p>
+      <w:r>
+        <w:rPr>
+          <w:highlight w:val="green"/>
+        </w:rPr>
+        <w:t>+</w:t>
+      </w:r>
+      <w:r>
+        <w:t xml:space="preserve"> ObjectOutputStream </w:t>
+      </w:r>
+      <w:r>
+        <w:rPr>
+          <w:color w:val="00B050"/>
+        </w:rPr>
+        <w:sym w:font="Wingdings" w:char="F0E0"/>
+      </w:r>
+      <w:r>
+        <w:t xml:space="preserve"> es el encargado de serializar objetos.</w:t>
+      </w:r>
+      <w:r>
+        <w:t xml:space="preserve"> Automáticamente convierte Data en bytes.</w:t>
+      </w:r>
+    </w:p>
+    <w:p>
+      <w:r>
+        <w:t>output.writeObject(data);</w:t>
+      </w:r>
+    </w:p>
+    <w:p/>
+    <w:p>
+      <w:r>
+        <w:rPr>
+          <w:highlight w:val="green"/>
+        </w:rPr>
+        <w:t>+</w:t>
+      </w:r>
+      <w:r>
+        <w:t xml:space="preserve"> ObjectInputStream </w:t>
+      </w:r>
+      <w:r>
+        <w:rPr>
+          <w:color w:val="00B050"/>
+        </w:rPr>
+        <w:sym w:font="Wingdings" w:char="F0E0"/>
+      </w:r>
+      <w:r>
+        <w:rPr>
+          <w:color w:val="00B050"/>
+        </w:rPr>
         <w:t xml:space="preserve"> </w:t>
       </w:r>
-      <w:proofErr w:type="spellStart"/>
-      <w:r>
-        <w:t>data.getUsuarios</w:t>
-      </w:r>
-      <w:proofErr w:type="spellEnd"/>
-      <w:r>
-        <w:t>().</w:t>
-      </w:r>
-      <w:proofErr w:type="spellStart"/>
-      <w:r>
-        <w:t>add</w:t>
-      </w:r>
-      <w:proofErr w:type="spellEnd"/>
-      <w:r>
-        <w:t>(usuario);</w:t>
-      </w:r>
-    </w:p>
-    <w:p>
-      <w:r>
-        <w:rPr>
-          <w:b/>
-          <w:bCs/>
-          <w:color w:val="00B0F0"/>
-        </w:rPr>
-        <w:t xml:space="preserve">- </w:t>
-      </w:r>
-      <w:r>
-        <w:t xml:space="preserve">No se implementan </w:t>
-      </w:r>
-      <w:proofErr w:type="spellStart"/>
-      <w:r>
-        <w:rPr>
-          <w:b/>
-          <w:bCs/>
-        </w:rPr>
-        <w:t>setters</w:t>
-      </w:r>
-      <w:proofErr w:type="spellEnd"/>
-      <w:r>
-        <w:t xml:space="preserve"> porque en ningún momento del sistema será necesario reemplazar una lista completa por otra distinta. Mantener siempre la misma instancia de cada lista evita reemplazos accidentales y simplifica el diseño de la aplicación.</w:t>
-      </w:r>
-    </w:p>
-    <w:p>
-      <w:r>
-        <w:rPr>
-          <w:b/>
-          <w:bCs/>
-        </w:rPr>
-        <w:t>Conclusión:</w:t>
-      </w:r>
-      <w:r>
-        <w:t xml:space="preserve"> necesitamos acceder a la lista, pero no reemplazarla.</w:t>
-      </w:r>
-    </w:p>
-    <w:p/>
-    <w:p>
-      <w:pPr>
-        <w:rPr>
-          <w:b/>
-          <w:bCs/>
-        </w:rPr>
-      </w:pPr>
-      <w:r>
-        <w:rPr>
-          <w:b/>
-          <w:bCs/>
-          <w:highlight w:val="cyan"/>
-        </w:rPr>
-        <w:t xml:space="preserve">¿Por qué Data no tiene una lista de </w:t>
-      </w:r>
-      <w:proofErr w:type="spellStart"/>
-      <w:r>
-        <w:rPr>
-          <w:b/>
-          <w:bCs/>
-          <w:highlight w:val="cyan"/>
-        </w:rPr>
-        <w:t>DetalleVenta</w:t>
-      </w:r>
-      <w:proofErr w:type="spellEnd"/>
-      <w:r>
-        <w:rPr>
-          <w:b/>
-          <w:bCs/>
-          <w:highlight w:val="cyan"/>
-        </w:rPr>
-        <w:t>?</w:t>
-      </w:r>
-    </w:p>
-    <w:p>
-      <w:r>
-        <w:t xml:space="preserve">La clase </w:t>
-      </w:r>
-      <w:proofErr w:type="spellStart"/>
-      <w:r>
-        <w:t>DetalleVenta</w:t>
-      </w:r>
-      <w:proofErr w:type="spellEnd"/>
-      <w:r>
-        <w:t xml:space="preserve"> representa cada uno de los productos que forman parte de una venta. Debido a esto, cada objeto Venta ya posee su propia colección de detalles:</w:t>
-      </w:r>
-    </w:p>
-    <w:p>
-      <w:r>
-        <w:t xml:space="preserve">Por lo tanto, no es necesario que Data almacene otra lista de </w:t>
-      </w:r>
-      <w:proofErr w:type="spellStart"/>
-      <w:r>
-        <w:t>DetalleVenta</w:t>
-      </w:r>
-      <w:proofErr w:type="spellEnd"/>
-      <w:r>
-        <w:t>. Si existiera una lista adicional, la misma información estaría almacenada en dos lugares diferentes, generando redundancia y aumentando el riesgo de inconsistencias.</w:t>
-      </w:r>
-    </w:p>
-    <w:p>
-      <w:r>
-        <w:t>En consecuencia, Data solo mantiene una lista de Venta, y cada venta administra internamente sus propios detalles.</w:t>
-      </w:r>
-    </w:p>
-    <w:p>
-      <w:r>
-        <w:t>-----------------------------------------------------------------------------------------------------------------------------------------------------------</w:t>
-      </w:r>
-    </w:p>
-    <w:p>
-      <w:pPr>
-        <w:rPr>
-          <w:sz w:val="24"/>
-          <w:szCs w:val="24"/>
-        </w:rPr>
-      </w:pPr>
-      <w:r>
-        <w:rPr>
-          <w:sz w:val="24"/>
-          <w:szCs w:val="24"/>
-          <w:highlight w:val="green"/>
-        </w:rPr>
-        <w:t>Serialización:</w:t>
-      </w:r>
-    </w:p>
-    <w:p>
-      <w:r>
-        <w:rPr>
-          <w:u w:val="single" w:color="00B050"/>
-        </w:rPr>
-        <w:t>Serializar significa</w:t>
-      </w:r>
-      <w:r>
-        <w:t>:</w:t>
-      </w:r>
-      <w:r>
-        <w:t xml:space="preserve"> </w:t>
-      </w:r>
-      <w:r>
-        <w:rPr>
-          <w:b/>
-          <w:bCs/>
-        </w:rPr>
-        <w:t>Transformar un objeto de Java en una secuencia de bytes para poder guardarlo en un archivo.</w:t>
-      </w:r>
-    </w:p>
-    <w:p/>
-    <w:p>
-      <w:r>
-        <w:rPr>
-          <w:highlight w:val="green"/>
-        </w:rPr>
-        <w:t>+</w:t>
-      </w:r>
-      <w:r>
-        <w:t xml:space="preserve"> </w:t>
-      </w:r>
-      <w:r>
-        <w:t xml:space="preserve">¿Por qué usamos </w:t>
-      </w:r>
-      <w:r>
-        <w:t>implements Serializable</w:t>
-      </w:r>
-      <w:r>
-        <w:t>?</w:t>
-      </w:r>
-    </w:p>
-    <w:p>
-      <w:r>
-        <w:t>Porque Java necesita saber qué clases puede convertir en bytes.</w:t>
-      </w:r>
-      <w:r>
-        <w:t xml:space="preserve"> </w:t>
-      </w:r>
-      <w:r>
-        <w:t>Si una clase no implementa esa interfaz y tratamos de guardarla, Java lanzará una excepción.</w:t>
-      </w:r>
-    </w:p>
-    <w:p>
-      <w:r>
-        <w:rPr>
-          <w:highlight w:val="green"/>
-        </w:rPr>
-        <w:lastRenderedPageBreak/>
-        <w:t>¿Qué pasa con Data?</w:t>
-      </w:r>
-    </w:p>
-    <w:p>
-      <w:r>
-        <w:t>Nosotros no vamos a guardar:</w:t>
-      </w:r>
-      <w:r>
-        <w:t xml:space="preserve"> </w:t>
-      </w:r>
-      <w:r>
-        <w:t>Usuario</w:t>
-      </w:r>
-      <w:r>
-        <w:t xml:space="preserve">, </w:t>
-      </w:r>
-      <w:r>
-        <w:t>Cliente</w:t>
-      </w:r>
-      <w:r>
-        <w:t xml:space="preserve">, </w:t>
-      </w:r>
-      <w:r>
-        <w:t>Producto</w:t>
-      </w:r>
-      <w:r>
-        <w:t xml:space="preserve">, </w:t>
-      </w:r>
-      <w:r>
-        <w:t>Venta uno por uno.</w:t>
-      </w:r>
-    </w:p>
-    <w:p>
-      <w:r>
-        <w:t>Vamos a guardar un único objeto</w:t>
-      </w:r>
-      <w:r>
-        <w:t xml:space="preserve"> </w:t>
-      </w:r>
-      <w:r>
-        <w:t>Data</w:t>
-      </w:r>
-      <w:r>
-        <w:t>, el cual contiene:</w:t>
-      </w:r>
-    </w:p>
-    <w:p>
-      <w:r>
-        <w:t>Data</w:t>
-      </w:r>
-    </w:p>
-    <w:p>
-      <w:r>
-        <w:t>│</w:t>
-      </w:r>
-    </w:p>
-    <w:p>
-      <w:r>
-        <w:rPr>
-          <w:rFonts w:ascii="MS Gothic" w:eastAsia="MS Gothic" w:hAnsi="MS Gothic" w:cs="MS Gothic" w:hint="eastAsia"/>
-        </w:rPr>
-        <w:t>├</w:t>
-      </w:r>
-      <w:r>
-        <w:rPr>
-          <w:rFonts w:ascii="Calibri" w:hAnsi="Calibri" w:cs="Calibri"/>
-        </w:rPr>
-        <w:t>──</w:t>
-      </w:r>
-      <w:r>
-        <w:t xml:space="preserve"> usuarios</w:t>
-      </w:r>
-    </w:p>
-    <w:p>
-      <w:r>
-        <w:rPr>
-          <w:rFonts w:ascii="MS Gothic" w:eastAsia="MS Gothic" w:hAnsi="MS Gothic" w:cs="MS Gothic" w:hint="eastAsia"/>
-        </w:rPr>
-        <w:t>├</w:t>
-      </w:r>
-      <w:r>
-        <w:rPr>
-          <w:rFonts w:ascii="Calibri" w:hAnsi="Calibri" w:cs="Calibri"/>
-        </w:rPr>
-        <w:t>──</w:t>
-      </w:r>
-      <w:r>
-        <w:t xml:space="preserve"> clientes</w:t>
-      </w:r>
-    </w:p>
-    <w:p>
-      <w:r>
-        <w:rPr>
-          <w:rFonts w:ascii="MS Gothic" w:eastAsia="MS Gothic" w:hAnsi="MS Gothic" w:cs="MS Gothic" w:hint="eastAsia"/>
-        </w:rPr>
-        <w:t>├</w:t>
-      </w:r>
-      <w:r>
-        <w:rPr>
-          <w:rFonts w:ascii="Calibri" w:hAnsi="Calibri" w:cs="Calibri"/>
-        </w:rPr>
-        <w:t>──</w:t>
-      </w:r>
-      <w:r>
-        <w:t xml:space="preserve"> productos</w:t>
-      </w:r>
-    </w:p>
-    <w:p>
-      <w:r>
-        <w:rPr>
-          <w:rFonts w:ascii="MS Gothic" w:eastAsia="MS Gothic" w:hAnsi="MS Gothic" w:cs="MS Gothic" w:hint="eastAsia"/>
-        </w:rPr>
-        <w:t>├</w:t>
-      </w:r>
-      <w:r>
-        <w:rPr>
-          <w:rFonts w:ascii="Calibri" w:hAnsi="Calibri" w:cs="Calibri"/>
-        </w:rPr>
-        <w:t>──</w:t>
-      </w:r>
-      <w:r>
-        <w:t xml:space="preserve"> proveedores</w:t>
-      </w:r>
-    </w:p>
-    <w:p>
-      <w:r>
-        <w:rPr>
-          <w:rFonts w:ascii="MS Gothic" w:eastAsia="MS Gothic" w:hAnsi="MS Gothic" w:cs="MS Gothic" w:hint="eastAsia"/>
-        </w:rPr>
-        <w:t>├</w:t>
-      </w:r>
-      <w:r>
-        <w:rPr>
-          <w:rFonts w:ascii="Calibri" w:hAnsi="Calibri" w:cs="Calibri"/>
-        </w:rPr>
-        <w:t>──</w:t>
-      </w:r>
-      <w:r>
-        <w:t xml:space="preserve"> </w:t>
-      </w:r>
-      <w:proofErr w:type="spellStart"/>
-      <w:r>
-        <w:t>categorias</w:t>
-      </w:r>
-      <w:proofErr w:type="spellEnd"/>
-    </w:p>
-    <w:p>
-      <w:r>
-        <w:t>└── ventas</w:t>
-      </w:r>
-    </w:p>
-    <w:p>
-      <w:r>
-        <w:t xml:space="preserve">        │</w:t>
-      </w:r>
-    </w:p>
-    <w:p>
-      <w:r>
-        <w:t xml:space="preserve">        </w:t>
-      </w:r>
-      <w:r>
-        <w:rPr>
-          <w:rFonts w:ascii="MS Gothic" w:eastAsia="MS Gothic" w:hAnsi="MS Gothic" w:cs="MS Gothic" w:hint="eastAsia"/>
-        </w:rPr>
-        <w:t>├</w:t>
-      </w:r>
-      <w:r>
-        <w:rPr>
-          <w:rFonts w:ascii="Calibri" w:hAnsi="Calibri" w:cs="Calibri"/>
-        </w:rPr>
-        <w:t>──</w:t>
-      </w:r>
-      <w:r>
-        <w:t xml:space="preserve"> detalle</w:t>
-      </w:r>
-    </w:p>
-    <w:p>
-      <w:r>
-        <w:t xml:space="preserve">        </w:t>
-      </w:r>
-      <w:r>
-        <w:rPr>
-          <w:rFonts w:ascii="MS Gothic" w:eastAsia="MS Gothic" w:hAnsi="MS Gothic" w:cs="MS Gothic" w:hint="eastAsia"/>
-        </w:rPr>
-        <w:t>├</w:t>
-      </w:r>
-      <w:r>
-        <w:rPr>
-          <w:rFonts w:ascii="Calibri" w:hAnsi="Calibri" w:cs="Calibri"/>
-        </w:rPr>
-        <w:t>──</w:t>
-      </w:r>
-      <w:r>
-        <w:t xml:space="preserve"> detalle</w:t>
-      </w:r>
-    </w:p>
-    <w:p>
-      <w:r>
-        <w:t xml:space="preserve">        └── detalle</w:t>
-      </w:r>
-    </w:p>
-    <w:p/>
-    <w:p>
-      <w:r>
-        <w:t xml:space="preserve">Como </w:t>
-      </w:r>
-      <w:r>
-        <w:rPr>
-          <w:b/>
-          <w:bCs/>
-        </w:rPr>
-        <w:t>todos esos objetos también implementan Serializable</w:t>
-      </w:r>
-      <w:r>
-        <w:t>, Java recorre automáticamente todo el árbol de objetos y lo guarda.</w:t>
-      </w:r>
-    </w:p>
-    <w:p>
-      <w:proofErr w:type="spellStart"/>
-      <w:r>
-        <w:t>Persistencia.guardar</w:t>
-      </w:r>
-      <w:proofErr w:type="spellEnd"/>
-      <w:r>
-        <w:t>(data);</w:t>
-      </w:r>
-    </w:p>
-    <w:p/>
-    <w:p>
-      <w:pPr>
-        <w:rPr>
-          <w:sz w:val="24"/>
-          <w:szCs w:val="24"/>
-        </w:rPr>
-      </w:pPr>
-      <w:r>
-        <w:rPr>
-          <w:sz w:val="24"/>
-          <w:szCs w:val="24"/>
-          <w:highlight w:val="green"/>
-        </w:rPr>
-        <w:t>¿Qué clases usa Java?</w:t>
-      </w:r>
-    </w:p>
-    <w:p>
-      <w:r>
-        <w:rPr>
-          <w:highlight w:val="green"/>
-        </w:rPr>
-        <w:t>+</w:t>
-      </w:r>
-      <w:r>
-        <w:t xml:space="preserve"> File </w:t>
-      </w:r>
-      <w:r>
-        <w:rPr>
-          <w:color w:val="00B050"/>
-        </w:rPr>
-        <w:sym w:font="Wingdings" w:char="F0E0"/>
-      </w:r>
-      <w:r>
-        <w:t xml:space="preserve"> representa un archivo, no guarda nada, solo representa la ruta del archivo.</w:t>
+      <w:r>
+        <w:t xml:space="preserve">hace el proceso inverso, lee un archivo y reconstruye el objeto. </w:t>
       </w:r>
     </w:p>
     <w:p>
@@ -1341,228 +1273,45 @@
         <w:rPr>
           <w:lang w:val="en-US"/>
         </w:rPr>
-        <w:t xml:space="preserve">File </w:t>
-      </w:r>
-      <w:proofErr w:type="spellStart"/>
-      <w:r>
-        <w:rPr>
+        <w:t>Data data = (Data) input.readObject();</w:t>
+      </w:r>
+    </w:p>
+    <w:p>
+      <w:pPr>
+        <w:rPr>
+          <w:sz w:val="24"/>
+          <w:szCs w:val="24"/>
           <w:lang w:val="en-US"/>
         </w:rPr>
-        <w:t>archivo</w:t>
-      </w:r>
-      <w:proofErr w:type="spellEnd"/>
-      <w:r>
-        <w:rPr>
+      </w:pPr>
+    </w:p>
+    <w:p>
+      <w:pPr>
+        <w:rPr>
+          <w:sz w:val="24"/>
+          <w:szCs w:val="24"/>
           <w:lang w:val="en-US"/>
         </w:rPr>
-        <w:t xml:space="preserve"> = new File("musicstore.dat");</w:t>
-      </w:r>
-    </w:p>
-    <w:p>
-      <w:pPr>
-        <w:rPr>
-          <w:lang w:val="en-US"/>
-        </w:rPr>
-      </w:pPr>
-    </w:p>
-    <w:p>
-      <w:r>
-        <w:rPr>
-          <w:highlight w:val="green"/>
-        </w:rPr>
-        <w:t>+</w:t>
-      </w:r>
-      <w:r>
-        <w:t xml:space="preserve"> </w:t>
-      </w:r>
-      <w:proofErr w:type="spellStart"/>
-      <w:r>
-        <w:t>FileOutputStream</w:t>
-      </w:r>
-      <w:proofErr w:type="spellEnd"/>
-      <w:r>
-        <w:t xml:space="preserve"> </w:t>
-      </w:r>
-      <w:r>
-        <w:rPr>
-          <w:color w:val="00B050"/>
-        </w:rPr>
-        <w:sym w:font="Wingdings" w:char="F0E0"/>
-      </w:r>
-      <w:r>
-        <w:t xml:space="preserve"> </w:t>
-      </w:r>
-      <w:r>
-        <w:t>abre un archivo para escribir.</w:t>
-      </w:r>
-    </w:p>
-    <w:p/>
-    <w:p>
-      <w:r>
-        <w:rPr>
-          <w:highlight w:val="green"/>
-        </w:rPr>
-        <w:t>+</w:t>
-      </w:r>
-      <w:r>
-        <w:t xml:space="preserve"> </w:t>
-      </w:r>
-      <w:proofErr w:type="spellStart"/>
-      <w:r>
-        <w:t>ObjectOutputStream</w:t>
-      </w:r>
-      <w:proofErr w:type="spellEnd"/>
-      <w:r>
-        <w:t xml:space="preserve"> </w:t>
-      </w:r>
-      <w:r>
-        <w:rPr>
-          <w:color w:val="00B050"/>
-        </w:rPr>
-        <w:sym w:font="Wingdings" w:char="F0E0"/>
-      </w:r>
-      <w:r>
-        <w:t xml:space="preserve"> es el encargado de serializar objetos.</w:t>
-      </w:r>
-      <w:r>
-        <w:t xml:space="preserve"> A</w:t>
-      </w:r>
-      <w:r>
-        <w:t>utomáticamente convierte Data en bytes.</w:t>
-      </w:r>
-    </w:p>
-    <w:p>
-      <w:proofErr w:type="spellStart"/>
-      <w:r>
-        <w:t>output.writeObject</w:t>
-      </w:r>
-      <w:proofErr w:type="spellEnd"/>
-      <w:r>
-        <w:t>(data);</w:t>
-      </w:r>
-    </w:p>
-    <w:p/>
-    <w:p>
-      <w:r>
-        <w:rPr>
-          <w:highlight w:val="green"/>
-        </w:rPr>
-        <w:t>+</w:t>
-      </w:r>
-      <w:r>
-        <w:t xml:space="preserve"> </w:t>
-      </w:r>
-      <w:proofErr w:type="spellStart"/>
-      <w:r>
-        <w:t>ObjectInputStream</w:t>
-      </w:r>
-      <w:proofErr w:type="spellEnd"/>
-      <w:r>
-        <w:t xml:space="preserve"> </w:t>
-      </w:r>
-      <w:r>
-        <w:rPr>
-          <w:color w:val="00B050"/>
-        </w:rPr>
-        <w:sym w:font="Wingdings" w:char="F0E0"/>
-      </w:r>
-      <w:r>
-        <w:rPr>
-          <w:color w:val="00B050"/>
-        </w:rPr>
-        <w:t xml:space="preserve"> </w:t>
-      </w:r>
-      <w:r>
-        <w:t xml:space="preserve">hace el proceso inverso, lee un archivo y reconstruye el objeto. </w:t>
-      </w:r>
-    </w:p>
-    <w:p>
-      <w:pPr>
-        <w:rPr>
-          <w:lang w:val="en-US"/>
-        </w:rPr>
-      </w:pPr>
-      <w:r>
-        <w:rPr>
-          <w:lang w:val="en-US"/>
-        </w:rPr>
-        <w:t xml:space="preserve">Data </w:t>
-      </w:r>
-      <w:proofErr w:type="spellStart"/>
-      <w:r>
-        <w:rPr>
-          <w:lang w:val="en-US"/>
-        </w:rPr>
-        <w:t>data</w:t>
-      </w:r>
-      <w:proofErr w:type="spellEnd"/>
-      <w:r>
-        <w:rPr>
-          <w:lang w:val="en-US"/>
-        </w:rPr>
-        <w:t xml:space="preserve"> = (Data) </w:t>
-      </w:r>
-      <w:proofErr w:type="spellStart"/>
-      <w:r>
-        <w:rPr>
-          <w:lang w:val="en-US"/>
-        </w:rPr>
-        <w:t>input.readObject</w:t>
-      </w:r>
-      <w:proofErr w:type="spellEnd"/>
-      <w:r>
-        <w:rPr>
-          <w:lang w:val="en-US"/>
-        </w:rPr>
-        <w:t>();</w:t>
-      </w:r>
-    </w:p>
-    <w:p>
-      <w:pPr>
-        <w:rPr>
-          <w:sz w:val="24"/>
-          <w:szCs w:val="24"/>
-          <w:lang w:val="en-US"/>
-        </w:rPr>
-      </w:pPr>
-    </w:p>
-    <w:p>
-      <w:pPr>
-        <w:rPr>
-          <w:sz w:val="24"/>
-          <w:szCs w:val="24"/>
-          <w:lang w:val="en-US"/>
-        </w:rPr>
-      </w:pPr>
-    </w:p>
-    <w:p>
-      <w:pPr>
-        <w:rPr>
-          <w:sz w:val="24"/>
-          <w:szCs w:val="24"/>
-          <w:highlight w:val="green"/>
-        </w:rPr>
-      </w:pPr>
-    </w:p>
-    <w:p>
-      <w:pPr>
-        <w:rPr>
-          <w:sz w:val="24"/>
-          <w:szCs w:val="24"/>
-          <w:lang w:val="en-US"/>
-        </w:rPr>
-      </w:pPr>
-      <w:r>
+      </w:pPr>
+    </w:p>
+    <w:p>
+      <w:pPr>
         <w:rPr>
           <w:sz w:val="24"/>
           <w:szCs w:val="24"/>
           <w:highlight w:val="green"/>
           <w:lang w:val="en-US"/>
         </w:rPr>
-        <w:lastRenderedPageBreak/>
-        <w:t>¿</w:t>
-      </w:r>
-      <w:proofErr w:type="spellStart"/>
+      </w:pPr>
+    </w:p>
+    <w:p>
+      <w:pPr>
+        <w:rPr>
+          <w:sz w:val="24"/>
+          <w:szCs w:val="24"/>
+          <w:lang w:val="en-US"/>
+        </w:rPr>
+      </w:pPr>
       <w:r>
         <w:rPr>
           <w:sz w:val="24"/>
@@ -1570,58 +1319,21 @@
           <w:highlight w:val="green"/>
           <w:lang w:val="en-US"/>
         </w:rPr>
-        <w:t>Qué</w:t>
-      </w:r>
-      <w:proofErr w:type="spellEnd"/>
-      <w:r>
-        <w:rPr>
-          <w:sz w:val="24"/>
-          <w:szCs w:val="24"/>
-          <w:highlight w:val="green"/>
+        <w:lastRenderedPageBreak/>
+        <w:t>¿Qué es writeObject()?</w:t>
+      </w:r>
+    </w:p>
+    <w:p>
+      <w:pPr>
+        <w:rPr>
           <w:lang w:val="en-US"/>
         </w:rPr>
-        <w:t xml:space="preserve"> es </w:t>
-      </w:r>
-      <w:proofErr w:type="spellStart"/>
-      <w:r>
-        <w:rPr>
-          <w:sz w:val="24"/>
-          <w:szCs w:val="24"/>
-          <w:highlight w:val="green"/>
+      </w:pPr>
+      <w:r>
+        <w:rPr>
           <w:lang w:val="en-US"/>
         </w:rPr>
-        <w:t>writeObject</w:t>
-      </w:r>
-      <w:proofErr w:type="spellEnd"/>
-      <w:r>
-        <w:rPr>
-          <w:sz w:val="24"/>
-          <w:szCs w:val="24"/>
-          <w:highlight w:val="green"/>
-          <w:lang w:val="en-US"/>
-        </w:rPr>
-        <w:t>()?</w:t>
-      </w:r>
-    </w:p>
-    <w:p>
-      <w:pPr>
-        <w:rPr>
-          <w:lang w:val="en-US"/>
-        </w:rPr>
-      </w:pPr>
-      <w:proofErr w:type="spellStart"/>
-      <w:r>
-        <w:rPr>
-          <w:lang w:val="en-US"/>
-        </w:rPr>
-        <w:t>output.writeObject</w:t>
-      </w:r>
-      <w:proofErr w:type="spellEnd"/>
-      <w:r>
-        <w:rPr>
-          <w:lang w:val="en-US"/>
-        </w:rPr>
-        <w:t>(data);</w:t>
+        <w:t>output.writeObject(data);</w:t>
       </w:r>
     </w:p>
     <w:p>
@@ -1708,61 +1420,33 @@
           <w:szCs w:val="24"/>
           <w:highlight w:val="green"/>
         </w:rPr>
-        <w:t xml:space="preserve">¿Y </w:t>
-      </w:r>
-      <w:proofErr w:type="spellStart"/>
-      <w:r>
-        <w:rPr>
-          <w:sz w:val="24"/>
-          <w:szCs w:val="24"/>
-          <w:highlight w:val="green"/>
-        </w:rPr>
-        <w:t>readObject</w:t>
-      </w:r>
-      <w:proofErr w:type="spellEnd"/>
-      <w:r>
-        <w:rPr>
-          <w:sz w:val="24"/>
-          <w:szCs w:val="24"/>
-          <w:highlight w:val="green"/>
-        </w:rPr>
-        <w:t>()?</w:t>
-      </w:r>
-    </w:p>
-    <w:p>
-      <w:r>
-        <w:t>Hace exactamente lo contrario.</w:t>
-      </w:r>
-      <w:r>
-        <w:t xml:space="preserve"> Reconstruye todo el objeto.</w:t>
-      </w:r>
-    </w:p>
-    <w:p>
-      <w:r>
-        <w:t xml:space="preserve">Data </w:t>
-      </w:r>
-      <w:proofErr w:type="spellStart"/>
-      <w:r>
-        <w:t>data</w:t>
-      </w:r>
-      <w:proofErr w:type="spellEnd"/>
-      <w:r>
-        <w:t xml:space="preserve"> = (Data) </w:t>
-      </w:r>
-      <w:proofErr w:type="spellStart"/>
-      <w:r>
-        <w:t>input.readObject</w:t>
-      </w:r>
-      <w:proofErr w:type="spellEnd"/>
-      <w:r>
-        <w:t>();</w:t>
-      </w:r>
-    </w:p>
-    <w:p>
-      <w:pPr>
-        <w:rPr>
-          <w:sz w:val="24"/>
-          <w:szCs w:val="24"/>
+        <w:t>¿Y readObject()?</w:t>
+      </w:r>
+    </w:p>
+    <w:p>
+      <w:r>
+        <w:t>Hace exactamente lo contrario. Reconstruye todo el objeto.</w:t>
+      </w:r>
+    </w:p>
+    <w:p>
+      <w:pPr>
+        <w:rPr>
+          <w:lang w:val="en-US"/>
+        </w:rPr>
+      </w:pPr>
+      <w:r>
+        <w:rPr>
+          <w:lang w:val="en-US"/>
+        </w:rPr>
+        <w:t>Data data = (Data) input.readObject();</w:t>
+      </w:r>
+    </w:p>
+    <w:p>
+      <w:pPr>
+        <w:rPr>
+          <w:sz w:val="24"/>
+          <w:szCs w:val="24"/>
+          <w:lang w:val="en-US"/>
         </w:rPr>
       </w:pPr>
     </w:p>
@@ -1991,6 +1675,535 @@
           <w:szCs w:val="24"/>
         </w:rPr>
         <w:t>Cierro el archivo</w:t>
+      </w:r>
+    </w:p>
+    <w:p>
+      <w:pPr>
+        <w:rPr>
+          <w:sz w:val="24"/>
+          <w:szCs w:val="24"/>
+        </w:rPr>
+      </w:pPr>
+    </w:p>
+    <w:p>
+      <w:pPr>
+        <w:rPr>
+          <w:sz w:val="24"/>
+          <w:szCs w:val="24"/>
+        </w:rPr>
+      </w:pPr>
+    </w:p>
+    <w:p>
+      <w:pPr>
+        <w:rPr>
+          <w:sz w:val="24"/>
+          <w:szCs w:val="24"/>
+        </w:rPr>
+      </w:pPr>
+    </w:p>
+    <w:p>
+      <w:pPr>
+        <w:rPr>
+          <w:sz w:val="24"/>
+          <w:szCs w:val="24"/>
+        </w:rPr>
+      </w:pPr>
+    </w:p>
+    <w:p>
+      <w:pPr>
+        <w:rPr>
+          <w:sz w:val="24"/>
+          <w:szCs w:val="24"/>
+        </w:rPr>
+      </w:pPr>
+    </w:p>
+    <w:p>
+      <w:pPr>
+        <w:rPr>
+          <w:sz w:val="24"/>
+          <w:szCs w:val="24"/>
+        </w:rPr>
+      </w:pPr>
+    </w:p>
+    <w:p>
+      <w:pPr>
+        <w:rPr>
+          <w:sz w:val="24"/>
+          <w:szCs w:val="24"/>
+        </w:rPr>
+      </w:pPr>
+    </w:p>
+    <w:p>
+      <w:pPr>
+        <w:rPr>
+          <w:sz w:val="24"/>
+          <w:szCs w:val="24"/>
+        </w:rPr>
+      </w:pPr>
+      <w:r>
+        <w:rPr>
+          <w:sz w:val="24"/>
+          <w:szCs w:val="24"/>
+          <w:highlight w:val="magenta"/>
+        </w:rPr>
+        <w:lastRenderedPageBreak/>
+        <w:t>Clase UsuarioServicio:</w:t>
+      </w:r>
+    </w:p>
+    <w:p>
+      <w:pPr>
+        <w:rPr>
+          <w:sz w:val="24"/>
+          <w:szCs w:val="24"/>
+          <w:lang w:val="en-US"/>
+        </w:rPr>
+      </w:pPr>
+      <w:r>
+        <w:rPr>
+          <w:sz w:val="24"/>
+          <w:szCs w:val="24"/>
+          <w:lang w:val="en-US"/>
+        </w:rPr>
+        <w:t>public Usuario validarLogin(String nombreUsuario, String password){</w:t>
+      </w:r>
+    </w:p>
+    <w:p>
+      <w:pPr>
+        <w:rPr>
+          <w:sz w:val="24"/>
+          <w:szCs w:val="24"/>
+          <w:lang w:val="en-US"/>
+        </w:rPr>
+      </w:pPr>
+      <w:r>
+        <w:rPr>
+          <w:sz w:val="24"/>
+          <w:szCs w:val="24"/>
+          <w:lang w:val="en-US"/>
+        </w:rPr>
+        <w:t xml:space="preserve">    </w:t>
+      </w:r>
+    </w:p>
+    <w:p>
+      <w:pPr>
+        <w:rPr>
+          <w:sz w:val="24"/>
+          <w:szCs w:val="24"/>
+        </w:rPr>
+      </w:pPr>
+      <w:r>
+        <w:rPr>
+          <w:sz w:val="24"/>
+          <w:szCs w:val="24"/>
+          <w:lang w:val="en-US"/>
+        </w:rPr>
+        <w:t xml:space="preserve">        </w:t>
+      </w:r>
+      <w:r>
+        <w:rPr>
+          <w:sz w:val="24"/>
+          <w:szCs w:val="24"/>
+        </w:rPr>
+        <w:t>for (Usuario usuario : data.getUsuarios()){</w:t>
+      </w:r>
+    </w:p>
+    <w:p>
+      <w:pPr>
+        <w:rPr>
+          <w:sz w:val="24"/>
+          <w:szCs w:val="24"/>
+        </w:rPr>
+      </w:pPr>
+      <w:r>
+        <w:rPr>
+          <w:sz w:val="24"/>
+          <w:szCs w:val="24"/>
+        </w:rPr>
+        <w:t xml:space="preserve">                </w:t>
+      </w:r>
+    </w:p>
+    <w:p>
+      <w:pPr>
+        <w:rPr>
+          <w:sz w:val="24"/>
+          <w:szCs w:val="24"/>
+        </w:rPr>
+      </w:pPr>
+      <w:r>
+        <w:rPr>
+          <w:sz w:val="24"/>
+          <w:szCs w:val="24"/>
+        </w:rPr>
+        <w:t xml:space="preserve">            if(usuario.getNombreUsuario().equals(nombreUsuario) &amp;&amp;</w:t>
+      </w:r>
+    </w:p>
+    <w:p>
+      <w:pPr>
+        <w:rPr>
+          <w:sz w:val="24"/>
+          <w:szCs w:val="24"/>
+          <w:lang w:val="en-US"/>
+        </w:rPr>
+      </w:pPr>
+      <w:r>
+        <w:rPr>
+          <w:sz w:val="24"/>
+          <w:szCs w:val="24"/>
+        </w:rPr>
+        <w:t xml:space="preserve">                    </w:t>
+      </w:r>
+      <w:r>
+        <w:rPr>
+          <w:sz w:val="24"/>
+          <w:szCs w:val="24"/>
+          <w:lang w:val="en-US"/>
+        </w:rPr>
+        <w:t>usuario.getPassword().equals(password)){</w:t>
+      </w:r>
+    </w:p>
+    <w:p>
+      <w:pPr>
+        <w:rPr>
+          <w:sz w:val="24"/>
+          <w:szCs w:val="24"/>
+          <w:lang w:val="en-US"/>
+        </w:rPr>
+      </w:pPr>
+      <w:r>
+        <w:rPr>
+          <w:sz w:val="24"/>
+          <w:szCs w:val="24"/>
+          <w:lang w:val="en-US"/>
+        </w:rPr>
+        <w:t xml:space="preserve">            </w:t>
+      </w:r>
+    </w:p>
+    <w:p>
+      <w:pPr>
+        <w:rPr>
+          <w:sz w:val="24"/>
+          <w:szCs w:val="24"/>
+          <w:lang w:val="en-US"/>
+        </w:rPr>
+      </w:pPr>
+      <w:r>
+        <w:rPr>
+          <w:sz w:val="24"/>
+          <w:szCs w:val="24"/>
+          <w:lang w:val="en-US"/>
+        </w:rPr>
+        <w:t xml:space="preserve">                return usuario;</w:t>
+      </w:r>
+    </w:p>
+    <w:p>
+      <w:pPr>
+        <w:rPr>
+          <w:sz w:val="24"/>
+          <w:szCs w:val="24"/>
+        </w:rPr>
+      </w:pPr>
+      <w:r>
+        <w:rPr>
+          <w:sz w:val="24"/>
+          <w:szCs w:val="24"/>
+          <w:lang w:val="en-US"/>
+        </w:rPr>
+        <w:t xml:space="preserve">            </w:t>
+      </w:r>
+      <w:r>
+        <w:rPr>
+          <w:sz w:val="24"/>
+          <w:szCs w:val="24"/>
+        </w:rPr>
+        <w:t>}</w:t>
+      </w:r>
+    </w:p>
+    <w:p>
+      <w:pPr>
+        <w:rPr>
+          <w:sz w:val="24"/>
+          <w:szCs w:val="24"/>
+        </w:rPr>
+      </w:pPr>
+      <w:r>
+        <w:rPr>
+          <w:sz w:val="24"/>
+          <w:szCs w:val="24"/>
+        </w:rPr>
+        <w:t xml:space="preserve">        }</w:t>
+      </w:r>
+    </w:p>
+    <w:p>
+      <w:pPr>
+        <w:rPr>
+          <w:sz w:val="24"/>
+          <w:szCs w:val="24"/>
+        </w:rPr>
+      </w:pPr>
+      <w:r>
+        <w:rPr>
+          <w:sz w:val="24"/>
+          <w:szCs w:val="24"/>
+        </w:rPr>
+        <w:t xml:space="preserve">        return null;</w:t>
+      </w:r>
+    </w:p>
+    <w:p>
+      <w:pPr>
+        <w:rPr>
+          <w:sz w:val="24"/>
+          <w:szCs w:val="24"/>
+        </w:rPr>
+      </w:pPr>
+      <w:r>
+        <w:rPr>
+          <w:sz w:val="24"/>
+          <w:szCs w:val="24"/>
+        </w:rPr>
+        <w:t xml:space="preserve">    }</w:t>
+      </w:r>
+    </w:p>
+    <w:p>
+      <w:pPr>
+        <w:rPr>
+          <w:sz w:val="24"/>
+          <w:szCs w:val="24"/>
+        </w:rPr>
+      </w:pPr>
+      <w:r>
+        <w:rPr>
+          <w:sz w:val="24"/>
+          <w:szCs w:val="24"/>
+          <w:highlight w:val="magenta"/>
+        </w:rPr>
+        <w:t>-</w:t>
+      </w:r>
+      <w:r>
+        <w:rPr>
+          <w:sz w:val="24"/>
+          <w:szCs w:val="24"/>
+        </w:rPr>
+        <w:t xml:space="preserve"> </w:t>
+      </w:r>
+      <w:r>
+        <w:rPr>
+          <w:sz w:val="24"/>
+          <w:szCs w:val="24"/>
+        </w:rPr>
+        <w:t>Este método r</w:t>
+      </w:r>
+      <w:r>
+        <w:rPr>
+          <w:sz w:val="24"/>
+          <w:szCs w:val="24"/>
+        </w:rPr>
+        <w:t>ecorre la lista de usuarios almacenada en Data. Para cada usuario compara el nombre de usuario y la contraseña utilizando el método equals(). Si encuentra un usuario cuyos datos coinciden, devuelve ese objeto Usuario. Si termina de recorrer la lista sin encontrar coincidencias, devuelve null.</w:t>
+      </w:r>
+    </w:p>
+    <w:p>
+      <w:pPr>
+        <w:rPr>
+          <w:sz w:val="24"/>
+          <w:szCs w:val="24"/>
+        </w:rPr>
+      </w:pPr>
+      <w:r>
+        <w:rPr>
+          <w:sz w:val="24"/>
+          <w:szCs w:val="24"/>
+          <w:highlight w:val="magenta"/>
+        </w:rPr>
+        <w:t>-</w:t>
+      </w:r>
+      <w:r>
+        <w:rPr>
+          <w:sz w:val="24"/>
+          <w:szCs w:val="24"/>
+        </w:rPr>
+        <w:t xml:space="preserve"> </w:t>
+      </w:r>
+      <w:r>
+        <w:rPr>
+          <w:sz w:val="24"/>
+          <w:szCs w:val="24"/>
+        </w:rPr>
+        <w:t xml:space="preserve">En Java, el método </w:t>
+      </w:r>
+      <w:r>
+        <w:rPr>
+          <w:b/>
+          <w:bCs/>
+          <w:sz w:val="24"/>
+          <w:szCs w:val="24"/>
+        </w:rPr>
+        <w:t>.equals() se utiliza para comparar si dos objetos son lógicamente iguales en función de su contenido o valor</w:t>
+      </w:r>
+      <w:r>
+        <w:rPr>
+          <w:sz w:val="24"/>
+          <w:szCs w:val="24"/>
+        </w:rPr>
+        <w:t xml:space="preserve">. </w:t>
+      </w:r>
+    </w:p>
+    <w:p>
+      <w:pPr>
+        <w:rPr>
+          <w:sz w:val="24"/>
+          <w:szCs w:val="24"/>
+        </w:rPr>
+      </w:pPr>
+      <w:r>
+        <w:rPr>
+          <w:sz w:val="24"/>
+          <w:szCs w:val="24"/>
+        </w:rPr>
+        <w:t>----------------------------------------------------------------------------------------------------------------------------------------------</w:t>
+      </w:r>
+    </w:p>
+    <w:p>
+      <w:pPr>
+        <w:rPr>
+          <w:sz w:val="24"/>
+          <w:szCs w:val="24"/>
+        </w:rPr>
+      </w:pPr>
+      <w:r>
+        <w:rPr>
+          <w:sz w:val="24"/>
+          <w:szCs w:val="24"/>
+        </w:rPr>
+        <w:t>En MAIN:</w:t>
+      </w:r>
+    </w:p>
+    <w:p>
+      <w:pPr>
+        <w:rPr>
+          <w:sz w:val="24"/>
+          <w:szCs w:val="24"/>
+        </w:rPr>
+      </w:pPr>
+      <w:r>
+        <w:rPr>
+          <w:sz w:val="24"/>
+          <w:szCs w:val="24"/>
+        </w:rPr>
+        <w:t>FrmLogin login = new FrmLogin(data);</w:t>
+      </w:r>
+      <w:r>
+        <w:rPr>
+          <w:sz w:val="24"/>
+          <w:szCs w:val="24"/>
+        </w:rPr>
+        <w:t xml:space="preserve"> </w:t>
+      </w:r>
+      <w:r>
+        <w:rPr>
+          <w:sz w:val="24"/>
+          <w:szCs w:val="24"/>
+          <w:lang w:val="en-US"/>
+        </w:rPr>
+        <w:sym w:font="Wingdings" w:char="F0E0"/>
+      </w:r>
+      <w:r>
+        <w:rPr>
+          <w:sz w:val="24"/>
+          <w:szCs w:val="24"/>
+        </w:rPr>
+        <w:t xml:space="preserve"> </w:t>
+      </w:r>
+      <w:r>
+        <w:rPr>
+          <w:sz w:val="24"/>
+          <w:szCs w:val="24"/>
+        </w:rPr>
+        <w:t>Crea el formulario y le entrega los datos del sistema.</w:t>
+      </w:r>
+    </w:p>
+    <w:p>
+      <w:pPr>
+        <w:rPr>
+          <w:sz w:val="24"/>
+          <w:szCs w:val="24"/>
+        </w:rPr>
+      </w:pPr>
+      <w:r>
+        <w:rPr>
+          <w:sz w:val="24"/>
+          <w:szCs w:val="24"/>
+        </w:rPr>
+        <w:t>login.setLocationRelativeTo(null);</w:t>
+      </w:r>
+      <w:r>
+        <w:rPr>
+          <w:sz w:val="24"/>
+          <w:szCs w:val="24"/>
+        </w:rPr>
+        <w:t xml:space="preserve"> </w:t>
+      </w:r>
+      <w:r>
+        <w:rPr>
+          <w:sz w:val="24"/>
+          <w:szCs w:val="24"/>
+        </w:rPr>
+        <w:sym w:font="Wingdings" w:char="F0E0"/>
+      </w:r>
+      <w:r>
+        <w:rPr>
+          <w:sz w:val="24"/>
+          <w:szCs w:val="24"/>
+        </w:rPr>
+        <w:t xml:space="preserve"> </w:t>
+      </w:r>
+      <w:r>
+        <w:rPr>
+          <w:sz w:val="24"/>
+          <w:szCs w:val="24"/>
+        </w:rPr>
+        <w:t>Centra la ventana en la pantalla.</w:t>
+      </w:r>
+    </w:p>
+    <w:p>
+      <w:pPr>
+        <w:rPr>
+          <w:sz w:val="24"/>
+          <w:szCs w:val="24"/>
+        </w:rPr>
+      </w:pPr>
+      <w:r>
+        <w:rPr>
+          <w:sz w:val="24"/>
+          <w:szCs w:val="24"/>
+        </w:rPr>
+        <w:t>login.setVisible(true);</w:t>
+      </w:r>
+      <w:r>
+        <w:rPr>
+          <w:sz w:val="24"/>
+          <w:szCs w:val="24"/>
+        </w:rPr>
+        <w:t xml:space="preserve"> </w:t>
+      </w:r>
+      <w:r>
+        <w:rPr>
+          <w:sz w:val="24"/>
+          <w:szCs w:val="24"/>
+        </w:rPr>
+        <w:sym w:font="Wingdings" w:char="F0E0"/>
+      </w:r>
+      <w:r>
+        <w:rPr>
+          <w:sz w:val="24"/>
+          <w:szCs w:val="24"/>
+        </w:rPr>
+        <w:t xml:space="preserve"> </w:t>
+      </w:r>
+      <w:r>
+        <w:rPr>
+          <w:sz w:val="24"/>
+          <w:szCs w:val="24"/>
+        </w:rPr>
+        <w:t>Hace visible el formulario.</w:t>
       </w:r>
     </w:p>
     <w:sectPr>
@@ -4136,6 +4349,29 @@
       <w:spacing w:val="5"/>
     </w:rPr>
   </w:style>
+  <w:style w:type="character" w:styleId="Hipervnculo">
+    <w:name w:val="Hyperlink"/>
+    <w:basedOn w:val="Fuentedeprrafopredeter"/>
+    <w:uiPriority w:val="99"/>
+    <w:unhideWhenUsed/>
+    <w:rsid w:val="00CC745A"/>
+    <w:rPr>
+      <w:color w:val="0563C1" w:themeColor="hyperlink"/>
+      <w:u w:val="single"/>
+    </w:rPr>
+  </w:style>
+  <w:style w:type="character" w:styleId="Mencinsinresolver">
+    <w:name w:val="Unresolved Mention"/>
+    <w:basedOn w:val="Fuentedeprrafopredeter"/>
+    <w:uiPriority w:val="99"/>
+    <w:semiHidden/>
+    <w:unhideWhenUsed/>
+    <w:rsid w:val="00CC745A"/>
+    <w:rPr>
+      <w:color w:val="605E5C"/>
+      <w:shd w:val="clear" w:color="auto" w:fill="E1DFDD"/>
+    </w:rPr>
+  </w:style>
 </w:styles>
 </file>
 

</xml_diff>

<commit_message>
Implemente los 5 ABM del sistema
</commit_message>
<xml_diff>
--- a/MusicStore.docx
+++ b/MusicStore.docx
@@ -285,14 +285,15 @@
       </w:r>
     </w:p>
     <w:p/>
-    <w:p>
-      <w:r>
+    <w:p/>
+    <w:p>
+      <w:r>
+        <w:lastRenderedPageBreak/>
         <w:t xml:space="preserve">Categoría </w:t>
       </w:r>
     </w:p>
     <w:p>
       <w:r>
-        <w:lastRenderedPageBreak/>
         <w:t xml:space="preserve">• id </w:t>
       </w:r>
     </w:p>
@@ -558,8 +559,10 @@
       </w:r>
     </w:p>
     <w:p/>
-    <w:p>
-      <w:r>
+    <w:p/>
+    <w:p>
+      <w:r>
+        <w:lastRenderedPageBreak/>
         <w:t xml:space="preserve">En el </w:t>
       </w:r>
       <w:r>
@@ -612,7 +615,6 @@
     </w:p>
     <w:p>
       <w:r>
-        <w:lastRenderedPageBreak/>
         <w:t>FrmLogin</w:t>
       </w:r>
     </w:p>
@@ -654,6 +656,69 @@
       </w:r>
       <w:r>
         <w:t>Validaciones</w:t>
+      </w:r>
+    </w:p>
+    <w:p/>
+    <w:p>
+      <w:pPr>
+        <w:ind w:left="708" w:hanging="708"/>
+      </w:pPr>
+      <w:r>
+        <w:rPr>
+          <w:highlight w:val="yellow"/>
+        </w:rPr>
+        <w:t>Estructura de la página:</w:t>
+      </w:r>
+    </w:p>
+    <w:p>
+      <w:r>
+        <w:t>El sistema está organizado por módulos funcionales. Cada entidad principal posee su propio ABM para la administración de datos. Las ventas constituyen un módulo independiente, ya que no representan un ABM tradicional, y los reportes se agrupan en un único módulo destinado a la consulta de información del sistema.</w:t>
+      </w:r>
+    </w:p>
+    <w:p>
+      <w:r>
+        <w:t>MusicStore</w:t>
+      </w:r>
+    </w:p>
+    <w:p>
+      <w:r>
+        <w:t>[ Usuarios ]</w:t>
+      </w:r>
+    </w:p>
+    <w:p>
+      <w:r>
+        <w:t>[ Clientes ]</w:t>
+      </w:r>
+    </w:p>
+    <w:p>
+      <w:r>
+        <w:t>[ Proveedores ]</w:t>
+      </w:r>
+    </w:p>
+    <w:p>
+      <w:r>
+        <w:t>[ Categorías ]</w:t>
+      </w:r>
+    </w:p>
+    <w:p>
+      <w:r>
+        <w:t>[ Productos ]</w:t>
+      </w:r>
+    </w:p>
+    <w:p>
+      <w:r>
+        <w:t>[ Ventas ]</w:t>
+      </w:r>
+    </w:p>
+    <w:p>
+      <w:r>
+        <w:t>[ Reportes ]</w:t>
+      </w:r>
+    </w:p>
+    <w:p/>
+    <w:p>
+      <w:r>
+        <w:t xml:space="preserve">                    [ Salir ]</w:t>
       </w:r>
     </w:p>
     <w:p>
@@ -773,6 +838,7 @@
           <w:bCs/>
           <w:color w:val="00B0F0"/>
         </w:rPr>
+        <w:lastRenderedPageBreak/>
         <w:t xml:space="preserve">- </w:t>
       </w:r>
       <w:r>
@@ -912,206 +978,206 @@
         <w:rPr>
           <w:highlight w:val="green"/>
         </w:rPr>
+        <w:t>¿Qué pasa con Data?</w:t>
+      </w:r>
+    </w:p>
+    <w:p>
+      <w:r>
+        <w:t>Nosotros no vamos a guardar:</w:t>
+      </w:r>
+      <w:r>
+        <w:t xml:space="preserve"> </w:t>
+      </w:r>
+      <w:r>
+        <w:t>Usuario</w:t>
+      </w:r>
+      <w:r>
+        <w:t xml:space="preserve">, </w:t>
+      </w:r>
+      <w:r>
+        <w:t>Cliente</w:t>
+      </w:r>
+      <w:r>
+        <w:t xml:space="preserve">, </w:t>
+      </w:r>
+      <w:r>
+        <w:t>Producto</w:t>
+      </w:r>
+      <w:r>
+        <w:t xml:space="preserve">, </w:t>
+      </w:r>
+      <w:r>
+        <w:t>Venta uno por uno.</w:t>
+      </w:r>
+    </w:p>
+    <w:p>
+      <w:r>
+        <w:t>Vamos a guardar un único objeto</w:t>
+      </w:r>
+      <w:r>
+        <w:t xml:space="preserve"> </w:t>
+      </w:r>
+      <w:r>
+        <w:t>Data</w:t>
+      </w:r>
+      <w:r>
+        <w:t>, el cual contiene:</w:t>
+      </w:r>
+    </w:p>
+    <w:p>
+      <w:r>
+        <w:t>Data</w:t>
+      </w:r>
+    </w:p>
+    <w:p>
+      <w:r>
+        <w:t>│</w:t>
+      </w:r>
+    </w:p>
+    <w:p>
+      <w:r>
+        <w:rPr>
+          <w:rFonts w:ascii="MS Gothic" w:eastAsia="MS Gothic" w:hAnsi="MS Gothic" w:cs="MS Gothic" w:hint="eastAsia"/>
+        </w:rPr>
+        <w:t>├</w:t>
+      </w:r>
+      <w:r>
+        <w:rPr>
+          <w:rFonts w:ascii="Calibri" w:hAnsi="Calibri" w:cs="Calibri"/>
+        </w:rPr>
+        <w:t>──</w:t>
+      </w:r>
+      <w:r>
+        <w:t xml:space="preserve"> usuarios</w:t>
+      </w:r>
+    </w:p>
+    <w:p>
+      <w:r>
+        <w:rPr>
+          <w:rFonts w:ascii="MS Gothic" w:eastAsia="MS Gothic" w:hAnsi="MS Gothic" w:cs="MS Gothic" w:hint="eastAsia"/>
+        </w:rPr>
+        <w:t>├</w:t>
+      </w:r>
+      <w:r>
+        <w:rPr>
+          <w:rFonts w:ascii="Calibri" w:hAnsi="Calibri" w:cs="Calibri"/>
+        </w:rPr>
+        <w:t>──</w:t>
+      </w:r>
+      <w:r>
+        <w:t xml:space="preserve"> clientes</w:t>
+      </w:r>
+    </w:p>
+    <w:p>
+      <w:r>
+        <w:rPr>
+          <w:rFonts w:ascii="MS Gothic" w:eastAsia="MS Gothic" w:hAnsi="MS Gothic" w:cs="MS Gothic" w:hint="eastAsia"/>
+        </w:rPr>
+        <w:t>├</w:t>
+      </w:r>
+      <w:r>
+        <w:rPr>
+          <w:rFonts w:ascii="Calibri" w:hAnsi="Calibri" w:cs="Calibri"/>
+        </w:rPr>
+        <w:t>──</w:t>
+      </w:r>
+      <w:r>
+        <w:t xml:space="preserve"> productos</w:t>
+      </w:r>
+    </w:p>
+    <w:p>
+      <w:r>
+        <w:rPr>
+          <w:rFonts w:ascii="MS Gothic" w:eastAsia="MS Gothic" w:hAnsi="MS Gothic" w:cs="MS Gothic" w:hint="eastAsia"/>
+        </w:rPr>
+        <w:t>├</w:t>
+      </w:r>
+      <w:r>
+        <w:rPr>
+          <w:rFonts w:ascii="Calibri" w:hAnsi="Calibri" w:cs="Calibri"/>
+        </w:rPr>
+        <w:t>──</w:t>
+      </w:r>
+      <w:r>
+        <w:t xml:space="preserve"> proveedores</w:t>
+      </w:r>
+    </w:p>
+    <w:p>
+      <w:r>
+        <w:rPr>
+          <w:rFonts w:ascii="MS Gothic" w:eastAsia="MS Gothic" w:hAnsi="MS Gothic" w:cs="MS Gothic" w:hint="eastAsia"/>
+        </w:rPr>
+        <w:t>├</w:t>
+      </w:r>
+      <w:r>
+        <w:rPr>
+          <w:rFonts w:ascii="Calibri" w:hAnsi="Calibri" w:cs="Calibri"/>
+        </w:rPr>
+        <w:t>──</w:t>
+      </w:r>
+      <w:r>
+        <w:t xml:space="preserve"> categorias</w:t>
+      </w:r>
+    </w:p>
+    <w:p>
+      <w:r>
+        <w:t>└── ventas</w:t>
+      </w:r>
+    </w:p>
+    <w:p>
+      <w:r>
+        <w:t xml:space="preserve">        │</w:t>
+      </w:r>
+    </w:p>
+    <w:p>
+      <w:r>
+        <w:t xml:space="preserve">        </w:t>
+      </w:r>
+      <w:r>
+        <w:rPr>
+          <w:rFonts w:ascii="MS Gothic" w:eastAsia="MS Gothic" w:hAnsi="MS Gothic" w:cs="MS Gothic" w:hint="eastAsia"/>
+        </w:rPr>
+        <w:t>├</w:t>
+      </w:r>
+      <w:r>
+        <w:rPr>
+          <w:rFonts w:ascii="Calibri" w:hAnsi="Calibri" w:cs="Calibri"/>
+        </w:rPr>
+        <w:t>──</w:t>
+      </w:r>
+      <w:r>
+        <w:t xml:space="preserve"> detalle</w:t>
+      </w:r>
+    </w:p>
+    <w:p>
+      <w:r>
+        <w:t xml:space="preserve">        </w:t>
+      </w:r>
+      <w:r>
+        <w:rPr>
+          <w:rFonts w:ascii="MS Gothic" w:eastAsia="MS Gothic" w:hAnsi="MS Gothic" w:cs="MS Gothic" w:hint="eastAsia"/>
+        </w:rPr>
+        <w:t>├</w:t>
+      </w:r>
+      <w:r>
+        <w:rPr>
+          <w:rFonts w:ascii="Calibri" w:hAnsi="Calibri" w:cs="Calibri"/>
+        </w:rPr>
+        <w:t>──</w:t>
+      </w:r>
+      <w:r>
+        <w:t xml:space="preserve"> detalle</w:t>
+      </w:r>
+    </w:p>
+    <w:p>
+      <w:r>
+        <w:t xml:space="preserve">        └── detalle</w:t>
+      </w:r>
+    </w:p>
+    <w:p/>
+    <w:p>
+      <w:r>
         <w:lastRenderedPageBreak/>
-        <w:t>¿Qué pasa con Data?</w:t>
-      </w:r>
-    </w:p>
-    <w:p>
-      <w:r>
-        <w:t>Nosotros no vamos a guardar:</w:t>
-      </w:r>
-      <w:r>
-        <w:t xml:space="preserve"> </w:t>
-      </w:r>
-      <w:r>
-        <w:t>Usuario</w:t>
-      </w:r>
-      <w:r>
-        <w:t xml:space="preserve">, </w:t>
-      </w:r>
-      <w:r>
-        <w:t>Cliente</w:t>
-      </w:r>
-      <w:r>
-        <w:t xml:space="preserve">, </w:t>
-      </w:r>
-      <w:r>
-        <w:t>Producto</w:t>
-      </w:r>
-      <w:r>
-        <w:t xml:space="preserve">, </w:t>
-      </w:r>
-      <w:r>
-        <w:t>Venta uno por uno.</w:t>
-      </w:r>
-    </w:p>
-    <w:p>
-      <w:r>
-        <w:t>Vamos a guardar un único objeto</w:t>
-      </w:r>
-      <w:r>
-        <w:t xml:space="preserve"> </w:t>
-      </w:r>
-      <w:r>
-        <w:t>Data</w:t>
-      </w:r>
-      <w:r>
-        <w:t>, el cual contiene:</w:t>
-      </w:r>
-    </w:p>
-    <w:p>
-      <w:r>
-        <w:t>Data</w:t>
-      </w:r>
-    </w:p>
-    <w:p>
-      <w:r>
-        <w:t>│</w:t>
-      </w:r>
-    </w:p>
-    <w:p>
-      <w:r>
-        <w:rPr>
-          <w:rFonts w:ascii="MS Gothic" w:eastAsia="MS Gothic" w:hAnsi="MS Gothic" w:cs="MS Gothic" w:hint="eastAsia"/>
-        </w:rPr>
-        <w:t>├</w:t>
-      </w:r>
-      <w:r>
-        <w:rPr>
-          <w:rFonts w:ascii="Calibri" w:hAnsi="Calibri" w:cs="Calibri"/>
-        </w:rPr>
-        <w:t>──</w:t>
-      </w:r>
-      <w:r>
-        <w:t xml:space="preserve"> usuarios</w:t>
-      </w:r>
-    </w:p>
-    <w:p>
-      <w:r>
-        <w:rPr>
-          <w:rFonts w:ascii="MS Gothic" w:eastAsia="MS Gothic" w:hAnsi="MS Gothic" w:cs="MS Gothic" w:hint="eastAsia"/>
-        </w:rPr>
-        <w:t>├</w:t>
-      </w:r>
-      <w:r>
-        <w:rPr>
-          <w:rFonts w:ascii="Calibri" w:hAnsi="Calibri" w:cs="Calibri"/>
-        </w:rPr>
-        <w:t>──</w:t>
-      </w:r>
-      <w:r>
-        <w:t xml:space="preserve"> clientes</w:t>
-      </w:r>
-    </w:p>
-    <w:p>
-      <w:r>
-        <w:rPr>
-          <w:rFonts w:ascii="MS Gothic" w:eastAsia="MS Gothic" w:hAnsi="MS Gothic" w:cs="MS Gothic" w:hint="eastAsia"/>
-        </w:rPr>
-        <w:t>├</w:t>
-      </w:r>
-      <w:r>
-        <w:rPr>
-          <w:rFonts w:ascii="Calibri" w:hAnsi="Calibri" w:cs="Calibri"/>
-        </w:rPr>
-        <w:t>──</w:t>
-      </w:r>
-      <w:r>
-        <w:t xml:space="preserve"> productos</w:t>
-      </w:r>
-    </w:p>
-    <w:p>
-      <w:r>
-        <w:rPr>
-          <w:rFonts w:ascii="MS Gothic" w:eastAsia="MS Gothic" w:hAnsi="MS Gothic" w:cs="MS Gothic" w:hint="eastAsia"/>
-        </w:rPr>
-        <w:t>├</w:t>
-      </w:r>
-      <w:r>
-        <w:rPr>
-          <w:rFonts w:ascii="Calibri" w:hAnsi="Calibri" w:cs="Calibri"/>
-        </w:rPr>
-        <w:t>──</w:t>
-      </w:r>
-      <w:r>
-        <w:t xml:space="preserve"> proveedores</w:t>
-      </w:r>
-    </w:p>
-    <w:p>
-      <w:r>
-        <w:rPr>
-          <w:rFonts w:ascii="MS Gothic" w:eastAsia="MS Gothic" w:hAnsi="MS Gothic" w:cs="MS Gothic" w:hint="eastAsia"/>
-        </w:rPr>
-        <w:t>├</w:t>
-      </w:r>
-      <w:r>
-        <w:rPr>
-          <w:rFonts w:ascii="Calibri" w:hAnsi="Calibri" w:cs="Calibri"/>
-        </w:rPr>
-        <w:t>──</w:t>
-      </w:r>
-      <w:r>
-        <w:t xml:space="preserve"> categorias</w:t>
-      </w:r>
-    </w:p>
-    <w:p>
-      <w:r>
-        <w:t>└── ventas</w:t>
-      </w:r>
-    </w:p>
-    <w:p>
-      <w:r>
-        <w:t xml:space="preserve">        │</w:t>
-      </w:r>
-    </w:p>
-    <w:p>
-      <w:r>
-        <w:t xml:space="preserve">        </w:t>
-      </w:r>
-      <w:r>
-        <w:rPr>
-          <w:rFonts w:ascii="MS Gothic" w:eastAsia="MS Gothic" w:hAnsi="MS Gothic" w:cs="MS Gothic" w:hint="eastAsia"/>
-        </w:rPr>
-        <w:t>├</w:t>
-      </w:r>
-      <w:r>
-        <w:rPr>
-          <w:rFonts w:ascii="Calibri" w:hAnsi="Calibri" w:cs="Calibri"/>
-        </w:rPr>
-        <w:t>──</w:t>
-      </w:r>
-      <w:r>
-        <w:t xml:space="preserve"> detalle</w:t>
-      </w:r>
-    </w:p>
-    <w:p>
-      <w:r>
-        <w:t xml:space="preserve">        </w:t>
-      </w:r>
-      <w:r>
-        <w:rPr>
-          <w:rFonts w:ascii="MS Gothic" w:eastAsia="MS Gothic" w:hAnsi="MS Gothic" w:cs="MS Gothic" w:hint="eastAsia"/>
-        </w:rPr>
-        <w:t>├</w:t>
-      </w:r>
-      <w:r>
-        <w:rPr>
-          <w:rFonts w:ascii="Calibri" w:hAnsi="Calibri" w:cs="Calibri"/>
-        </w:rPr>
-        <w:t>──</w:t>
-      </w:r>
-      <w:r>
-        <w:t xml:space="preserve"> detalle</w:t>
-      </w:r>
-    </w:p>
-    <w:p>
-      <w:r>
-        <w:t xml:space="preserve">        └── detalle</w:t>
-      </w:r>
-    </w:p>
-    <w:p/>
-    <w:p>
-      <w:r>
         <w:t xml:space="preserve">Como </w:t>
       </w:r>
       <w:r>
@@ -1281,24 +1347,6 @@
         <w:rPr>
           <w:sz w:val="24"/>
           <w:szCs w:val="24"/>
-          <w:lang w:val="en-US"/>
-        </w:rPr>
-      </w:pPr>
-    </w:p>
-    <w:p>
-      <w:pPr>
-        <w:rPr>
-          <w:sz w:val="24"/>
-          <w:szCs w:val="24"/>
-          <w:lang w:val="en-US"/>
-        </w:rPr>
-      </w:pPr>
-    </w:p>
-    <w:p>
-      <w:pPr>
-        <w:rPr>
-          <w:sz w:val="24"/>
-          <w:szCs w:val="24"/>
           <w:highlight w:val="green"/>
           <w:lang w:val="en-US"/>
         </w:rPr>
@@ -1319,7 +1367,6 @@
           <w:highlight w:val="green"/>
           <w:lang w:val="en-US"/>
         </w:rPr>
-        <w:lastRenderedPageBreak/>
         <w:t>¿Qué es writeObject()?</w:t>
       </w:r>
     </w:p>
@@ -1464,105 +1511,27 @@
         </w:rPr>
         <w:t>Recibo un objeto Data</w:t>
       </w:r>
-    </w:p>
-    <w:p>
-      <w:pPr>
-        <w:rPr>
-          <w:sz w:val="24"/>
-          <w:szCs w:val="24"/>
-        </w:rPr>
-      </w:pPr>
-      <w:r>
-        <w:rPr>
-          <w:sz w:val="24"/>
-          <w:szCs w:val="24"/>
-        </w:rPr>
-        <w:t xml:space="preserve">        │</w:t>
-      </w:r>
-    </w:p>
-    <w:p>
-      <w:pPr>
-        <w:rPr>
-          <w:sz w:val="24"/>
-          <w:szCs w:val="24"/>
-        </w:rPr>
-      </w:pPr>
-      <w:r>
-        <w:rPr>
-          <w:sz w:val="24"/>
-          <w:szCs w:val="24"/>
-        </w:rPr>
-        <w:t xml:space="preserve">        </w:t>
-      </w:r>
-      <w:r>
-        <w:rPr>
-          <w:rFonts w:ascii="Arial" w:hAnsi="Arial" w:cs="Arial"/>
-          <w:sz w:val="24"/>
-          <w:szCs w:val="24"/>
-        </w:rPr>
-        <w:t>▼</w:t>
-      </w:r>
-    </w:p>
-    <w:p>
-      <w:pPr>
-        <w:rPr>
-          <w:sz w:val="24"/>
-          <w:szCs w:val="24"/>
-        </w:rPr>
-      </w:pPr>
-      <w:r>
-        <w:rPr>
-          <w:sz w:val="24"/>
-          <w:szCs w:val="24"/>
-        </w:rPr>
-        <w:t>Abro el archivo musicstore.dat</w:t>
-      </w:r>
-    </w:p>
-    <w:p>
-      <w:pPr>
-        <w:rPr>
-          <w:sz w:val="24"/>
-          <w:szCs w:val="24"/>
-        </w:rPr>
-      </w:pPr>
-      <w:r>
-        <w:rPr>
-          <w:sz w:val="24"/>
-          <w:szCs w:val="24"/>
-        </w:rPr>
-        <w:t xml:space="preserve">        │</w:t>
-      </w:r>
-    </w:p>
-    <w:p>
-      <w:pPr>
-        <w:rPr>
-          <w:sz w:val="24"/>
-          <w:szCs w:val="24"/>
-        </w:rPr>
-      </w:pPr>
-      <w:r>
-        <w:rPr>
-          <w:sz w:val="24"/>
-          <w:szCs w:val="24"/>
-        </w:rPr>
-        <w:t xml:space="preserve">        </w:t>
-      </w:r>
-      <w:r>
-        <w:rPr>
-          <w:rFonts w:ascii="Arial" w:hAnsi="Arial" w:cs="Arial"/>
-          <w:sz w:val="24"/>
-          <w:szCs w:val="24"/>
-        </w:rPr>
-        <w:t>▼</w:t>
-      </w:r>
-    </w:p>
-    <w:p>
-      <w:pPr>
-        <w:rPr>
-          <w:sz w:val="24"/>
-          <w:szCs w:val="24"/>
-        </w:rPr>
-      </w:pPr>
+      <w:r>
+        <w:rPr>
+          <w:sz w:val="24"/>
+          <w:szCs w:val="24"/>
+        </w:rPr>
+        <w:t xml:space="preserve"> -&gt; </w:t>
+      </w:r>
+      <w:r>
+        <w:rPr>
+          <w:sz w:val="24"/>
+          <w:szCs w:val="24"/>
+        </w:rPr>
+        <w:t>Abro el archivo musicstore.da</w:t>
+      </w:r>
+      <w:r>
+        <w:rPr>
+          <w:sz w:val="24"/>
+          <w:szCs w:val="24"/>
+        </w:rPr>
+        <w:t xml:space="preserve">t -&gt; </w:t>
+      </w:r>
       <w:r>
         <w:rPr>
           <w:sz w:val="24"/>
@@ -1570,105 +1539,27 @@
         </w:rPr>
         <w:t>Convierto el objeto en bytes</w:t>
       </w:r>
-    </w:p>
-    <w:p>
-      <w:pPr>
-        <w:rPr>
-          <w:sz w:val="24"/>
-          <w:szCs w:val="24"/>
-        </w:rPr>
-      </w:pPr>
-      <w:r>
-        <w:rPr>
-          <w:sz w:val="24"/>
-          <w:szCs w:val="24"/>
-        </w:rPr>
-        <w:t xml:space="preserve">        │</w:t>
-      </w:r>
-    </w:p>
-    <w:p>
-      <w:pPr>
-        <w:rPr>
-          <w:sz w:val="24"/>
-          <w:szCs w:val="24"/>
-        </w:rPr>
-      </w:pPr>
-      <w:r>
-        <w:rPr>
-          <w:sz w:val="24"/>
-          <w:szCs w:val="24"/>
-        </w:rPr>
-        <w:t xml:space="preserve">        </w:t>
-      </w:r>
-      <w:r>
-        <w:rPr>
-          <w:rFonts w:ascii="Arial" w:hAnsi="Arial" w:cs="Arial"/>
-          <w:sz w:val="24"/>
-          <w:szCs w:val="24"/>
-        </w:rPr>
-        <w:t>▼</w:t>
-      </w:r>
-    </w:p>
-    <w:p>
-      <w:pPr>
-        <w:rPr>
-          <w:sz w:val="24"/>
-          <w:szCs w:val="24"/>
-        </w:rPr>
-      </w:pPr>
-      <w:r>
-        <w:rPr>
-          <w:sz w:val="24"/>
-          <w:szCs w:val="24"/>
-        </w:rPr>
-        <w:t>Escribo esos bytes en el archivo</w:t>
-      </w:r>
-    </w:p>
-    <w:p>
-      <w:pPr>
-        <w:rPr>
-          <w:sz w:val="24"/>
-          <w:szCs w:val="24"/>
-        </w:rPr>
-      </w:pPr>
-      <w:r>
-        <w:rPr>
-          <w:sz w:val="24"/>
-          <w:szCs w:val="24"/>
-        </w:rPr>
-        <w:t xml:space="preserve">        │</w:t>
-      </w:r>
-    </w:p>
-    <w:p>
-      <w:pPr>
-        <w:rPr>
-          <w:sz w:val="24"/>
-          <w:szCs w:val="24"/>
-        </w:rPr>
-      </w:pPr>
-      <w:r>
-        <w:rPr>
-          <w:sz w:val="24"/>
-          <w:szCs w:val="24"/>
-        </w:rPr>
-        <w:t xml:space="preserve">        </w:t>
-      </w:r>
-      <w:r>
-        <w:rPr>
-          <w:rFonts w:ascii="Arial" w:hAnsi="Arial" w:cs="Arial"/>
-          <w:sz w:val="24"/>
-          <w:szCs w:val="24"/>
-        </w:rPr>
-        <w:t>▼</w:t>
-      </w:r>
-    </w:p>
-    <w:p>
-      <w:pPr>
-        <w:rPr>
-          <w:sz w:val="24"/>
-          <w:szCs w:val="24"/>
-        </w:rPr>
-      </w:pPr>
+      <w:r>
+        <w:rPr>
+          <w:sz w:val="24"/>
+          <w:szCs w:val="24"/>
+        </w:rPr>
+        <w:t xml:space="preserve"> -&gt; </w:t>
+      </w:r>
+      <w:r>
+        <w:rPr>
+          <w:sz w:val="24"/>
+          <w:szCs w:val="24"/>
+        </w:rPr>
+        <w:t>Escribo esos bytes en el archiv</w:t>
+      </w:r>
+      <w:r>
+        <w:rPr>
+          <w:sz w:val="24"/>
+          <w:szCs w:val="24"/>
+        </w:rPr>
+        <w:t xml:space="preserve">o -&gt; </w:t>
+      </w:r>
       <w:r>
         <w:rPr>
           <w:sz w:val="24"/>
@@ -1700,38 +1591,13 @@
           <w:szCs w:val="24"/>
         </w:rPr>
       </w:pPr>
-    </w:p>
-    <w:p>
-      <w:pPr>
-        <w:rPr>
-          <w:sz w:val="24"/>
-          <w:szCs w:val="24"/>
-        </w:rPr>
-      </w:pPr>
-    </w:p>
-    <w:p>
-      <w:pPr>
-        <w:rPr>
-          <w:sz w:val="24"/>
-          <w:szCs w:val="24"/>
-        </w:rPr>
-      </w:pPr>
-    </w:p>
-    <w:p>
-      <w:pPr>
-        <w:rPr>
-          <w:sz w:val="24"/>
-          <w:szCs w:val="24"/>
-        </w:rPr>
-      </w:pPr>
-    </w:p>
-    <w:p>
-      <w:pPr>
-        <w:rPr>
-          <w:sz w:val="24"/>
-          <w:szCs w:val="24"/>
-        </w:rPr>
-      </w:pPr>
+      <w:r>
+        <w:rPr>
+          <w:sz w:val="24"/>
+          <w:szCs w:val="24"/>
+        </w:rPr>
+        <w:t xml:space="preserve"> </w:t>
+      </w:r>
     </w:p>
     <w:p>
       <w:pPr>
@@ -2072,6 +1938,7 @@
         <w:rPr>
           <w:sz w:val="24"/>
           <w:szCs w:val="24"/>
+          <w:highlight w:val="magenta"/>
         </w:rPr>
         <w:t>En MAIN:</w:t>
       </w:r>
@@ -2088,7 +1955,37 @@
           <w:sz w:val="24"/>
           <w:szCs w:val="24"/>
         </w:rPr>
-        <w:t>FrmLogin login = new FrmLogin(data);</w:t>
+        <w:t xml:space="preserve">FrmLogin login = new FrmLogin(data); </w:t>
+      </w:r>
+      <w:r>
+        <w:rPr>
+          <w:sz w:val="24"/>
+          <w:szCs w:val="24"/>
+          <w:lang w:val="en-US"/>
+        </w:rPr>
+        <w:sym w:font="Wingdings" w:char="F0E0"/>
+      </w:r>
+      <w:r>
+        <w:rPr>
+          <w:sz w:val="24"/>
+          <w:szCs w:val="24"/>
+        </w:rPr>
+        <w:t xml:space="preserve"> Crea el formulario y le entrega los datos del sistema.</w:t>
+      </w:r>
+    </w:p>
+    <w:p>
+      <w:pPr>
+        <w:rPr>
+          <w:sz w:val="24"/>
+          <w:szCs w:val="24"/>
+        </w:rPr>
+      </w:pPr>
+      <w:r>
+        <w:rPr>
+          <w:sz w:val="24"/>
+          <w:szCs w:val="24"/>
+        </w:rPr>
+        <w:t>login.setVisible(true);</w:t>
       </w:r>
       <w:r>
         <w:rPr>
@@ -2101,109 +1998,545 @@
         <w:rPr>
           <w:sz w:val="24"/>
           <w:szCs w:val="24"/>
+        </w:rPr>
+        <w:sym w:font="Wingdings" w:char="F0E0"/>
+      </w:r>
+      <w:r>
+        <w:rPr>
+          <w:sz w:val="24"/>
+          <w:szCs w:val="24"/>
+        </w:rPr>
+        <w:t xml:space="preserve"> </w:t>
+      </w:r>
+      <w:r>
+        <w:rPr>
+          <w:sz w:val="24"/>
+          <w:szCs w:val="24"/>
+        </w:rPr>
+        <w:t>Hace visible el formulario.</w:t>
+      </w:r>
+    </w:p>
+    <w:p>
+      <w:pPr>
+        <w:rPr>
+          <w:sz w:val="24"/>
+          <w:szCs w:val="24"/>
+        </w:rPr>
+      </w:pPr>
+    </w:p>
+    <w:p>
+      <w:pPr>
+        <w:rPr>
+          <w:sz w:val="24"/>
+          <w:szCs w:val="24"/>
+        </w:rPr>
+      </w:pPr>
+      <w:r>
+        <w:rPr>
+          <w:sz w:val="24"/>
+          <w:szCs w:val="24"/>
+        </w:rPr>
+        <w:t xml:space="preserve">La clase </w:t>
+      </w:r>
+      <w:r>
+        <w:rPr>
+          <w:b/>
+          <w:bCs/>
+          <w:sz w:val="24"/>
+          <w:szCs w:val="24"/>
+        </w:rPr>
+        <w:t>Main</w:t>
+      </w:r>
+      <w:r>
+        <w:rPr>
+          <w:sz w:val="24"/>
+          <w:szCs w:val="24"/>
+        </w:rPr>
+        <w:t xml:space="preserve"> es el punto de entrada de la aplicación. Su responsabilidad es inicializar el sistema, cargando los datos almacenados mediante la clase Persistencia. En la primera ejecución verifica si existe al menos un usuario registrado; de no ser así, crea automáticamente un usuario administrador por defecto y guarda la información. Finalmente, instancia y muestra el formulario de inicio de sesión (FrmLogin), dando comienzo a la interacción con el usuario.</w:t>
+      </w:r>
+    </w:p>
+    <w:p>
+      <w:pPr>
+        <w:rPr>
+          <w:sz w:val="24"/>
+          <w:szCs w:val="24"/>
+        </w:rPr>
+      </w:pPr>
+      <w:r>
+        <w:rPr>
+          <w:sz w:val="24"/>
+          <w:szCs w:val="24"/>
+        </w:rPr>
+        <w:t>----------------------------------------------------------------------------------------------------------------------------------------------</w:t>
+      </w:r>
+    </w:p>
+    <w:p>
+      <w:pPr>
+        <w:rPr>
+          <w:b/>
+          <w:bCs/>
+          <w:sz w:val="24"/>
+          <w:szCs w:val="24"/>
+        </w:rPr>
+      </w:pPr>
+      <w:r>
+        <w:rPr>
+          <w:b/>
+          <w:bCs/>
+          <w:sz w:val="24"/>
+          <w:szCs w:val="24"/>
+          <w:highlight w:val="magenta"/>
+        </w:rPr>
+        <w:t>Clase UsuarioServicio</w:t>
+      </w:r>
+    </w:p>
+    <w:p>
+      <w:pPr>
+        <w:rPr>
+          <w:sz w:val="24"/>
+          <w:szCs w:val="24"/>
+        </w:rPr>
+      </w:pPr>
+      <w:r>
+        <w:rPr>
+          <w:sz w:val="24"/>
+          <w:szCs w:val="24"/>
+        </w:rPr>
+        <w:t xml:space="preserve">La clase </w:t>
+      </w:r>
+      <w:r>
+        <w:rPr>
+          <w:b/>
+          <w:bCs/>
+          <w:sz w:val="24"/>
+          <w:szCs w:val="24"/>
+        </w:rPr>
+        <w:t>UsuarioServicio</w:t>
+      </w:r>
+      <w:r>
+        <w:rPr>
+          <w:sz w:val="24"/>
+          <w:szCs w:val="24"/>
+        </w:rPr>
+        <w:t xml:space="preserve"> concentra la lógica de negocio relacionada con los usuarios del sistema. Actualmente implementa el proceso de autenticación, validando que el nombre de usuario y la contraseña ingresados coincidan con un usuario registrado. De esta forma, separa la lógica de validación de la interfaz gráfica, facilitando el mantenimiento y la reutilización del código.</w:t>
+      </w:r>
+    </w:p>
+    <w:p>
+      <w:pPr>
+        <w:rPr>
+          <w:sz w:val="24"/>
+          <w:szCs w:val="24"/>
+        </w:rPr>
+      </w:pPr>
+      <w:r>
+        <w:rPr>
+          <w:sz w:val="24"/>
+          <w:szCs w:val="24"/>
+        </w:rPr>
+        <w:t>----------------------------------------------------------------------------------------------------------------------------------------------</w:t>
+      </w:r>
+    </w:p>
+    <w:p>
+      <w:pPr>
+        <w:rPr>
+          <w:b/>
+          <w:bCs/>
+          <w:sz w:val="24"/>
+          <w:szCs w:val="24"/>
+        </w:rPr>
+      </w:pPr>
+    </w:p>
+    <w:p>
+      <w:pPr>
+        <w:rPr>
+          <w:b/>
+          <w:bCs/>
+          <w:sz w:val="24"/>
+          <w:szCs w:val="24"/>
+        </w:rPr>
+      </w:pPr>
+      <w:r>
+        <w:rPr>
+          <w:b/>
+          <w:bCs/>
+          <w:sz w:val="24"/>
+          <w:szCs w:val="24"/>
+          <w:highlight w:val="magenta"/>
+        </w:rPr>
+        <w:lastRenderedPageBreak/>
+        <w:t>Clase FrmLogin</w:t>
+      </w:r>
+    </w:p>
+    <w:p>
+      <w:pPr>
+        <w:rPr>
+          <w:sz w:val="24"/>
+          <w:szCs w:val="24"/>
+        </w:rPr>
+      </w:pPr>
+      <w:r>
+        <w:rPr>
+          <w:sz w:val="24"/>
+          <w:szCs w:val="24"/>
+        </w:rPr>
+        <w:t xml:space="preserve">La clase </w:t>
+      </w:r>
+      <w:r>
+        <w:rPr>
+          <w:b/>
+          <w:bCs/>
+          <w:sz w:val="24"/>
+          <w:szCs w:val="24"/>
+        </w:rPr>
+        <w:t>FrmLogin</w:t>
+      </w:r>
+      <w:r>
+        <w:rPr>
+          <w:sz w:val="24"/>
+          <w:szCs w:val="24"/>
+        </w:rPr>
+        <w:t xml:space="preserve"> representa la interfaz gráfica de inicio de sesión del sistema. Su función es solicitar al usuario el nombre de usuario y la contraseña, obtener la información ingresada y delegar la validación a la clase UsuarioServicio. Según el resultado de la autenticación, informa si el acceso fue exitoso o si las credenciales ingresadas son incorrectas. Esta clase pertenece a la capa de presentación y no contiene lógica de negocio.</w:t>
+      </w:r>
+    </w:p>
+    <w:p>
+      <w:pPr>
+        <w:rPr>
+          <w:sz w:val="24"/>
+          <w:szCs w:val="24"/>
+        </w:rPr>
+      </w:pPr>
+      <w:r>
+        <w:rPr>
+          <w:sz w:val="24"/>
+          <w:szCs w:val="24"/>
+        </w:rPr>
+        <w:t>----------------------------------------------------------------------------------------------------------------------------------------------</w:t>
+      </w:r>
+    </w:p>
+    <w:p>
+      <w:pPr>
+        <w:rPr>
+          <w:sz w:val="28"/>
+          <w:szCs w:val="28"/>
+        </w:rPr>
+      </w:pPr>
+      <w:r>
+        <w:rPr>
+          <w:sz w:val="28"/>
+          <w:szCs w:val="28"/>
+          <w:highlight w:val="yellow"/>
+        </w:rPr>
+        <w:t>¿Qué necesita FrmPrincipal?</w:t>
+      </w:r>
+    </w:p>
+    <w:p>
+      <w:r>
+        <w:t>public FrmPrincipal(Data data, Usuario usuario)</w:t>
+      </w:r>
+    </w:p>
+    <w:p>
+      <w:r>
+        <w:t>Porque más adelante:</w:t>
+      </w:r>
+    </w:p>
+    <w:p>
+      <w:pPr>
+        <w:numPr>
+          <w:ilvl w:val="0"/>
+          <w:numId w:val="9"/>
+        </w:numPr>
+      </w:pPr>
+      <w:r>
+        <w:t>abrirá los ABM usando data</w:t>
+      </w:r>
+      <w:r>
+        <w:t>.</w:t>
+      </w:r>
+    </w:p>
+    <w:p>
+      <w:pPr>
+        <w:numPr>
+          <w:ilvl w:val="0"/>
+          <w:numId w:val="9"/>
+        </w:numPr>
+      </w:pPr>
+      <w:r>
+        <w:t>mostrará el nombre del usuario conectado.</w:t>
+      </w:r>
+    </w:p>
+    <w:p>
+      <w:r>
+        <w:t xml:space="preserve">Main </w:t>
+      </w:r>
+      <w:r>
+        <w:sym w:font="Wingdings" w:char="F0E0"/>
+      </w:r>
+      <w:r>
+        <w:t xml:space="preserve"> FrmLogin(Data) </w:t>
+      </w:r>
+      <w:r>
+        <w:sym w:font="Wingdings" w:char="F0E0"/>
+      </w:r>
+      <w:r>
+        <w:t xml:space="preserve"> UsuarioServicio </w:t>
+      </w:r>
+      <w:r>
+        <w:sym w:font="Wingdings" w:char="F0E0"/>
+      </w:r>
+      <w:r>
+        <w:t xml:space="preserve"> Usuario válido </w:t>
+      </w:r>
+      <w:r>
+        <w:sym w:font="Wingdings" w:char="F0E0"/>
+      </w:r>
+      <w:r>
+        <w:t xml:space="preserve"> FrmPrincipal(Data, Usuario)</w:t>
+      </w:r>
+    </w:p>
+    <w:p/>
+    <w:p>
+      <w:r>
+        <w:t>-----------------------------------------------------------------------------------------------------------------------------------------------------------</w:t>
+      </w:r>
+    </w:p>
+    <w:p>
+      <w:pPr>
+        <w:rPr>
+          <w:sz w:val="28"/>
+          <w:szCs w:val="28"/>
+        </w:rPr>
+      </w:pPr>
+      <w:r>
+        <w:tab/>
+      </w:r>
+      <w:r>
+        <w:tab/>
+      </w:r>
+      <w:r>
+        <w:tab/>
+      </w:r>
+      <w:r>
+        <w:tab/>
+      </w:r>
+      <w:r>
+        <w:tab/>
+      </w:r>
+      <w:r>
+        <w:tab/>
+        <w:t xml:space="preserve">          </w:t>
+      </w:r>
+      <w:r>
+        <w:rPr>
+          <w:sz w:val="28"/>
+          <w:szCs w:val="28"/>
+          <w:highlight w:val="cyan"/>
+        </w:rPr>
+        <w:t>ABM</w:t>
+      </w:r>
+    </w:p>
+    <w:p>
+      <w:r>
+        <w:rPr>
+          <w:u w:val="single" w:color="00B0F0"/>
+        </w:rPr>
+        <w:t>Ejemplo ABM Categorías</w:t>
+      </w:r>
+      <w:r>
+        <w:t>:</w:t>
+      </w:r>
+    </w:p>
+    <w:p>
+      <w:r>
+        <w:t>public boolean agregar(Categoria categoria) {</w:t>
+      </w:r>
+    </w:p>
+    <w:p>
+      <w:r>
+        <w:t>}</w:t>
+      </w:r>
+    </w:p>
+    <w:p>
+      <w:r>
+        <w:t>Recibe un objeto Categoria y devuelve:</w:t>
+      </w:r>
+    </w:p>
+    <w:p>
+      <w:pPr>
+        <w:numPr>
+          <w:ilvl w:val="0"/>
+          <w:numId w:val="10"/>
+        </w:numPr>
+      </w:pPr>
+      <w:r>
+        <w:t xml:space="preserve">true → si pudo agregarla. </w:t>
+      </w:r>
+    </w:p>
+    <w:p>
+      <w:pPr>
+        <w:numPr>
+          <w:ilvl w:val="0"/>
+          <w:numId w:val="10"/>
+        </w:numPr>
+      </w:pPr>
+      <w:r>
+        <w:t>false → si ya existía una categoría con ese ID.</w:t>
+      </w:r>
+    </w:p>
+    <w:p/>
+    <w:p>
+      <w:pPr>
+        <w:rPr>
+          <w:b/>
+          <w:bCs/>
+        </w:rPr>
+      </w:pPr>
+      <w:r>
+        <w:rPr>
+          <w:b/>
+          <w:bCs/>
+          <w:u w:val="single" w:color="00B0F0"/>
+        </w:rPr>
+        <w:t>Antes de agregar</w:t>
+      </w:r>
+      <w:r>
+        <w:rPr>
+          <w:b/>
+          <w:bCs/>
+        </w:rPr>
+        <w:t>...</w:t>
+      </w:r>
+    </w:p>
+    <w:p>
+      <w:r>
+        <w:t>Tenemos que verificar que el ID no exista.</w:t>
+      </w:r>
+    </w:p>
+    <w:p>
+      <w:r>
+        <w:t>¿Cómo?</w:t>
+      </w:r>
+      <w:r>
+        <w:t xml:space="preserve"> </w:t>
+      </w:r>
+      <w:r>
+        <w:rPr>
+          <w:color w:val="00B0F0"/>
+        </w:rPr>
+        <w:sym w:font="Wingdings" w:char="F0E0"/>
+      </w:r>
+      <w:r>
+        <w:t xml:space="preserve"> </w:t>
+      </w:r>
+      <w:r>
+        <w:t>Recorriendo la lista de categorías.</w:t>
+      </w:r>
+    </w:p>
+    <w:p>
+      <w:pPr>
+        <w:rPr>
           <w:lang w:val="en-US"/>
         </w:rPr>
-        <w:sym w:font="Wingdings" w:char="F0E0"/>
-      </w:r>
-      <w:r>
-        <w:rPr>
-          <w:sz w:val="24"/>
-          <w:szCs w:val="24"/>
-        </w:rPr>
-        <w:t xml:space="preserve"> </w:t>
-      </w:r>
-      <w:r>
-        <w:rPr>
-          <w:sz w:val="24"/>
-          <w:szCs w:val="24"/>
-        </w:rPr>
-        <w:t>Crea el formulario y le entrega los datos del sistema.</w:t>
-      </w:r>
-    </w:p>
-    <w:p>
-      <w:pPr>
-        <w:rPr>
-          <w:sz w:val="24"/>
-          <w:szCs w:val="24"/>
-        </w:rPr>
-      </w:pPr>
-      <w:r>
-        <w:rPr>
-          <w:sz w:val="24"/>
-          <w:szCs w:val="24"/>
-        </w:rPr>
-        <w:t>login.setLocationRelativeTo(null);</w:t>
-      </w:r>
-      <w:r>
-        <w:rPr>
-          <w:sz w:val="24"/>
-          <w:szCs w:val="24"/>
-        </w:rPr>
-        <w:t xml:space="preserve"> </w:t>
-      </w:r>
-      <w:r>
-        <w:rPr>
-          <w:sz w:val="24"/>
-          <w:szCs w:val="24"/>
-        </w:rPr>
-        <w:sym w:font="Wingdings" w:char="F0E0"/>
-      </w:r>
-      <w:r>
-        <w:rPr>
-          <w:sz w:val="24"/>
-          <w:szCs w:val="24"/>
-        </w:rPr>
-        <w:t xml:space="preserve"> </w:t>
-      </w:r>
-      <w:r>
-        <w:rPr>
-          <w:sz w:val="24"/>
-          <w:szCs w:val="24"/>
-        </w:rPr>
-        <w:t>Centra la ventana en la pantalla.</w:t>
-      </w:r>
-    </w:p>
-    <w:p>
-      <w:pPr>
-        <w:rPr>
-          <w:sz w:val="24"/>
-          <w:szCs w:val="24"/>
-        </w:rPr>
-      </w:pPr>
-      <w:r>
-        <w:rPr>
-          <w:sz w:val="24"/>
-          <w:szCs w:val="24"/>
-        </w:rPr>
-        <w:t>login.setVisible(true);</w:t>
-      </w:r>
-      <w:r>
-        <w:rPr>
-          <w:sz w:val="24"/>
-          <w:szCs w:val="24"/>
-        </w:rPr>
-        <w:t xml:space="preserve"> </w:t>
-      </w:r>
-      <w:r>
-        <w:rPr>
-          <w:sz w:val="24"/>
-          <w:szCs w:val="24"/>
-        </w:rPr>
-        <w:sym w:font="Wingdings" w:char="F0E0"/>
-      </w:r>
-      <w:r>
-        <w:rPr>
-          <w:sz w:val="24"/>
-          <w:szCs w:val="24"/>
-        </w:rPr>
-        <w:t xml:space="preserve"> </w:t>
-      </w:r>
-      <w:r>
-        <w:rPr>
-          <w:sz w:val="24"/>
-          <w:szCs w:val="24"/>
-        </w:rPr>
-        <w:t>Hace visible el formulario.</w:t>
+      </w:pPr>
+      <w:r>
+        <w:rPr>
+          <w:lang w:val="en-US"/>
+        </w:rPr>
+        <w:t>for (Categoria c : data.getCategorias()) {</w:t>
+      </w:r>
+    </w:p>
+    <w:p>
+      <w:pPr>
+        <w:rPr>
+          <w:lang w:val="en-US"/>
+        </w:rPr>
+      </w:pPr>
+      <w:r>
+        <w:rPr>
+          <w:lang w:val="en-US"/>
+        </w:rPr>
+        <w:t xml:space="preserve">       </w:t>
+      </w:r>
+      <w:r>
+        <w:rPr>
+          <w:lang w:val="en-US"/>
+        </w:rPr>
+        <w:t>if (c.getId() == categoria.getId()) {</w:t>
+      </w:r>
+      <w:r>
+        <w:rPr>
+          <w:lang w:val="en-US"/>
+        </w:rPr>
+        <w:br/>
+      </w:r>
+      <w:r>
+        <w:rPr>
+          <w:lang w:val="en-US"/>
+        </w:rPr>
+        <w:tab/>
+      </w:r>
+      <w:r>
+        <w:rPr>
+          <w:lang w:val="en-US"/>
+        </w:rPr>
+        <w:t>return false;</w:t>
+      </w:r>
+      <w:r>
+        <w:rPr>
+          <w:lang w:val="en-US"/>
+        </w:rPr>
+        <w:br/>
+        <w:t>}</w:t>
+      </w:r>
+    </w:p>
+    <w:p>
+      <w:pPr>
+        <w:rPr>
+          <w:u w:val="single"/>
+          <w:lang w:val="en-US"/>
+        </w:rPr>
+      </w:pPr>
+      <w:r>
+        <w:rPr>
+          <w:lang w:val="en-US"/>
+        </w:rPr>
+        <w:t>data.getCategorias().add(categoria);</w:t>
+      </w:r>
+    </w:p>
+    <w:p>
+      <w:pPr>
+        <w:rPr>
+          <w:u w:val="single"/>
+          <w:lang w:val="en-US"/>
+        </w:rPr>
+      </w:pPr>
+      <w:r>
+        <w:rPr>
+          <w:lang w:val="en-US"/>
+        </w:rPr>
+        <w:t>Persistencia.guardar(data);</w:t>
+      </w:r>
+    </w:p>
+    <w:p>
+      <w:pPr>
+        <w:rPr>
+          <w:lang w:val="en-US"/>
+        </w:rPr>
+      </w:pPr>
+      <w:r>
+        <w:rPr>
+          <w:lang w:val="en-US"/>
+        </w:rPr>
+        <w:t>return true;</w:t>
+      </w:r>
+    </w:p>
+    <w:p>
+      <w:r>
+        <w:t>}</w:t>
+      </w:r>
+    </w:p>
+    <w:p>
+      <w:r>
+        <w:t>Comparamos los enteros con == para ver si ya existe un ID registrado igual al ingresado, si existe retorna false, si no existe sale del bucle, se guarda y retorna true.</w:t>
       </w:r>
     </w:p>
     <w:sectPr>
@@ -2517,6 +2850,155 @@
     </w:lvl>
   </w:abstractNum>
   <w:abstractNum w:abstractNumId="2" w15:restartNumberingAfterBreak="0">
+    <w:nsid w:val="2E08323C"/>
+    <w:multiLevelType w:val="multilevel"/>
+    <w:tmpl w:val="AFAAB058"/>
+    <w:lvl w:ilvl="0">
+      <w:start w:val="1"/>
+      <w:numFmt w:val="bullet"/>
+      <w:lvlText w:val=""/>
+      <w:lvlJc w:val="left"/>
+      <w:pPr>
+        <w:tabs>
+          <w:tab w:val="num" w:pos="720"/>
+        </w:tabs>
+        <w:ind w:left="720" w:hanging="360"/>
+      </w:pPr>
+      <w:rPr>
+        <w:rFonts w:ascii="Symbol" w:hAnsi="Symbol" w:hint="default"/>
+        <w:sz w:val="20"/>
+      </w:rPr>
+    </w:lvl>
+    <w:lvl w:ilvl="1" w:tentative="1">
+      <w:start w:val="1"/>
+      <w:numFmt w:val="bullet"/>
+      <w:lvlText w:val="o"/>
+      <w:lvlJc w:val="left"/>
+      <w:pPr>
+        <w:tabs>
+          <w:tab w:val="num" w:pos="1440"/>
+        </w:tabs>
+        <w:ind w:left="1440" w:hanging="360"/>
+      </w:pPr>
+      <w:rPr>
+        <w:rFonts w:ascii="Courier New" w:hAnsi="Courier New" w:hint="default"/>
+        <w:sz w:val="20"/>
+      </w:rPr>
+    </w:lvl>
+    <w:lvl w:ilvl="2" w:tentative="1">
+      <w:start w:val="1"/>
+      <w:numFmt w:val="bullet"/>
+      <w:lvlText w:val=""/>
+      <w:lvlJc w:val="left"/>
+      <w:pPr>
+        <w:tabs>
+          <w:tab w:val="num" w:pos="2160"/>
+        </w:tabs>
+        <w:ind w:left="2160" w:hanging="360"/>
+      </w:pPr>
+      <w:rPr>
+        <w:rFonts w:ascii="Wingdings" w:hAnsi="Wingdings" w:hint="default"/>
+        <w:sz w:val="20"/>
+      </w:rPr>
+    </w:lvl>
+    <w:lvl w:ilvl="3" w:tentative="1">
+      <w:start w:val="1"/>
+      <w:numFmt w:val="bullet"/>
+      <w:lvlText w:val=""/>
+      <w:lvlJc w:val="left"/>
+      <w:pPr>
+        <w:tabs>
+          <w:tab w:val="num" w:pos="2880"/>
+        </w:tabs>
+        <w:ind w:left="2880" w:hanging="360"/>
+      </w:pPr>
+      <w:rPr>
+        <w:rFonts w:ascii="Wingdings" w:hAnsi="Wingdings" w:hint="default"/>
+        <w:sz w:val="20"/>
+      </w:rPr>
+    </w:lvl>
+    <w:lvl w:ilvl="4" w:tentative="1">
+      <w:start w:val="1"/>
+      <w:numFmt w:val="bullet"/>
+      <w:lvlText w:val=""/>
+      <w:lvlJc w:val="left"/>
+      <w:pPr>
+        <w:tabs>
+          <w:tab w:val="num" w:pos="3600"/>
+        </w:tabs>
+        <w:ind w:left="3600" w:hanging="360"/>
+      </w:pPr>
+      <w:rPr>
+        <w:rFonts w:ascii="Wingdings" w:hAnsi="Wingdings" w:hint="default"/>
+        <w:sz w:val="20"/>
+      </w:rPr>
+    </w:lvl>
+    <w:lvl w:ilvl="5" w:tentative="1">
+      <w:start w:val="1"/>
+      <w:numFmt w:val="bullet"/>
+      <w:lvlText w:val=""/>
+      <w:lvlJc w:val="left"/>
+      <w:pPr>
+        <w:tabs>
+          <w:tab w:val="num" w:pos="4320"/>
+        </w:tabs>
+        <w:ind w:left="4320" w:hanging="360"/>
+      </w:pPr>
+      <w:rPr>
+        <w:rFonts w:ascii="Wingdings" w:hAnsi="Wingdings" w:hint="default"/>
+        <w:sz w:val="20"/>
+      </w:rPr>
+    </w:lvl>
+    <w:lvl w:ilvl="6" w:tentative="1">
+      <w:start w:val="1"/>
+      <w:numFmt w:val="bullet"/>
+      <w:lvlText w:val=""/>
+      <w:lvlJc w:val="left"/>
+      <w:pPr>
+        <w:tabs>
+          <w:tab w:val="num" w:pos="5040"/>
+        </w:tabs>
+        <w:ind w:left="5040" w:hanging="360"/>
+      </w:pPr>
+      <w:rPr>
+        <w:rFonts w:ascii="Wingdings" w:hAnsi="Wingdings" w:hint="default"/>
+        <w:sz w:val="20"/>
+      </w:rPr>
+    </w:lvl>
+    <w:lvl w:ilvl="7" w:tentative="1">
+      <w:start w:val="1"/>
+      <w:numFmt w:val="bullet"/>
+      <w:lvlText w:val=""/>
+      <w:lvlJc w:val="left"/>
+      <w:pPr>
+        <w:tabs>
+          <w:tab w:val="num" w:pos="5760"/>
+        </w:tabs>
+        <w:ind w:left="5760" w:hanging="360"/>
+      </w:pPr>
+      <w:rPr>
+        <w:rFonts w:ascii="Wingdings" w:hAnsi="Wingdings" w:hint="default"/>
+        <w:sz w:val="20"/>
+      </w:rPr>
+    </w:lvl>
+    <w:lvl w:ilvl="8" w:tentative="1">
+      <w:start w:val="1"/>
+      <w:numFmt w:val="bullet"/>
+      <w:lvlText w:val=""/>
+      <w:lvlJc w:val="left"/>
+      <w:pPr>
+        <w:tabs>
+          <w:tab w:val="num" w:pos="6480"/>
+        </w:tabs>
+        <w:ind w:left="6480" w:hanging="360"/>
+      </w:pPr>
+      <w:rPr>
+        <w:rFonts w:ascii="Wingdings" w:hAnsi="Wingdings" w:hint="default"/>
+        <w:sz w:val="20"/>
+      </w:rPr>
+    </w:lvl>
+  </w:abstractNum>
+  <w:abstractNum w:abstractNumId="3" w15:restartNumberingAfterBreak="0">
     <w:nsid w:val="342C4ACE"/>
     <w:multiLevelType w:val="multilevel"/>
     <w:tmpl w:val="1646E12C"/>
@@ -2665,7 +3147,7 @@
       </w:rPr>
     </w:lvl>
   </w:abstractNum>
-  <w:abstractNum w:abstractNumId="3" w15:restartNumberingAfterBreak="0">
+  <w:abstractNum w:abstractNumId="4" w15:restartNumberingAfterBreak="0">
     <w:nsid w:val="3A0646E3"/>
     <w:multiLevelType w:val="multilevel"/>
     <w:tmpl w:val="917A7900"/>
@@ -2814,7 +3296,7 @@
       </w:rPr>
     </w:lvl>
   </w:abstractNum>
-  <w:abstractNum w:abstractNumId="4" w15:restartNumberingAfterBreak="0">
+  <w:abstractNum w:abstractNumId="5" w15:restartNumberingAfterBreak="0">
     <w:nsid w:val="445D7695"/>
     <w:multiLevelType w:val="multilevel"/>
     <w:tmpl w:val="100E4850"/>
@@ -2963,7 +3445,7 @@
       </w:rPr>
     </w:lvl>
   </w:abstractNum>
-  <w:abstractNum w:abstractNumId="5" w15:restartNumberingAfterBreak="0">
+  <w:abstractNum w:abstractNumId="6" w15:restartNumberingAfterBreak="0">
     <w:nsid w:val="46B14014"/>
     <w:multiLevelType w:val="multilevel"/>
     <w:tmpl w:val="9E2EF664"/>
@@ -3108,7 +3590,7 @@
       </w:rPr>
     </w:lvl>
   </w:abstractNum>
-  <w:abstractNum w:abstractNumId="6" w15:restartNumberingAfterBreak="0">
+  <w:abstractNum w:abstractNumId="7" w15:restartNumberingAfterBreak="0">
     <w:nsid w:val="4B6F3692"/>
     <w:multiLevelType w:val="multilevel"/>
     <w:tmpl w:val="8290525E"/>
@@ -3257,7 +3739,7 @@
       </w:rPr>
     </w:lvl>
   </w:abstractNum>
-  <w:abstractNum w:abstractNumId="7" w15:restartNumberingAfterBreak="0">
+  <w:abstractNum w:abstractNumId="8" w15:restartNumberingAfterBreak="0">
     <w:nsid w:val="60736DEF"/>
     <w:multiLevelType w:val="multilevel"/>
     <w:tmpl w:val="90F8F976"/>
@@ -3406,20 +3888,170 @@
       </w:rPr>
     </w:lvl>
   </w:abstractNum>
+  <w:abstractNum w:abstractNumId="9" w15:restartNumberingAfterBreak="0">
+    <w:nsid w:val="65437A14"/>
+    <w:multiLevelType w:val="multilevel"/>
+    <w:tmpl w:val="0AFA7890"/>
+    <w:lvl w:ilvl="0">
+      <w:start w:val="1"/>
+      <w:numFmt w:val="bullet"/>
+      <w:lvlText w:val=""/>
+      <w:lvlJc w:val="left"/>
+      <w:pPr>
+        <w:tabs>
+          <w:tab w:val="num" w:pos="720"/>
+        </w:tabs>
+        <w:ind w:left="720" w:hanging="360"/>
+      </w:pPr>
+      <w:rPr>
+        <w:rFonts w:ascii="Symbol" w:hAnsi="Symbol" w:hint="default"/>
+        <w:color w:val="00B0F0"/>
+        <w:sz w:val="20"/>
+      </w:rPr>
+    </w:lvl>
+    <w:lvl w:ilvl="1" w:tentative="1">
+      <w:start w:val="1"/>
+      <w:numFmt w:val="bullet"/>
+      <w:lvlText w:val="o"/>
+      <w:lvlJc w:val="left"/>
+      <w:pPr>
+        <w:tabs>
+          <w:tab w:val="num" w:pos="1440"/>
+        </w:tabs>
+        <w:ind w:left="1440" w:hanging="360"/>
+      </w:pPr>
+      <w:rPr>
+        <w:rFonts w:ascii="Courier New" w:hAnsi="Courier New" w:hint="default"/>
+        <w:sz w:val="20"/>
+      </w:rPr>
+    </w:lvl>
+    <w:lvl w:ilvl="2" w:tentative="1">
+      <w:start w:val="1"/>
+      <w:numFmt w:val="bullet"/>
+      <w:lvlText w:val=""/>
+      <w:lvlJc w:val="left"/>
+      <w:pPr>
+        <w:tabs>
+          <w:tab w:val="num" w:pos="2160"/>
+        </w:tabs>
+        <w:ind w:left="2160" w:hanging="360"/>
+      </w:pPr>
+      <w:rPr>
+        <w:rFonts w:ascii="Wingdings" w:hAnsi="Wingdings" w:hint="default"/>
+        <w:sz w:val="20"/>
+      </w:rPr>
+    </w:lvl>
+    <w:lvl w:ilvl="3" w:tentative="1">
+      <w:start w:val="1"/>
+      <w:numFmt w:val="bullet"/>
+      <w:lvlText w:val=""/>
+      <w:lvlJc w:val="left"/>
+      <w:pPr>
+        <w:tabs>
+          <w:tab w:val="num" w:pos="2880"/>
+        </w:tabs>
+        <w:ind w:left="2880" w:hanging="360"/>
+      </w:pPr>
+      <w:rPr>
+        <w:rFonts w:ascii="Wingdings" w:hAnsi="Wingdings" w:hint="default"/>
+        <w:sz w:val="20"/>
+      </w:rPr>
+    </w:lvl>
+    <w:lvl w:ilvl="4" w:tentative="1">
+      <w:start w:val="1"/>
+      <w:numFmt w:val="bullet"/>
+      <w:lvlText w:val=""/>
+      <w:lvlJc w:val="left"/>
+      <w:pPr>
+        <w:tabs>
+          <w:tab w:val="num" w:pos="3600"/>
+        </w:tabs>
+        <w:ind w:left="3600" w:hanging="360"/>
+      </w:pPr>
+      <w:rPr>
+        <w:rFonts w:ascii="Wingdings" w:hAnsi="Wingdings" w:hint="default"/>
+        <w:sz w:val="20"/>
+      </w:rPr>
+    </w:lvl>
+    <w:lvl w:ilvl="5" w:tentative="1">
+      <w:start w:val="1"/>
+      <w:numFmt w:val="bullet"/>
+      <w:lvlText w:val=""/>
+      <w:lvlJc w:val="left"/>
+      <w:pPr>
+        <w:tabs>
+          <w:tab w:val="num" w:pos="4320"/>
+        </w:tabs>
+        <w:ind w:left="4320" w:hanging="360"/>
+      </w:pPr>
+      <w:rPr>
+        <w:rFonts w:ascii="Wingdings" w:hAnsi="Wingdings" w:hint="default"/>
+        <w:sz w:val="20"/>
+      </w:rPr>
+    </w:lvl>
+    <w:lvl w:ilvl="6" w:tentative="1">
+      <w:start w:val="1"/>
+      <w:numFmt w:val="bullet"/>
+      <w:lvlText w:val=""/>
+      <w:lvlJc w:val="left"/>
+      <w:pPr>
+        <w:tabs>
+          <w:tab w:val="num" w:pos="5040"/>
+        </w:tabs>
+        <w:ind w:left="5040" w:hanging="360"/>
+      </w:pPr>
+      <w:rPr>
+        <w:rFonts w:ascii="Wingdings" w:hAnsi="Wingdings" w:hint="default"/>
+        <w:sz w:val="20"/>
+      </w:rPr>
+    </w:lvl>
+    <w:lvl w:ilvl="7" w:tentative="1">
+      <w:start w:val="1"/>
+      <w:numFmt w:val="bullet"/>
+      <w:lvlText w:val=""/>
+      <w:lvlJc w:val="left"/>
+      <w:pPr>
+        <w:tabs>
+          <w:tab w:val="num" w:pos="5760"/>
+        </w:tabs>
+        <w:ind w:left="5760" w:hanging="360"/>
+      </w:pPr>
+      <w:rPr>
+        <w:rFonts w:ascii="Wingdings" w:hAnsi="Wingdings" w:hint="default"/>
+        <w:sz w:val="20"/>
+      </w:rPr>
+    </w:lvl>
+    <w:lvl w:ilvl="8" w:tentative="1">
+      <w:start w:val="1"/>
+      <w:numFmt w:val="bullet"/>
+      <w:lvlText w:val=""/>
+      <w:lvlJc w:val="left"/>
+      <w:pPr>
+        <w:tabs>
+          <w:tab w:val="num" w:pos="6480"/>
+        </w:tabs>
+        <w:ind w:left="6480" w:hanging="360"/>
+      </w:pPr>
+      <w:rPr>
+        <w:rFonts w:ascii="Wingdings" w:hAnsi="Wingdings" w:hint="default"/>
+        <w:sz w:val="20"/>
+      </w:rPr>
+    </w:lvl>
+  </w:abstractNum>
   <w:num w:numId="1" w16cid:durableId="1049961354">
-    <w:abstractNumId w:val="4"/>
+    <w:abstractNumId w:val="5"/>
   </w:num>
   <w:num w:numId="2" w16cid:durableId="1438983142">
-    <w:abstractNumId w:val="7"/>
+    <w:abstractNumId w:val="8"/>
   </w:num>
   <w:num w:numId="3" w16cid:durableId="1080371069">
-    <w:abstractNumId w:val="5"/>
+    <w:abstractNumId w:val="6"/>
   </w:num>
   <w:num w:numId="4" w16cid:durableId="1988321102">
-    <w:abstractNumId w:val="2"/>
+    <w:abstractNumId w:val="3"/>
   </w:num>
   <w:num w:numId="5" w16cid:durableId="878123686">
-    <w:abstractNumId w:val="3"/>
+    <w:abstractNumId w:val="4"/>
   </w:num>
   <w:num w:numId="6" w16cid:durableId="2042976483">
     <w:abstractNumId w:val="1"/>
@@ -3428,7 +4060,13 @@
     <w:abstractNumId w:val="0"/>
   </w:num>
   <w:num w:numId="8" w16cid:durableId="475074607">
-    <w:abstractNumId w:val="6"/>
+    <w:abstractNumId w:val="7"/>
+  </w:num>
+  <w:num w:numId="9" w16cid:durableId="1270971527">
+    <w:abstractNumId w:val="2"/>
+  </w:num>
+  <w:num w:numId="10" w16cid:durableId="664962">
+    <w:abstractNumId w:val="9"/>
   </w:num>
 </w:numbering>
 </file>

</xml_diff>

<commit_message>
Implemente modulo de Reportes y Ventas. Sistema finalizado
</commit_message>
<xml_diff>
--- a/MusicStore.docx
+++ b/MusicStore.docx
@@ -23,405 +23,11 @@
       </w:r>
     </w:p>
     <w:p>
-      <w:r>
-        <w:t>Entidades/Clases:</w:t>
-      </w:r>
-    </w:p>
-    <w:p>
-      <w:r>
-        <w:t>Usuario</w:t>
-      </w:r>
-    </w:p>
-    <w:p>
-      <w:pPr>
-        <w:numPr>
-          <w:ilvl w:val="0"/>
-          <w:numId w:val="1"/>
-        </w:numPr>
-      </w:pPr>
-      <w:r>
-        <w:t xml:space="preserve">id </w:t>
-      </w:r>
-    </w:p>
-    <w:p>
-      <w:pPr>
-        <w:numPr>
-          <w:ilvl w:val="0"/>
-          <w:numId w:val="1"/>
-        </w:numPr>
-      </w:pPr>
-      <w:r>
-        <w:t xml:space="preserve">nombre </w:t>
-      </w:r>
-    </w:p>
-    <w:p>
-      <w:pPr>
-        <w:numPr>
-          <w:ilvl w:val="0"/>
-          <w:numId w:val="1"/>
-        </w:numPr>
-      </w:pPr>
-      <w:r>
-        <w:t xml:space="preserve">apellido </w:t>
-      </w:r>
-    </w:p>
-    <w:p>
-      <w:pPr>
-        <w:numPr>
-          <w:ilvl w:val="0"/>
-          <w:numId w:val="1"/>
-        </w:numPr>
-      </w:pPr>
-      <w:r>
-        <w:t xml:space="preserve">nombreUsuario </w:t>
-      </w:r>
-    </w:p>
-    <w:p>
-      <w:pPr>
-        <w:numPr>
-          <w:ilvl w:val="0"/>
-          <w:numId w:val="1"/>
-        </w:numPr>
-      </w:pPr>
-      <w:r>
-        <w:t xml:space="preserve">contraseña </w:t>
-      </w:r>
-    </w:p>
-    <w:p>
-      <w:pPr>
-        <w:numPr>
-          <w:ilvl w:val="0"/>
-          <w:numId w:val="1"/>
-        </w:numPr>
-      </w:pPr>
-      <w:r>
-        <w:t>rol</w:t>
-      </w:r>
-      <w:r>
-        <w:t xml:space="preserve"> (a definir)</w:t>
-      </w:r>
-    </w:p>
-    <w:p/>
-    <w:p>
-      <w:r>
-        <w:t>Cliente</w:t>
-      </w:r>
-    </w:p>
-    <w:p>
-      <w:pPr>
-        <w:numPr>
-          <w:ilvl w:val="0"/>
-          <w:numId w:val="2"/>
-        </w:numPr>
-      </w:pPr>
-      <w:r>
-        <w:t xml:space="preserve">id </w:t>
-      </w:r>
-    </w:p>
-    <w:p>
-      <w:pPr>
-        <w:numPr>
-          <w:ilvl w:val="0"/>
-          <w:numId w:val="2"/>
-        </w:numPr>
-      </w:pPr>
-      <w:r>
-        <w:t xml:space="preserve">nombre </w:t>
-      </w:r>
-    </w:p>
-    <w:p>
-      <w:pPr>
-        <w:numPr>
-          <w:ilvl w:val="0"/>
-          <w:numId w:val="2"/>
-        </w:numPr>
-      </w:pPr>
-      <w:r>
-        <w:t xml:space="preserve">apellido </w:t>
-      </w:r>
-    </w:p>
-    <w:p>
-      <w:pPr>
-        <w:numPr>
-          <w:ilvl w:val="0"/>
-          <w:numId w:val="2"/>
-        </w:numPr>
-      </w:pPr>
-      <w:r>
-        <w:t xml:space="preserve">teléfono </w:t>
-      </w:r>
-    </w:p>
-    <w:p>
-      <w:pPr>
-        <w:numPr>
-          <w:ilvl w:val="0"/>
-          <w:numId w:val="2"/>
-        </w:numPr>
-      </w:pPr>
-      <w:r>
-        <w:t>email</w:t>
-      </w:r>
-    </w:p>
-    <w:p/>
-    <w:p>
-      <w:r>
-        <w:t>Producto</w:t>
-      </w:r>
-    </w:p>
-    <w:p>
-      <w:pPr>
-        <w:numPr>
-          <w:ilvl w:val="0"/>
-          <w:numId w:val="3"/>
-        </w:numPr>
-      </w:pPr>
-      <w:r>
-        <w:t xml:space="preserve">id </w:t>
-      </w:r>
-    </w:p>
-    <w:p>
-      <w:pPr>
-        <w:numPr>
-          <w:ilvl w:val="0"/>
-          <w:numId w:val="3"/>
-        </w:numPr>
-      </w:pPr>
-      <w:r>
-        <w:t xml:space="preserve">nombre </w:t>
-      </w:r>
-    </w:p>
-    <w:p>
-      <w:pPr>
-        <w:numPr>
-          <w:ilvl w:val="0"/>
-          <w:numId w:val="3"/>
-        </w:numPr>
-      </w:pPr>
-      <w:r>
-        <w:t xml:space="preserve">precio </w:t>
-      </w:r>
-    </w:p>
-    <w:p>
-      <w:pPr>
-        <w:numPr>
-          <w:ilvl w:val="0"/>
-          <w:numId w:val="3"/>
-        </w:numPr>
-      </w:pPr>
-      <w:r>
-        <w:t xml:space="preserve">stock </w:t>
-      </w:r>
-    </w:p>
-    <w:p>
-      <w:pPr>
-        <w:numPr>
-          <w:ilvl w:val="0"/>
-          <w:numId w:val="3"/>
-        </w:numPr>
-      </w:pPr>
-      <w:r>
-        <w:t xml:space="preserve">categoría </w:t>
-      </w:r>
-    </w:p>
-    <w:p>
-      <w:pPr>
-        <w:numPr>
-          <w:ilvl w:val="0"/>
-          <w:numId w:val="3"/>
-        </w:numPr>
-      </w:pPr>
-      <w:r>
-        <w:t>proveedor</w:t>
-      </w:r>
-    </w:p>
-    <w:p/>
-    <w:p>
-      <w:r>
-        <w:t>Proveedor</w:t>
-      </w:r>
-    </w:p>
-    <w:p>
-      <w:pPr>
-        <w:numPr>
-          <w:ilvl w:val="0"/>
-          <w:numId w:val="4"/>
-        </w:numPr>
-      </w:pPr>
-      <w:r>
-        <w:t xml:space="preserve">id </w:t>
-      </w:r>
-    </w:p>
-    <w:p>
-      <w:pPr>
-        <w:numPr>
-          <w:ilvl w:val="0"/>
-          <w:numId w:val="4"/>
-        </w:numPr>
-      </w:pPr>
-      <w:r>
-        <w:t xml:space="preserve">nombre </w:t>
-      </w:r>
-    </w:p>
-    <w:p>
-      <w:pPr>
-        <w:numPr>
-          <w:ilvl w:val="0"/>
-          <w:numId w:val="4"/>
-        </w:numPr>
-      </w:pPr>
-      <w:r>
-        <w:t xml:space="preserve">teléfono </w:t>
-      </w:r>
-    </w:p>
-    <w:p>
-      <w:pPr>
-        <w:numPr>
-          <w:ilvl w:val="0"/>
-          <w:numId w:val="4"/>
-        </w:numPr>
-      </w:pPr>
-      <w:r>
-        <w:t>email</w:t>
-      </w:r>
-    </w:p>
-    <w:p/>
-    <w:p/>
-    <w:p>
-      <w:r>
-        <w:lastRenderedPageBreak/>
-        <w:t xml:space="preserve">Categoría </w:t>
-      </w:r>
-    </w:p>
-    <w:p>
-      <w:r>
-        <w:t xml:space="preserve">• id </w:t>
-      </w:r>
-    </w:p>
-    <w:p>
-      <w:r>
-        <w:t xml:space="preserve">• nombre </w:t>
-      </w:r>
-    </w:p>
-    <w:p>
-      <w:r>
-        <w:t>Sirve para clasificar productos.</w:t>
-      </w:r>
-    </w:p>
-    <w:p/>
-    <w:p>
-      <w:r>
-        <w:t>Venta</w:t>
-      </w:r>
-      <w:r>
-        <w:t xml:space="preserve"> </w:t>
-      </w:r>
-      <w:r>
-        <w:sym w:font="Wingdings" w:char="F0DF"/>
-      </w:r>
-      <w:r>
-        <w:t xml:space="preserve"> no es ABM</w:t>
-      </w:r>
-    </w:p>
-    <w:p>
-      <w:pPr>
-        <w:numPr>
-          <w:ilvl w:val="0"/>
-          <w:numId w:val="5"/>
-        </w:numPr>
-      </w:pPr>
-      <w:r>
-        <w:t xml:space="preserve">número </w:t>
-      </w:r>
-    </w:p>
-    <w:p>
-      <w:pPr>
-        <w:numPr>
-          <w:ilvl w:val="0"/>
-          <w:numId w:val="5"/>
-        </w:numPr>
-      </w:pPr>
-      <w:r>
-        <w:t xml:space="preserve">fecha </w:t>
-      </w:r>
-    </w:p>
-    <w:p>
-      <w:pPr>
-        <w:numPr>
-          <w:ilvl w:val="0"/>
-          <w:numId w:val="5"/>
-        </w:numPr>
-      </w:pPr>
-      <w:r>
-        <w:t xml:space="preserve">cliente </w:t>
-      </w:r>
-    </w:p>
-    <w:p>
-      <w:pPr>
-        <w:numPr>
-          <w:ilvl w:val="0"/>
-          <w:numId w:val="5"/>
-        </w:numPr>
-      </w:pPr>
-      <w:r>
-        <w:t xml:space="preserve">usuario </w:t>
-      </w:r>
-    </w:p>
-    <w:p>
-      <w:pPr>
-        <w:numPr>
-          <w:ilvl w:val="0"/>
-          <w:numId w:val="5"/>
-        </w:numPr>
-      </w:pPr>
-      <w:r>
-        <w:t xml:space="preserve">total </w:t>
-      </w:r>
-    </w:p>
-    <w:p>
-      <w:pPr>
-        <w:numPr>
-          <w:ilvl w:val="0"/>
-          <w:numId w:val="5"/>
-        </w:numPr>
-      </w:pPr>
-      <w:r>
-        <w:t>lista de</w:t>
-      </w:r>
-      <w:r>
-        <w:t>talleVenta</w:t>
-      </w:r>
-    </w:p>
-    <w:p/>
-    <w:p>
-      <w:r>
-        <w:t xml:space="preserve">DetalleVenta &lt;- no es ABM </w:t>
-      </w:r>
-    </w:p>
-    <w:p>
-      <w:r>
-        <w:t xml:space="preserve">nroRenglon </w:t>
-      </w:r>
-    </w:p>
-    <w:p>
-      <w:r>
-        <w:t xml:space="preserve">cantidad </w:t>
-      </w:r>
-    </w:p>
-    <w:p>
-      <w:r>
-        <w:t xml:space="preserve">subTotal </w:t>
-      </w:r>
-    </w:p>
-    <w:p>
-      <w:r>
-        <w:t>precioUnitario</w:t>
-      </w:r>
-    </w:p>
-    <w:p>
       <w:pPr>
         <w:pBdr>
           <w:bottom w:val="single" w:sz="6" w:space="1" w:color="auto"/>
         </w:pBdr>
+        <w:ind w:left="708" w:hanging="708"/>
       </w:pPr>
     </w:p>
     <w:p/>
@@ -436,7 +42,23 @@
         <w:t>clases normales</w:t>
       </w:r>
       <w:r>
-        <w:t xml:space="preserve"> (usuario, cliente, proovedor, etc) van en </w:t>
+        <w:t xml:space="preserve"> (usuario, cliente, </w:t>
+      </w:r>
+      <w:proofErr w:type="spellStart"/>
+      <w:r>
+        <w:t>proovedor</w:t>
+      </w:r>
+      <w:proofErr w:type="spellEnd"/>
+      <w:r>
+        <w:t xml:space="preserve">, </w:t>
+      </w:r>
+      <w:proofErr w:type="spellStart"/>
+      <w:r>
+        <w:t>etc</w:t>
+      </w:r>
+      <w:proofErr w:type="spellEnd"/>
+      <w:r>
+        <w:t xml:space="preserve">) van en </w:t>
       </w:r>
       <w:r>
         <w:t xml:space="preserve">el </w:t>
@@ -493,26 +115,58 @@
       <w:r>
         <w:t xml:space="preserve"> va la lógica que trabaja con esas clases, por ejemplo: </w:t>
       </w:r>
+      <w:proofErr w:type="spellStart"/>
       <w:r>
         <w:t>UsuarioService</w:t>
       </w:r>
+      <w:proofErr w:type="spellEnd"/>
       <w:r>
         <w:t xml:space="preserve"> va a tener métodos como: </w:t>
       </w:r>
     </w:p>
     <w:p>
-      <w:r>
-        <w:t>iniciarSesion()</w:t>
-      </w:r>
-    </w:p>
-    <w:p>
-      <w:r>
-        <w:t>agregarusuario()</w:t>
-      </w:r>
-    </w:p>
-    <w:p>
-      <w:r>
-        <w:t>eliminarUsuario()</w:t>
+      <w:proofErr w:type="spellStart"/>
+      <w:proofErr w:type="gramStart"/>
+      <w:r>
+        <w:t>iniciarSesion</w:t>
+      </w:r>
+      <w:proofErr w:type="spellEnd"/>
+      <w:r>
+        <w:t>(</w:t>
+      </w:r>
+      <w:proofErr w:type="gramEnd"/>
+      <w:r>
+        <w:t>)</w:t>
+      </w:r>
+    </w:p>
+    <w:p>
+      <w:proofErr w:type="spellStart"/>
+      <w:proofErr w:type="gramStart"/>
+      <w:r>
+        <w:t>agregarusuario</w:t>
+      </w:r>
+      <w:proofErr w:type="spellEnd"/>
+      <w:r>
+        <w:t>(</w:t>
+      </w:r>
+      <w:proofErr w:type="gramEnd"/>
+      <w:r>
+        <w:t>)</w:t>
+      </w:r>
+    </w:p>
+    <w:p>
+      <w:proofErr w:type="spellStart"/>
+      <w:proofErr w:type="gramStart"/>
+      <w:r>
+        <w:t>eliminarUsuario</w:t>
+      </w:r>
+      <w:proofErr w:type="spellEnd"/>
+      <w:r>
+        <w:t>(</w:t>
+      </w:r>
+      <w:proofErr w:type="gramEnd"/>
+      <w:r>
+        <w:t>)</w:t>
       </w:r>
     </w:p>
     <w:p/>
@@ -544,8 +198,13 @@
           <w:numId w:val="6"/>
         </w:numPr>
       </w:pPr>
-      <w:r>
-        <w:t xml:space="preserve">UsuarioService → </w:t>
+      <w:proofErr w:type="spellStart"/>
+      <w:r>
+        <w:t>UsuarioService</w:t>
+      </w:r>
+      <w:proofErr w:type="spellEnd"/>
+      <w:r>
+        <w:t xml:space="preserve"> → </w:t>
       </w:r>
       <w:r>
         <w:rPr>
@@ -562,7 +221,6 @@
     <w:p/>
     <w:p>
       <w:r>
-        <w:lastRenderedPageBreak/>
         <w:t xml:space="preserve">En el </w:t>
       </w:r>
       <w:r>
@@ -619,47 +277,21 @@
       </w:r>
     </w:p>
     <w:p>
+      <w:proofErr w:type="spellStart"/>
       <w:r>
         <w:t>FrmProductos</w:t>
       </w:r>
-    </w:p>
-    <w:p>
+      <w:proofErr w:type="spellEnd"/>
+    </w:p>
+    <w:p>
+      <w:proofErr w:type="spellStart"/>
       <w:r>
         <w:t>FrmClientes</w:t>
       </w:r>
+      <w:proofErr w:type="spellEnd"/>
     </w:p>
     <w:p/>
     <w:p>
-      <w:r>
-        <w:t xml:space="preserve">En el </w:t>
-      </w:r>
-      <w:r>
-        <w:rPr>
-          <w:u w:val="single" w:color="4472C4" w:themeColor="accent1"/>
-        </w:rPr>
-        <w:t>paquete útil</w:t>
-      </w:r>
-      <w:r>
-        <w:t xml:space="preserve"> van </w:t>
-      </w:r>
-      <w:r>
-        <w:t>Clases auxiliares.</w:t>
-      </w:r>
-      <w:r>
-        <w:t xml:space="preserve"> </w:t>
-      </w:r>
-      <w:r>
-        <w:sym w:font="Wingdings" w:char="F0E0"/>
-      </w:r>
-      <w:r>
-        <w:t xml:space="preserve"> </w:t>
-      </w:r>
-      <w:r>
-        <w:t>Validaciones</w:t>
-      </w:r>
-    </w:p>
-    <w:p/>
-    <w:p>
       <w:pPr>
         <w:ind w:left="708" w:hanging="708"/>
       </w:pPr>
@@ -673,52 +305,6 @@
     <w:p>
       <w:r>
         <w:t>El sistema está organizado por módulos funcionales. Cada entidad principal posee su propio ABM para la administración de datos. Las ventas constituyen un módulo independiente, ya que no representan un ABM tradicional, y los reportes se agrupan en un único módulo destinado a la consulta de información del sistema.</w:t>
-      </w:r>
-    </w:p>
-    <w:p>
-      <w:r>
-        <w:t>MusicStore</w:t>
-      </w:r>
-    </w:p>
-    <w:p>
-      <w:r>
-        <w:t>[ Usuarios ]</w:t>
-      </w:r>
-    </w:p>
-    <w:p>
-      <w:r>
-        <w:t>[ Clientes ]</w:t>
-      </w:r>
-    </w:p>
-    <w:p>
-      <w:r>
-        <w:t>[ Proveedores ]</w:t>
-      </w:r>
-    </w:p>
-    <w:p>
-      <w:r>
-        <w:t>[ Categorías ]</w:t>
-      </w:r>
-    </w:p>
-    <w:p>
-      <w:r>
-        <w:t>[ Productos ]</w:t>
-      </w:r>
-    </w:p>
-    <w:p>
-      <w:r>
-        <w:t>[ Ventas ]</w:t>
-      </w:r>
-    </w:p>
-    <w:p>
-      <w:r>
-        <w:t>[ Reportes ]</w:t>
-      </w:r>
-    </w:p>
-    <w:p/>
-    <w:p>
-      <w:r>
-        <w:t xml:space="preserve">                    [ Salir ]</w:t>
       </w:r>
     </w:p>
     <w:p>
@@ -755,11 +341,20 @@
         <w:t xml:space="preserve"> </w:t>
       </w:r>
       <w:r>
-        <w:t>La clase Data no contiene lógica de negocio. Su única responsabilidad es mantener en memoria todas las colecciones principales del sistema para que posteriormente la clase Persistencia pueda serializarlas y deserializarlas en un único archivo (musicstore.dat).</w:t>
-      </w:r>
-    </w:p>
-    <w:p>
-      <w:r>
+        <w:t xml:space="preserve">La clase Data no contiene lógica de negocio. Su única responsabilidad es mantener en memoria todas las colecciones principales del sistema para que posteriormente la clase Persistencia pueda serializarlas y </w:t>
+      </w:r>
+      <w:proofErr w:type="spellStart"/>
+      <w:r>
+        <w:t>deserializarlas</w:t>
+      </w:r>
+      <w:proofErr w:type="spellEnd"/>
+      <w:r>
+        <w:t xml:space="preserve"> en un único archivo (musicstore.dat).</w:t>
+      </w:r>
+    </w:p>
+    <w:p>
+      <w:r>
+        <w:lastRenderedPageBreak/>
         <w:t xml:space="preserve">Si creo un nuevo usuario y luego cierro el programa, este desaparece. </w:t>
       </w:r>
       <w:r>
@@ -794,7 +389,25 @@
           <w:bCs/>
           <w:highlight w:val="cyan"/>
         </w:rPr>
-        <w:t>¿Por qué la clase Data no tiene setters?</w:t>
+        <w:t xml:space="preserve">¿Por qué la clase Data no tiene </w:t>
+      </w:r>
+      <w:proofErr w:type="spellStart"/>
+      <w:r>
+        <w:rPr>
+          <w:b/>
+          <w:bCs/>
+          <w:highlight w:val="cyan"/>
+        </w:rPr>
+        <w:t>setters</w:t>
+      </w:r>
+      <w:proofErr w:type="spellEnd"/>
+      <w:r>
+        <w:rPr>
+          <w:b/>
+          <w:bCs/>
+          <w:highlight w:val="cyan"/>
+        </w:rPr>
+        <w:t>?</w:t>
       </w:r>
     </w:p>
     <w:p>
@@ -814,6 +427,7 @@
       <w:r>
         <w:t xml:space="preserve">Por este motivo, la clase solo posee </w:t>
       </w:r>
+      <w:proofErr w:type="spellStart"/>
       <w:r>
         <w:rPr>
           <w:b/>
@@ -821,14 +435,43 @@
         </w:rPr>
         <w:t>getters</w:t>
       </w:r>
-      <w:r>
-        <w:t>. Los getters permiten acceder a las listas para agregar, modificar o eliminar elementos, por ejemplo:</w:t>
+      <w:proofErr w:type="spellEnd"/>
+      <w:r>
+        <w:t xml:space="preserve">. Los </w:t>
+      </w:r>
+      <w:proofErr w:type="spellStart"/>
+      <w:r>
+        <w:t>getters</w:t>
+      </w:r>
+      <w:proofErr w:type="spellEnd"/>
+      <w:r>
+        <w:t xml:space="preserve"> permiten acceder a las listas para agregar, modificar o eliminar elementos, por ejemplo:</w:t>
       </w:r>
       <w:r>
         <w:t xml:space="preserve"> </w:t>
       </w:r>
-      <w:r>
-        <w:t>data.getUsuarios().add(usuario);</w:t>
+      <w:proofErr w:type="spellStart"/>
+      <w:proofErr w:type="gramStart"/>
+      <w:r>
+        <w:t>data.getUsuarios</w:t>
+      </w:r>
+      <w:proofErr w:type="spellEnd"/>
+      <w:proofErr w:type="gramEnd"/>
+      <w:r>
+        <w:t>(</w:t>
+      </w:r>
+      <w:proofErr w:type="gramStart"/>
+      <w:r>
+        <w:t>).</w:t>
+      </w:r>
+      <w:proofErr w:type="spellStart"/>
+      <w:r>
+        <w:t>add</w:t>
+      </w:r>
+      <w:proofErr w:type="spellEnd"/>
+      <w:proofErr w:type="gramEnd"/>
+      <w:r>
+        <w:t>(usuario);</w:t>
       </w:r>
     </w:p>
     <w:p>
@@ -838,12 +481,12 @@
           <w:bCs/>
           <w:color w:val="00B0F0"/>
         </w:rPr>
-        <w:lastRenderedPageBreak/>
         <w:t xml:space="preserve">- </w:t>
       </w:r>
       <w:r>
         <w:t xml:space="preserve">No se implementan </w:t>
       </w:r>
+      <w:proofErr w:type="spellStart"/>
       <w:r>
         <w:rPr>
           <w:b/>
@@ -851,6 +494,7 @@
         </w:rPr>
         <w:t>setters</w:t>
       </w:r>
+      <w:proofErr w:type="spellEnd"/>
       <w:r>
         <w:t xml:space="preserve"> porque en ningún momento del sistema será necesario reemplazar una lista completa por otra distinta. Mantener siempre la misma instancia de cada lista evita reemplazos accidentales y simplifica el diseño de la aplicación.</w:t>
       </w:r>
@@ -881,309 +525,348 @@
           <w:bCs/>
           <w:highlight w:val="cyan"/>
         </w:rPr>
-        <w:t>¿Por qué Data no tiene una lista de DetalleVenta?</w:t>
-      </w:r>
-    </w:p>
-    <w:p>
-      <w:r>
-        <w:t>La clase DetalleVenta representa cada uno de los productos que forman parte de una venta. Debido a esto, cada objeto Venta ya posee su propia colección de detalles:</w:t>
-      </w:r>
-    </w:p>
-    <w:p>
-      <w:r>
-        <w:t>Por lo tanto, no es necesario que Data almacene otra lista de DetalleVenta. Si existiera una lista adicional, la misma información estaría almacenada en dos lugares diferentes, generando redundancia y aumentando el riesgo de inconsistencias.</w:t>
-      </w:r>
-    </w:p>
-    <w:p>
-      <w:r>
-        <w:t>En consecuencia, Data solo mantiene una lista de Venta, y cada venta administra internamente sus propios detalles.</w:t>
-      </w:r>
-    </w:p>
-    <w:p>
-      <w:r>
-        <w:t>-----------------------------------------------------------------------------------------------------------------------------------------------------------</w:t>
-      </w:r>
-    </w:p>
-    <w:p>
-      <w:pPr>
-        <w:rPr>
-          <w:sz w:val="24"/>
-          <w:szCs w:val="24"/>
-        </w:rPr>
-      </w:pPr>
-      <w:r>
-        <w:rPr>
-          <w:sz w:val="24"/>
-          <w:szCs w:val="24"/>
-          <w:highlight w:val="green"/>
-        </w:rPr>
-        <w:t>Serialización:</w:t>
-      </w:r>
-    </w:p>
-    <w:p>
-      <w:r>
-        <w:rPr>
-          <w:u w:val="single" w:color="00B050"/>
-        </w:rPr>
-        <w:t>Serializar significa</w:t>
-      </w:r>
-      <w:r>
-        <w:t>:</w:t>
-      </w:r>
-      <w:r>
-        <w:t xml:space="preserve"> </w:t>
-      </w:r>
+        <w:t xml:space="preserve">¿Por qué Data no tiene una lista de </w:t>
+      </w:r>
+      <w:proofErr w:type="spellStart"/>
       <w:r>
         <w:rPr>
           <w:b/>
           <w:bCs/>
-        </w:rPr>
-        <w:t>Transformar un objeto de Java en una secuencia de bytes para poder guardarlo en un archivo.</w:t>
-      </w:r>
-    </w:p>
-    <w:p/>
-    <w:p>
-      <w:r>
-        <w:rPr>
-          <w:highlight w:val="green"/>
-        </w:rPr>
-        <w:t>+</w:t>
-      </w:r>
-      <w:r>
-        <w:t xml:space="preserve"> </w:t>
-      </w:r>
-      <w:r>
-        <w:t xml:space="preserve">¿Por qué usamos </w:t>
-      </w:r>
-      <w:r>
-        <w:t>implements Serializable</w:t>
-      </w:r>
-      <w:r>
-        <w:t>?</w:t>
-      </w:r>
-    </w:p>
-    <w:p>
-      <w:r>
-        <w:t>Porque Java necesita saber qué clases puede convertir en bytes.</w:t>
-      </w:r>
-      <w:r>
-        <w:t xml:space="preserve"> </w:t>
-      </w:r>
-      <w:r>
-        <w:t>Si una clase no implementa esa interfaz y tratamos de guardarla, Java lanzará una excepción.</w:t>
-      </w:r>
-    </w:p>
-    <w:p>
-      <w:r>
-        <w:rPr>
-          <w:highlight w:val="green"/>
-        </w:rPr>
-        <w:t>¿Qué pasa con Data?</w:t>
-      </w:r>
-    </w:p>
-    <w:p>
-      <w:r>
-        <w:t>Nosotros no vamos a guardar:</w:t>
-      </w:r>
-      <w:r>
-        <w:t xml:space="preserve"> </w:t>
-      </w:r>
-      <w:r>
-        <w:t>Usuario</w:t>
-      </w:r>
-      <w:r>
-        <w:t xml:space="preserve">, </w:t>
-      </w:r>
-      <w:r>
-        <w:t>Cliente</w:t>
-      </w:r>
-      <w:r>
-        <w:t xml:space="preserve">, </w:t>
-      </w:r>
-      <w:r>
-        <w:t>Producto</w:t>
-      </w:r>
-      <w:r>
-        <w:t xml:space="preserve">, </w:t>
-      </w:r>
-      <w:r>
-        <w:t>Venta uno por uno.</w:t>
-      </w:r>
-    </w:p>
-    <w:p>
-      <w:r>
-        <w:t>Vamos a guardar un único objeto</w:t>
-      </w:r>
-      <w:r>
-        <w:t xml:space="preserve"> </w:t>
-      </w:r>
-      <w:r>
-        <w:t>Data</w:t>
-      </w:r>
-      <w:r>
-        <w:t>, el cual contiene:</w:t>
-      </w:r>
-    </w:p>
-    <w:p>
-      <w:r>
-        <w:t>Data</w:t>
-      </w:r>
-    </w:p>
-    <w:p>
-      <w:r>
-        <w:t>│</w:t>
-      </w:r>
-    </w:p>
-    <w:p>
-      <w:r>
-        <w:rPr>
-          <w:rFonts w:ascii="MS Gothic" w:eastAsia="MS Gothic" w:hAnsi="MS Gothic" w:cs="MS Gothic" w:hint="eastAsia"/>
-        </w:rPr>
-        <w:t>├</w:t>
-      </w:r>
-      <w:r>
-        <w:rPr>
-          <w:rFonts w:ascii="Calibri" w:hAnsi="Calibri" w:cs="Calibri"/>
-        </w:rPr>
-        <w:t>──</w:t>
-      </w:r>
-      <w:r>
-        <w:t xml:space="preserve"> usuarios</w:t>
-      </w:r>
-    </w:p>
-    <w:p>
-      <w:r>
-        <w:rPr>
-          <w:rFonts w:ascii="MS Gothic" w:eastAsia="MS Gothic" w:hAnsi="MS Gothic" w:cs="MS Gothic" w:hint="eastAsia"/>
-        </w:rPr>
-        <w:t>├</w:t>
-      </w:r>
-      <w:r>
-        <w:rPr>
-          <w:rFonts w:ascii="Calibri" w:hAnsi="Calibri" w:cs="Calibri"/>
-        </w:rPr>
-        <w:t>──</w:t>
-      </w:r>
-      <w:r>
-        <w:t xml:space="preserve"> clientes</w:t>
-      </w:r>
-    </w:p>
-    <w:p>
-      <w:r>
-        <w:rPr>
-          <w:rFonts w:ascii="MS Gothic" w:eastAsia="MS Gothic" w:hAnsi="MS Gothic" w:cs="MS Gothic" w:hint="eastAsia"/>
-        </w:rPr>
-        <w:t>├</w:t>
-      </w:r>
-      <w:r>
-        <w:rPr>
-          <w:rFonts w:ascii="Calibri" w:hAnsi="Calibri" w:cs="Calibri"/>
-        </w:rPr>
-        <w:t>──</w:t>
-      </w:r>
-      <w:r>
-        <w:t xml:space="preserve"> productos</w:t>
-      </w:r>
-    </w:p>
-    <w:p>
-      <w:r>
-        <w:rPr>
-          <w:rFonts w:ascii="MS Gothic" w:eastAsia="MS Gothic" w:hAnsi="MS Gothic" w:cs="MS Gothic" w:hint="eastAsia"/>
-        </w:rPr>
-        <w:t>├</w:t>
-      </w:r>
-      <w:r>
-        <w:rPr>
-          <w:rFonts w:ascii="Calibri" w:hAnsi="Calibri" w:cs="Calibri"/>
-        </w:rPr>
-        <w:t>──</w:t>
-      </w:r>
-      <w:r>
-        <w:t xml:space="preserve"> proveedores</w:t>
-      </w:r>
-    </w:p>
-    <w:p>
-      <w:r>
-        <w:rPr>
-          <w:rFonts w:ascii="MS Gothic" w:eastAsia="MS Gothic" w:hAnsi="MS Gothic" w:cs="MS Gothic" w:hint="eastAsia"/>
-        </w:rPr>
-        <w:t>├</w:t>
-      </w:r>
-      <w:r>
-        <w:rPr>
-          <w:rFonts w:ascii="Calibri" w:hAnsi="Calibri" w:cs="Calibri"/>
-        </w:rPr>
-        <w:t>──</w:t>
-      </w:r>
-      <w:r>
-        <w:t xml:space="preserve"> categorias</w:t>
-      </w:r>
-    </w:p>
-    <w:p>
-      <w:r>
-        <w:t>└── ventas</w:t>
-      </w:r>
-    </w:p>
-    <w:p>
-      <w:r>
-        <w:t xml:space="preserve">        │</w:t>
-      </w:r>
-    </w:p>
-    <w:p>
-      <w:r>
-        <w:t xml:space="preserve">        </w:t>
-      </w:r>
-      <w:r>
-        <w:rPr>
-          <w:rFonts w:ascii="MS Gothic" w:eastAsia="MS Gothic" w:hAnsi="MS Gothic" w:cs="MS Gothic" w:hint="eastAsia"/>
-        </w:rPr>
-        <w:t>├</w:t>
-      </w:r>
-      <w:r>
-        <w:rPr>
-          <w:rFonts w:ascii="Calibri" w:hAnsi="Calibri" w:cs="Calibri"/>
-        </w:rPr>
-        <w:t>──</w:t>
-      </w:r>
-      <w:r>
-        <w:t xml:space="preserve"> detalle</w:t>
-      </w:r>
-    </w:p>
-    <w:p>
-      <w:r>
-        <w:t xml:space="preserve">        </w:t>
-      </w:r>
-      <w:r>
-        <w:rPr>
-          <w:rFonts w:ascii="MS Gothic" w:eastAsia="MS Gothic" w:hAnsi="MS Gothic" w:cs="MS Gothic" w:hint="eastAsia"/>
-        </w:rPr>
-        <w:t>├</w:t>
-      </w:r>
-      <w:r>
-        <w:rPr>
-          <w:rFonts w:ascii="Calibri" w:hAnsi="Calibri" w:cs="Calibri"/>
-        </w:rPr>
-        <w:t>──</w:t>
-      </w:r>
-      <w:r>
-        <w:t xml:space="preserve"> detalle</w:t>
-      </w:r>
-    </w:p>
-    <w:p>
-      <w:r>
-        <w:t xml:space="preserve">        └── detalle</w:t>
-      </w:r>
-    </w:p>
-    <w:p/>
-    <w:p>
-      <w:r>
-        <w:lastRenderedPageBreak/>
-        <w:t xml:space="preserve">Como </w:t>
-      </w:r>
+          <w:highlight w:val="cyan"/>
+        </w:rPr>
+        <w:t>DetalleVenta</w:t>
+      </w:r>
+      <w:proofErr w:type="spellEnd"/>
       <w:r>
         <w:rPr>
           <w:b/>
           <w:bCs/>
+          <w:highlight w:val="cyan"/>
+        </w:rPr>
+        <w:t>?</w:t>
+      </w:r>
+    </w:p>
+    <w:p>
+      <w:r>
+        <w:t xml:space="preserve">La clase </w:t>
+      </w:r>
+      <w:proofErr w:type="spellStart"/>
+      <w:r>
+        <w:t>DetalleVenta</w:t>
+      </w:r>
+      <w:proofErr w:type="spellEnd"/>
+      <w:r>
+        <w:t xml:space="preserve"> representa cada uno de los productos que forman parte de una venta. Debido a esto, cada objeto Venta ya posee su propia colección de detalles:</w:t>
+      </w:r>
+    </w:p>
+    <w:p>
+      <w:r>
+        <w:t xml:space="preserve">Por lo tanto, no es necesario que Data almacene otra lista de </w:t>
+      </w:r>
+      <w:proofErr w:type="spellStart"/>
+      <w:r>
+        <w:t>DetalleVenta</w:t>
+      </w:r>
+      <w:proofErr w:type="spellEnd"/>
+      <w:r>
+        <w:t>. Si existiera una lista adicional, la misma información estaría almacenada en dos lugares diferentes, generando redundancia y aumentando el riesgo de inconsistencias.</w:t>
+      </w:r>
+    </w:p>
+    <w:p>
+      <w:r>
+        <w:t>En consecuencia, Data solo mantiene una lista de Venta, y cada venta administra internamente sus propios detalles.</w:t>
+      </w:r>
+    </w:p>
+    <w:p>
+      <w:r>
+        <w:t>-----------------------------------------------------------------------------------------------------------------------------------------------------------</w:t>
+      </w:r>
+    </w:p>
+    <w:p>
+      <w:pPr>
+        <w:rPr>
+          <w:sz w:val="24"/>
+          <w:szCs w:val="24"/>
+        </w:rPr>
+      </w:pPr>
+      <w:r>
+        <w:rPr>
+          <w:sz w:val="24"/>
+          <w:szCs w:val="24"/>
+          <w:highlight w:val="green"/>
+        </w:rPr>
+        <w:t>Serialización:</w:t>
+      </w:r>
+    </w:p>
+    <w:p>
+      <w:r>
+        <w:rPr>
+          <w:u w:val="single" w:color="00B050"/>
+        </w:rPr>
+        <w:t>Serializar significa</w:t>
+      </w:r>
+      <w:r>
+        <w:t>:</w:t>
+      </w:r>
+      <w:r>
+        <w:t xml:space="preserve"> </w:t>
+      </w:r>
+      <w:r>
+        <w:rPr>
+          <w:b/>
+          <w:bCs/>
+        </w:rPr>
+        <w:t>Transformar un objeto de Java en una secuencia de bytes para poder guardarlo en un archivo.</w:t>
+      </w:r>
+    </w:p>
+    <w:p/>
+    <w:p>
+      <w:r>
+        <w:rPr>
+          <w:highlight w:val="green"/>
+        </w:rPr>
+        <w:t>+</w:t>
+      </w:r>
+      <w:r>
+        <w:t xml:space="preserve"> </w:t>
+      </w:r>
+      <w:r>
+        <w:t xml:space="preserve">¿Por qué usamos </w:t>
+      </w:r>
+      <w:r>
+        <w:t>implements Serializable</w:t>
+      </w:r>
+      <w:r>
+        <w:t>?</w:t>
+      </w:r>
+    </w:p>
+    <w:p>
+      <w:r>
+        <w:t>Porque Java necesita saber qué clases puede convertir en bytes.</w:t>
+      </w:r>
+      <w:r>
+        <w:t xml:space="preserve"> </w:t>
+      </w:r>
+      <w:r>
+        <w:t>Si una clase no implementa esa interfaz y tratamos de guardarla, Java lanzará una excepción.</w:t>
+      </w:r>
+    </w:p>
+    <w:p>
+      <w:r>
+        <w:rPr>
+          <w:highlight w:val="green"/>
+        </w:rPr>
+        <w:t>¿Qué pasa con Data?</w:t>
+      </w:r>
+    </w:p>
+    <w:p>
+      <w:r>
+        <w:t>Nosotros no vamos a guardar:</w:t>
+      </w:r>
+      <w:r>
+        <w:t xml:space="preserve"> </w:t>
+      </w:r>
+      <w:r>
+        <w:t>Usuario</w:t>
+      </w:r>
+      <w:r>
+        <w:t xml:space="preserve">, </w:t>
+      </w:r>
+      <w:r>
+        <w:t>Cliente</w:t>
+      </w:r>
+      <w:r>
+        <w:t xml:space="preserve">, </w:t>
+      </w:r>
+      <w:r>
+        <w:t>Producto</w:t>
+      </w:r>
+      <w:r>
+        <w:t xml:space="preserve">, </w:t>
+      </w:r>
+      <w:r>
+        <w:t>Venta uno por uno.</w:t>
+      </w:r>
+    </w:p>
+    <w:p>
+      <w:r>
+        <w:t>Vamos a guardar un único objeto</w:t>
+      </w:r>
+      <w:r>
+        <w:t xml:space="preserve"> </w:t>
+      </w:r>
+      <w:r>
+        <w:t>Data</w:t>
+      </w:r>
+      <w:r>
+        <w:t>, el cual contiene:</w:t>
+      </w:r>
+    </w:p>
+    <w:p>
+      <w:r>
+        <w:t>Data</w:t>
+      </w:r>
+    </w:p>
+    <w:p>
+      <w:r>
+        <w:t>│</w:t>
+      </w:r>
+    </w:p>
+    <w:p>
+      <w:r>
+        <w:rPr>
+          <w:rFonts w:ascii="MS Gothic" w:eastAsia="MS Gothic" w:hAnsi="MS Gothic" w:cs="MS Gothic" w:hint="eastAsia"/>
+        </w:rPr>
+        <w:t>├</w:t>
+      </w:r>
+      <w:r>
+        <w:rPr>
+          <w:rFonts w:ascii="Calibri" w:hAnsi="Calibri" w:cs="Calibri"/>
+        </w:rPr>
+        <w:t>──</w:t>
+      </w:r>
+      <w:r>
+        <w:t xml:space="preserve"> usuarios</w:t>
+      </w:r>
+    </w:p>
+    <w:p>
+      <w:r>
+        <w:rPr>
+          <w:rFonts w:ascii="MS Gothic" w:eastAsia="MS Gothic" w:hAnsi="MS Gothic" w:cs="MS Gothic" w:hint="eastAsia"/>
+        </w:rPr>
+        <w:t>├</w:t>
+      </w:r>
+      <w:r>
+        <w:rPr>
+          <w:rFonts w:ascii="Calibri" w:hAnsi="Calibri" w:cs="Calibri"/>
+        </w:rPr>
+        <w:t>──</w:t>
+      </w:r>
+      <w:r>
+        <w:t xml:space="preserve"> clientes</w:t>
+      </w:r>
+    </w:p>
+    <w:p>
+      <w:r>
+        <w:rPr>
+          <w:rFonts w:ascii="MS Gothic" w:eastAsia="MS Gothic" w:hAnsi="MS Gothic" w:cs="MS Gothic" w:hint="eastAsia"/>
+        </w:rPr>
+        <w:t>├</w:t>
+      </w:r>
+      <w:r>
+        <w:rPr>
+          <w:rFonts w:ascii="Calibri" w:hAnsi="Calibri" w:cs="Calibri"/>
+        </w:rPr>
+        <w:t>──</w:t>
+      </w:r>
+      <w:r>
+        <w:t xml:space="preserve"> productos</w:t>
+      </w:r>
+    </w:p>
+    <w:p>
+      <w:r>
+        <w:rPr>
+          <w:rFonts w:ascii="MS Gothic" w:eastAsia="MS Gothic" w:hAnsi="MS Gothic" w:cs="MS Gothic" w:hint="eastAsia"/>
+        </w:rPr>
+        <w:t>├</w:t>
+      </w:r>
+      <w:r>
+        <w:rPr>
+          <w:rFonts w:ascii="Calibri" w:hAnsi="Calibri" w:cs="Calibri"/>
+        </w:rPr>
+        <w:t>──</w:t>
+      </w:r>
+      <w:r>
+        <w:t xml:space="preserve"> proveedores</w:t>
+      </w:r>
+    </w:p>
+    <w:p>
+      <w:r>
+        <w:rPr>
+          <w:rFonts w:ascii="MS Gothic" w:eastAsia="MS Gothic" w:hAnsi="MS Gothic" w:cs="MS Gothic" w:hint="eastAsia"/>
+        </w:rPr>
+        <w:lastRenderedPageBreak/>
+        <w:t>├</w:t>
+      </w:r>
+      <w:r>
+        <w:rPr>
+          <w:rFonts w:ascii="Calibri" w:hAnsi="Calibri" w:cs="Calibri"/>
+        </w:rPr>
+        <w:t>──</w:t>
+      </w:r>
+      <w:r>
+        <w:t xml:space="preserve"> </w:t>
+      </w:r>
+      <w:proofErr w:type="spellStart"/>
+      <w:r>
+        <w:t>categorias</w:t>
+      </w:r>
+      <w:proofErr w:type="spellEnd"/>
+    </w:p>
+    <w:p>
+      <w:r>
+        <w:t>└── ventas</w:t>
+      </w:r>
+    </w:p>
+    <w:p>
+      <w:r>
+        <w:t xml:space="preserve">        │</w:t>
+      </w:r>
+    </w:p>
+    <w:p>
+      <w:r>
+        <w:t xml:space="preserve">        </w:t>
+      </w:r>
+      <w:r>
+        <w:rPr>
+          <w:rFonts w:ascii="MS Gothic" w:eastAsia="MS Gothic" w:hAnsi="MS Gothic" w:cs="MS Gothic" w:hint="eastAsia"/>
+        </w:rPr>
+        <w:t>├</w:t>
+      </w:r>
+      <w:r>
+        <w:rPr>
+          <w:rFonts w:ascii="Calibri" w:hAnsi="Calibri" w:cs="Calibri"/>
+        </w:rPr>
+        <w:t>──</w:t>
+      </w:r>
+      <w:r>
+        <w:t xml:space="preserve"> detalle</w:t>
+      </w:r>
+    </w:p>
+    <w:p>
+      <w:r>
+        <w:t xml:space="preserve">        </w:t>
+      </w:r>
+      <w:r>
+        <w:rPr>
+          <w:rFonts w:ascii="MS Gothic" w:eastAsia="MS Gothic" w:hAnsi="MS Gothic" w:cs="MS Gothic" w:hint="eastAsia"/>
+        </w:rPr>
+        <w:t>├</w:t>
+      </w:r>
+      <w:r>
+        <w:rPr>
+          <w:rFonts w:ascii="Calibri" w:hAnsi="Calibri" w:cs="Calibri"/>
+        </w:rPr>
+        <w:t>──</w:t>
+      </w:r>
+      <w:r>
+        <w:t xml:space="preserve"> detalle</w:t>
+      </w:r>
+    </w:p>
+    <w:p>
+      <w:r>
+        <w:t xml:space="preserve">        └── detalle</w:t>
+      </w:r>
+    </w:p>
+    <w:p/>
+    <w:p>
+      <w:r>
+        <w:t xml:space="preserve">Como </w:t>
+      </w:r>
+      <w:r>
+        <w:rPr>
+          <w:b/>
+          <w:bCs/>
         </w:rPr>
         <w:t>todos esos objetos también implementan Serializable</w:t>
       </w:r>
@@ -1192,8 +875,37 @@
       </w:r>
     </w:p>
     <w:p>
-      <w:r>
-        <w:t>Persistencia.guardar(data);</w:t>
+      <w:proofErr w:type="spellStart"/>
+      <w:r>
+        <w:t>Persistencia.guardar</w:t>
+      </w:r>
+      <w:proofErr w:type="spellEnd"/>
+      <w:r>
+        <w:t>(data);</w:t>
+      </w:r>
+    </w:p>
+    <w:p>
+      <w:r>
+        <w:t>Resumen: data guarda todas las listas, g</w:t>
+      </w:r>
+      <w:r>
+        <w:t xml:space="preserve">racias a esto se serializa </w:t>
+      </w:r>
+      <w:r>
+        <w:rPr>
+          <w:b/>
+          <w:bCs/>
+        </w:rPr>
+        <w:t>un solo objeto</w:t>
+      </w:r>
+      <w:r>
+        <w:t xml:space="preserve"> (Data) en lugar de guardar seis archivos distintos</w:t>
+      </w:r>
+      <w:r>
+        <w:t xml:space="preserve"> (productos, proveedores, categorías, usuarios, clientes, ventas)</w:t>
+      </w:r>
+      <w:r>
+        <w:t>.</w:t>
       </w:r>
     </w:p>
     <w:p/>
@@ -1243,7 +955,21 @@
         <w:rPr>
           <w:lang w:val="en-US"/>
         </w:rPr>
-        <w:t>File archivo = new File("musicstore.dat");</w:t>
+        <w:t xml:space="preserve">File </w:t>
+      </w:r>
+      <w:proofErr w:type="spellStart"/>
+      <w:r>
+        <w:rPr>
+          <w:lang w:val="en-US"/>
+        </w:rPr>
+        <w:t>archivo</w:t>
+      </w:r>
+      <w:proofErr w:type="spellEnd"/>
+      <w:r>
+        <w:rPr>
+          <w:lang w:val="en-US"/>
+        </w:rPr>
+        <w:t xml:space="preserve"> = new File("musicstore.dat");</w:t>
       </w:r>
     </w:p>
     <w:p>
@@ -1261,7 +987,15 @@
         <w:t>+</w:t>
       </w:r>
       <w:r>
-        <w:t xml:space="preserve"> FileOutputStream </w:t>
+        <w:t xml:space="preserve"> </w:t>
+      </w:r>
+      <w:proofErr w:type="spellStart"/>
+      <w:r>
+        <w:t>FileOutputStream</w:t>
+      </w:r>
+      <w:proofErr w:type="spellEnd"/>
+      <w:r>
+        <w:t xml:space="preserve"> </w:t>
       </w:r>
       <w:r>
         <w:rPr>
@@ -1282,7 +1016,15 @@
         <w:t>+</w:t>
       </w:r>
       <w:r>
-        <w:t xml:space="preserve"> ObjectOutputStream </w:t>
+        <w:t xml:space="preserve"> </w:t>
+      </w:r>
+      <w:proofErr w:type="spellStart"/>
+      <w:r>
+        <w:t>ObjectOutputStream</w:t>
+      </w:r>
+      <w:proofErr w:type="spellEnd"/>
+      <w:r>
+        <w:t xml:space="preserve"> </w:t>
       </w:r>
       <w:r>
         <w:rPr>
@@ -1298,8 +1040,15 @@
       </w:r>
     </w:p>
     <w:p>
-      <w:r>
-        <w:t>output.writeObject(data);</w:t>
+      <w:proofErr w:type="spellStart"/>
+      <w:proofErr w:type="gramStart"/>
+      <w:r>
+        <w:t>output.writeObject</w:t>
+      </w:r>
+      <w:proofErr w:type="spellEnd"/>
+      <w:proofErr w:type="gramEnd"/>
+      <w:r>
+        <w:t>(data);</w:t>
       </w:r>
     </w:p>
     <w:p/>
@@ -1311,7 +1060,15 @@
         <w:t>+</w:t>
       </w:r>
       <w:r>
-        <w:t xml:space="preserve"> ObjectInputStream </w:t>
+        <w:t xml:space="preserve"> </w:t>
+      </w:r>
+      <w:proofErr w:type="spellStart"/>
+      <w:r>
+        <w:t>ObjectInputStream</w:t>
+      </w:r>
+      <w:proofErr w:type="spellEnd"/>
+      <w:r>
+        <w:t xml:space="preserve"> </w:t>
       </w:r>
       <w:r>
         <w:rPr>
@@ -1339,7 +1096,37 @@
         <w:rPr>
           <w:lang w:val="en-US"/>
         </w:rPr>
-        <w:t>Data data = (Data) input.readObject();</w:t>
+        <w:t xml:space="preserve">Data </w:t>
+      </w:r>
+      <w:proofErr w:type="spellStart"/>
+      <w:r>
+        <w:rPr>
+          <w:lang w:val="en-US"/>
+        </w:rPr>
+        <w:t>data</w:t>
+      </w:r>
+      <w:proofErr w:type="spellEnd"/>
+      <w:r>
+        <w:rPr>
+          <w:lang w:val="en-US"/>
+        </w:rPr>
+        <w:t xml:space="preserve"> = (Data) </w:t>
+      </w:r>
+      <w:proofErr w:type="spellStart"/>
+      <w:proofErr w:type="gramStart"/>
+      <w:r>
+        <w:rPr>
+          <w:lang w:val="en-US"/>
+        </w:rPr>
+        <w:t>input.readObject</w:t>
+      </w:r>
+      <w:proofErr w:type="spellEnd"/>
+      <w:proofErr w:type="gramEnd"/>
+      <w:r>
+        <w:rPr>
+          <w:lang w:val="en-US"/>
+        </w:rPr>
+        <w:t>();</w:t>
       </w:r>
     </w:p>
     <w:p>
@@ -1367,20 +1154,81 @@
           <w:highlight w:val="green"/>
           <w:lang w:val="en-US"/>
         </w:rPr>
-        <w:t>¿Qué es writeObject()?</w:t>
-      </w:r>
-    </w:p>
-    <w:p>
-      <w:pPr>
-        <w:rPr>
-          <w:lang w:val="en-US"/>
-        </w:rPr>
-      </w:pPr>
-      <w:r>
-        <w:rPr>
-          <w:lang w:val="en-US"/>
-        </w:rPr>
-        <w:t>output.writeObject(data);</w:t>
+        <w:t>¿</w:t>
+      </w:r>
+      <w:proofErr w:type="spellStart"/>
+      <w:r>
+        <w:rPr>
+          <w:sz w:val="24"/>
+          <w:szCs w:val="24"/>
+          <w:highlight w:val="green"/>
+          <w:lang w:val="en-US"/>
+        </w:rPr>
+        <w:t>Qué</w:t>
+      </w:r>
+      <w:proofErr w:type="spellEnd"/>
+      <w:r>
+        <w:rPr>
+          <w:sz w:val="24"/>
+          <w:szCs w:val="24"/>
+          <w:highlight w:val="green"/>
+          <w:lang w:val="en-US"/>
+        </w:rPr>
+        <w:t xml:space="preserve"> es </w:t>
+      </w:r>
+      <w:proofErr w:type="spellStart"/>
+      <w:proofErr w:type="gramStart"/>
+      <w:r>
+        <w:rPr>
+          <w:sz w:val="24"/>
+          <w:szCs w:val="24"/>
+          <w:highlight w:val="green"/>
+          <w:lang w:val="en-US"/>
+        </w:rPr>
+        <w:t>writeObject</w:t>
+      </w:r>
+      <w:proofErr w:type="spellEnd"/>
+      <w:r>
+        <w:rPr>
+          <w:sz w:val="24"/>
+          <w:szCs w:val="24"/>
+          <w:highlight w:val="green"/>
+          <w:lang w:val="en-US"/>
+        </w:rPr>
+        <w:t>(</w:t>
+      </w:r>
+      <w:proofErr w:type="gramEnd"/>
+      <w:r>
+        <w:rPr>
+          <w:sz w:val="24"/>
+          <w:szCs w:val="24"/>
+          <w:highlight w:val="green"/>
+          <w:lang w:val="en-US"/>
+        </w:rPr>
+        <w:t>)?</w:t>
+      </w:r>
+    </w:p>
+    <w:p>
+      <w:pPr>
+        <w:rPr>
+          <w:lang w:val="en-US"/>
+        </w:rPr>
+      </w:pPr>
+      <w:proofErr w:type="spellStart"/>
+      <w:proofErr w:type="gramStart"/>
+      <w:r>
+        <w:rPr>
+          <w:lang w:val="en-US"/>
+        </w:rPr>
+        <w:t>output.writeObject</w:t>
+      </w:r>
+      <w:proofErr w:type="spellEnd"/>
+      <w:proofErr w:type="gramEnd"/>
+      <w:r>
+        <w:rPr>
+          <w:lang w:val="en-US"/>
+        </w:rPr>
+        <w:t>(data);</w:t>
       </w:r>
     </w:p>
     <w:p>
@@ -1467,7 +1315,36 @@
           <w:szCs w:val="24"/>
           <w:highlight w:val="green"/>
         </w:rPr>
-        <w:t>¿Y readObject()?</w:t>
+        <w:lastRenderedPageBreak/>
+        <w:t xml:space="preserve">¿Y </w:t>
+      </w:r>
+      <w:proofErr w:type="spellStart"/>
+      <w:proofErr w:type="gramStart"/>
+      <w:r>
+        <w:rPr>
+          <w:sz w:val="24"/>
+          <w:szCs w:val="24"/>
+          <w:highlight w:val="green"/>
+        </w:rPr>
+        <w:t>readObject</w:t>
+      </w:r>
+      <w:proofErr w:type="spellEnd"/>
+      <w:r>
+        <w:rPr>
+          <w:sz w:val="24"/>
+          <w:szCs w:val="24"/>
+          <w:highlight w:val="green"/>
+        </w:rPr>
+        <w:t>(</w:t>
+      </w:r>
+      <w:proofErr w:type="gramEnd"/>
+      <w:r>
+        <w:rPr>
+          <w:sz w:val="24"/>
+          <w:szCs w:val="24"/>
+          <w:highlight w:val="green"/>
+        </w:rPr>
+        <w:t>)?</w:t>
       </w:r>
     </w:p>
     <w:p>
@@ -1485,7 +1362,37 @@
         <w:rPr>
           <w:lang w:val="en-US"/>
         </w:rPr>
-        <w:t>Data data = (Data) input.readObject();</w:t>
+        <w:t xml:space="preserve">Data </w:t>
+      </w:r>
+      <w:proofErr w:type="spellStart"/>
+      <w:r>
+        <w:rPr>
+          <w:lang w:val="en-US"/>
+        </w:rPr>
+        <w:t>data</w:t>
+      </w:r>
+      <w:proofErr w:type="spellEnd"/>
+      <w:r>
+        <w:rPr>
+          <w:lang w:val="en-US"/>
+        </w:rPr>
+        <w:t xml:space="preserve"> = (Data) </w:t>
+      </w:r>
+      <w:proofErr w:type="spellStart"/>
+      <w:proofErr w:type="gramStart"/>
+      <w:r>
+        <w:rPr>
+          <w:lang w:val="en-US"/>
+        </w:rPr>
+        <w:t>input.readObject</w:t>
+      </w:r>
+      <w:proofErr w:type="spellEnd"/>
+      <w:proofErr w:type="gramEnd"/>
+      <w:r>
+        <w:rPr>
+          <w:lang w:val="en-US"/>
+        </w:rPr>
+        <w:t>();</w:t>
       </w:r>
     </w:p>
     <w:p>
@@ -1581,16 +1488,181 @@
         <w:rPr>
           <w:sz w:val="24"/>
           <w:szCs w:val="24"/>
-        </w:rPr>
-      </w:pPr>
-    </w:p>
-    <w:p>
-      <w:pPr>
-        <w:rPr>
-          <w:sz w:val="24"/>
-          <w:szCs w:val="24"/>
-        </w:rPr>
-      </w:pPr>
+          <w:u w:val="single"/>
+        </w:rPr>
+      </w:pPr>
+    </w:p>
+    <w:p>
+      <w:pPr>
+        <w:rPr>
+          <w:sz w:val="24"/>
+          <w:szCs w:val="24"/>
+        </w:rPr>
+      </w:pPr>
+      <w:r>
+        <w:rPr>
+          <w:sz w:val="24"/>
+          <w:szCs w:val="24"/>
+          <w:highlight w:val="magenta"/>
+        </w:rPr>
+        <w:t xml:space="preserve">Clase </w:t>
+      </w:r>
+      <w:proofErr w:type="spellStart"/>
+      <w:r>
+        <w:rPr>
+          <w:sz w:val="24"/>
+          <w:szCs w:val="24"/>
+          <w:highlight w:val="magenta"/>
+        </w:rPr>
+        <w:t>UsuarioServicio</w:t>
+      </w:r>
+      <w:proofErr w:type="spellEnd"/>
+      <w:r>
+        <w:rPr>
+          <w:sz w:val="24"/>
+          <w:szCs w:val="24"/>
+          <w:highlight w:val="magenta"/>
+        </w:rPr>
+        <w:t>:</w:t>
+      </w:r>
+    </w:p>
+    <w:p>
+      <w:pPr>
+        <w:rPr>
+          <w:sz w:val="24"/>
+          <w:szCs w:val="24"/>
+        </w:rPr>
+      </w:pPr>
+      <w:proofErr w:type="spellStart"/>
+      <w:r>
+        <w:rPr>
+          <w:sz w:val="24"/>
+          <w:szCs w:val="24"/>
+        </w:rPr>
+        <w:t>public</w:t>
+      </w:r>
+      <w:proofErr w:type="spellEnd"/>
+      <w:r>
+        <w:rPr>
+          <w:sz w:val="24"/>
+          <w:szCs w:val="24"/>
+        </w:rPr>
+        <w:t xml:space="preserve"> Usuario </w:t>
+      </w:r>
+      <w:proofErr w:type="spellStart"/>
+      <w:proofErr w:type="gramStart"/>
+      <w:r>
+        <w:rPr>
+          <w:sz w:val="24"/>
+          <w:szCs w:val="24"/>
+        </w:rPr>
+        <w:t>validarLogin</w:t>
+      </w:r>
+      <w:proofErr w:type="spellEnd"/>
+      <w:r>
+        <w:rPr>
+          <w:sz w:val="24"/>
+          <w:szCs w:val="24"/>
+        </w:rPr>
+        <w:t>(</w:t>
+      </w:r>
+      <w:proofErr w:type="gramEnd"/>
+      <w:r>
+        <w:rPr>
+          <w:sz w:val="24"/>
+          <w:szCs w:val="24"/>
+        </w:rPr>
+        <w:t xml:space="preserve">String </w:t>
+      </w:r>
+      <w:proofErr w:type="spellStart"/>
+      <w:r>
+        <w:rPr>
+          <w:sz w:val="24"/>
+          <w:szCs w:val="24"/>
+        </w:rPr>
+        <w:t>nombreUsuario</w:t>
+      </w:r>
+      <w:proofErr w:type="spellEnd"/>
+      <w:r>
+        <w:rPr>
+          <w:sz w:val="24"/>
+          <w:szCs w:val="24"/>
+        </w:rPr>
+        <w:t xml:space="preserve">, String </w:t>
+      </w:r>
+      <w:proofErr w:type="spellStart"/>
+      <w:proofErr w:type="gramStart"/>
+      <w:r>
+        <w:rPr>
+          <w:sz w:val="24"/>
+          <w:szCs w:val="24"/>
+        </w:rPr>
+        <w:t>password</w:t>
+      </w:r>
+      <w:proofErr w:type="spellEnd"/>
+      <w:r>
+        <w:rPr>
+          <w:sz w:val="24"/>
+          <w:szCs w:val="24"/>
+        </w:rPr>
+        <w:t>){</w:t>
+      </w:r>
+      <w:proofErr w:type="gramEnd"/>
+    </w:p>
+    <w:p>
+      <w:pPr>
+        <w:rPr>
+          <w:sz w:val="24"/>
+          <w:szCs w:val="24"/>
+        </w:rPr>
+      </w:pPr>
+      <w:r>
+        <w:rPr>
+          <w:sz w:val="24"/>
+          <w:szCs w:val="24"/>
+        </w:rPr>
+        <w:t xml:space="preserve">    </w:t>
+      </w:r>
+    </w:p>
+    <w:p>
+      <w:pPr>
+        <w:rPr>
+          <w:sz w:val="24"/>
+          <w:szCs w:val="24"/>
+        </w:rPr>
+      </w:pPr>
+      <w:r>
+        <w:rPr>
+          <w:sz w:val="24"/>
+          <w:szCs w:val="24"/>
+        </w:rPr>
+        <w:t xml:space="preserve">        </w:t>
+      </w:r>
+      <w:r>
+        <w:rPr>
+          <w:sz w:val="24"/>
+          <w:szCs w:val="24"/>
+        </w:rPr>
+        <w:t xml:space="preserve">for (Usuario </w:t>
+      </w:r>
+      <w:proofErr w:type="spellStart"/>
+      <w:proofErr w:type="gramStart"/>
+      <w:r>
+        <w:rPr>
+          <w:sz w:val="24"/>
+          <w:szCs w:val="24"/>
+        </w:rPr>
+        <w:t>usuario</w:t>
+      </w:r>
+      <w:proofErr w:type="spellEnd"/>
+      <w:r>
+        <w:rPr>
+          <w:sz w:val="24"/>
+          <w:szCs w:val="24"/>
+        </w:rPr>
+        <w:t xml:space="preserve"> :</w:t>
+      </w:r>
+      <w:proofErr w:type="gramEnd"/>
       <w:r>
         <w:rPr>
           <w:sz w:val="24"/>
@@ -1598,6 +1670,322 @@
         </w:rPr>
         <w:t xml:space="preserve"> </w:t>
       </w:r>
+      <w:proofErr w:type="spellStart"/>
+      <w:proofErr w:type="gramStart"/>
+      <w:r>
+        <w:rPr>
+          <w:sz w:val="24"/>
+          <w:szCs w:val="24"/>
+        </w:rPr>
+        <w:t>data.getUsuarios</w:t>
+      </w:r>
+      <w:proofErr w:type="spellEnd"/>
+      <w:proofErr w:type="gramEnd"/>
+      <w:r>
+        <w:rPr>
+          <w:sz w:val="24"/>
+          <w:szCs w:val="24"/>
+        </w:rPr>
+        <w:t>(</w:t>
+      </w:r>
+      <w:proofErr w:type="gramStart"/>
+      <w:r>
+        <w:rPr>
+          <w:sz w:val="24"/>
+          <w:szCs w:val="24"/>
+        </w:rPr>
+        <w:t>)){</w:t>
+      </w:r>
+      <w:proofErr w:type="gramEnd"/>
+    </w:p>
+    <w:p>
+      <w:pPr>
+        <w:rPr>
+          <w:sz w:val="24"/>
+          <w:szCs w:val="24"/>
+        </w:rPr>
+      </w:pPr>
+      <w:r>
+        <w:rPr>
+          <w:sz w:val="24"/>
+          <w:szCs w:val="24"/>
+        </w:rPr>
+        <w:t xml:space="preserve">                </w:t>
+      </w:r>
+    </w:p>
+    <w:p>
+      <w:pPr>
+        <w:rPr>
+          <w:sz w:val="24"/>
+          <w:szCs w:val="24"/>
+        </w:rPr>
+      </w:pPr>
+      <w:r>
+        <w:rPr>
+          <w:sz w:val="24"/>
+          <w:szCs w:val="24"/>
+        </w:rPr>
+        <w:t xml:space="preserve">            </w:t>
+      </w:r>
+      <w:proofErr w:type="spellStart"/>
+      <w:r>
+        <w:rPr>
+          <w:sz w:val="24"/>
+          <w:szCs w:val="24"/>
+        </w:rPr>
+        <w:t>if</w:t>
+      </w:r>
+      <w:proofErr w:type="spellEnd"/>
+      <w:r>
+        <w:rPr>
+          <w:sz w:val="24"/>
+          <w:szCs w:val="24"/>
+        </w:rPr>
+        <w:t>(</w:t>
+      </w:r>
+      <w:proofErr w:type="spellStart"/>
+      <w:proofErr w:type="gramStart"/>
+      <w:r>
+        <w:rPr>
+          <w:sz w:val="24"/>
+          <w:szCs w:val="24"/>
+        </w:rPr>
+        <w:t>usuario.getNombreUsuario</w:t>
+      </w:r>
+      <w:proofErr w:type="spellEnd"/>
+      <w:proofErr w:type="gramEnd"/>
+      <w:r>
+        <w:rPr>
+          <w:sz w:val="24"/>
+          <w:szCs w:val="24"/>
+        </w:rPr>
+        <w:t>(</w:t>
+      </w:r>
+      <w:proofErr w:type="gramStart"/>
+      <w:r>
+        <w:rPr>
+          <w:sz w:val="24"/>
+          <w:szCs w:val="24"/>
+        </w:rPr>
+        <w:t>).</w:t>
+      </w:r>
+      <w:proofErr w:type="spellStart"/>
+      <w:r>
+        <w:rPr>
+          <w:sz w:val="24"/>
+          <w:szCs w:val="24"/>
+        </w:rPr>
+        <w:t>equals</w:t>
+      </w:r>
+      <w:proofErr w:type="spellEnd"/>
+      <w:proofErr w:type="gramEnd"/>
+      <w:r>
+        <w:rPr>
+          <w:sz w:val="24"/>
+          <w:szCs w:val="24"/>
+        </w:rPr>
+        <w:t>(</w:t>
+      </w:r>
+      <w:proofErr w:type="spellStart"/>
+      <w:r>
+        <w:rPr>
+          <w:sz w:val="24"/>
+          <w:szCs w:val="24"/>
+        </w:rPr>
+        <w:t>nombreUsuario</w:t>
+      </w:r>
+      <w:proofErr w:type="spellEnd"/>
+      <w:r>
+        <w:rPr>
+          <w:sz w:val="24"/>
+          <w:szCs w:val="24"/>
+        </w:rPr>
+        <w:t>) &amp;&amp;</w:t>
+      </w:r>
+    </w:p>
+    <w:p>
+      <w:pPr>
+        <w:rPr>
+          <w:sz w:val="24"/>
+          <w:szCs w:val="24"/>
+          <w:lang w:val="en-US"/>
+        </w:rPr>
+      </w:pPr>
+      <w:r>
+        <w:rPr>
+          <w:sz w:val="24"/>
+          <w:szCs w:val="24"/>
+        </w:rPr>
+        <w:t xml:space="preserve">                    </w:t>
+      </w:r>
+      <w:proofErr w:type="spellStart"/>
+      <w:proofErr w:type="gramStart"/>
+      <w:r>
+        <w:rPr>
+          <w:sz w:val="24"/>
+          <w:szCs w:val="24"/>
+          <w:lang w:val="en-US"/>
+        </w:rPr>
+        <w:t>usuario.getPassword</w:t>
+      </w:r>
+      <w:proofErr w:type="spellEnd"/>
+      <w:proofErr w:type="gramEnd"/>
+      <w:r>
+        <w:rPr>
+          <w:sz w:val="24"/>
+          <w:szCs w:val="24"/>
+          <w:lang w:val="en-US"/>
+        </w:rPr>
+        <w:t>(</w:t>
+      </w:r>
+      <w:proofErr w:type="gramStart"/>
+      <w:r>
+        <w:rPr>
+          <w:sz w:val="24"/>
+          <w:szCs w:val="24"/>
+          <w:lang w:val="en-US"/>
+        </w:rPr>
+        <w:t>).equals</w:t>
+      </w:r>
+      <w:proofErr w:type="gramEnd"/>
+      <w:r>
+        <w:rPr>
+          <w:sz w:val="24"/>
+          <w:szCs w:val="24"/>
+          <w:lang w:val="en-US"/>
+        </w:rPr>
+        <w:t>(password</w:t>
+      </w:r>
+      <w:proofErr w:type="gramStart"/>
+      <w:r>
+        <w:rPr>
+          <w:sz w:val="24"/>
+          <w:szCs w:val="24"/>
+          <w:lang w:val="en-US"/>
+        </w:rPr>
+        <w:t>)){</w:t>
+      </w:r>
+      <w:proofErr w:type="gramEnd"/>
+    </w:p>
+    <w:p>
+      <w:pPr>
+        <w:rPr>
+          <w:sz w:val="24"/>
+          <w:szCs w:val="24"/>
+          <w:lang w:val="en-US"/>
+        </w:rPr>
+      </w:pPr>
+      <w:r>
+        <w:rPr>
+          <w:sz w:val="24"/>
+          <w:szCs w:val="24"/>
+          <w:lang w:val="en-US"/>
+        </w:rPr>
+        <w:t xml:space="preserve">            </w:t>
+      </w:r>
+    </w:p>
+    <w:p>
+      <w:pPr>
+        <w:rPr>
+          <w:sz w:val="24"/>
+          <w:szCs w:val="24"/>
+          <w:lang w:val="en-US"/>
+        </w:rPr>
+      </w:pPr>
+      <w:r>
+        <w:rPr>
+          <w:sz w:val="24"/>
+          <w:szCs w:val="24"/>
+          <w:lang w:val="en-US"/>
+        </w:rPr>
+        <w:t xml:space="preserve">                return </w:t>
+      </w:r>
+      <w:proofErr w:type="spellStart"/>
+      <w:r>
+        <w:rPr>
+          <w:sz w:val="24"/>
+          <w:szCs w:val="24"/>
+          <w:lang w:val="en-US"/>
+        </w:rPr>
+        <w:t>usuario</w:t>
+      </w:r>
+      <w:proofErr w:type="spellEnd"/>
+      <w:r>
+        <w:rPr>
+          <w:sz w:val="24"/>
+          <w:szCs w:val="24"/>
+          <w:lang w:val="en-US"/>
+        </w:rPr>
+        <w:t>;</w:t>
+      </w:r>
+    </w:p>
+    <w:p>
+      <w:pPr>
+        <w:rPr>
+          <w:sz w:val="24"/>
+          <w:szCs w:val="24"/>
+        </w:rPr>
+      </w:pPr>
+      <w:r>
+        <w:rPr>
+          <w:sz w:val="24"/>
+          <w:szCs w:val="24"/>
+          <w:lang w:val="en-US"/>
+        </w:rPr>
+        <w:t xml:space="preserve">            </w:t>
+      </w:r>
+      <w:r>
+        <w:rPr>
+          <w:sz w:val="24"/>
+          <w:szCs w:val="24"/>
+        </w:rPr>
+        <w:t>}</w:t>
+      </w:r>
+    </w:p>
+    <w:p>
+      <w:pPr>
+        <w:rPr>
+          <w:sz w:val="24"/>
+          <w:szCs w:val="24"/>
+        </w:rPr>
+      </w:pPr>
+      <w:r>
+        <w:rPr>
+          <w:sz w:val="24"/>
+          <w:szCs w:val="24"/>
+        </w:rPr>
+        <w:t xml:space="preserve">        }</w:t>
+      </w:r>
+    </w:p>
+    <w:p>
+      <w:pPr>
+        <w:rPr>
+          <w:sz w:val="24"/>
+          <w:szCs w:val="24"/>
+        </w:rPr>
+      </w:pPr>
+      <w:r>
+        <w:rPr>
+          <w:sz w:val="24"/>
+          <w:szCs w:val="24"/>
+        </w:rPr>
+        <w:t xml:space="preserve">        return null;</w:t>
+      </w:r>
+    </w:p>
+    <w:p>
+      <w:pPr>
+        <w:rPr>
+          <w:sz w:val="24"/>
+          <w:szCs w:val="24"/>
+        </w:rPr>
+      </w:pPr>
+      <w:r>
+        <w:rPr>
+          <w:sz w:val="24"/>
+          <w:szCs w:val="24"/>
+        </w:rPr>
+        <w:t xml:space="preserve">    }</w:t>
+      </w:r>
     </w:p>
     <w:p>
       <w:pPr>
@@ -1612,221 +2000,53 @@
           <w:szCs w:val="24"/>
           <w:highlight w:val="magenta"/>
         </w:rPr>
-        <w:lastRenderedPageBreak/>
-        <w:t>Clase UsuarioServicio:</w:t>
-      </w:r>
-    </w:p>
-    <w:p>
-      <w:pPr>
-        <w:rPr>
-          <w:sz w:val="24"/>
-          <w:szCs w:val="24"/>
-          <w:lang w:val="en-US"/>
-        </w:rPr>
-      </w:pPr>
-      <w:r>
-        <w:rPr>
-          <w:sz w:val="24"/>
-          <w:szCs w:val="24"/>
-          <w:lang w:val="en-US"/>
-        </w:rPr>
-        <w:t>public Usuario validarLogin(String nombreUsuario, String password){</w:t>
-      </w:r>
-    </w:p>
-    <w:p>
-      <w:pPr>
-        <w:rPr>
-          <w:sz w:val="24"/>
-          <w:szCs w:val="24"/>
-          <w:lang w:val="en-US"/>
-        </w:rPr>
-      </w:pPr>
-      <w:r>
-        <w:rPr>
-          <w:sz w:val="24"/>
-          <w:szCs w:val="24"/>
-          <w:lang w:val="en-US"/>
-        </w:rPr>
-        <w:t xml:space="preserve">    </w:t>
-      </w:r>
-    </w:p>
-    <w:p>
-      <w:pPr>
-        <w:rPr>
-          <w:sz w:val="24"/>
-          <w:szCs w:val="24"/>
-        </w:rPr>
-      </w:pPr>
-      <w:r>
-        <w:rPr>
-          <w:sz w:val="24"/>
-          <w:szCs w:val="24"/>
-          <w:lang w:val="en-US"/>
-        </w:rPr>
-        <w:t xml:space="preserve">        </w:t>
-      </w:r>
-      <w:r>
-        <w:rPr>
-          <w:sz w:val="24"/>
-          <w:szCs w:val="24"/>
-        </w:rPr>
-        <w:t>for (Usuario usuario : data.getUsuarios()){</w:t>
-      </w:r>
-    </w:p>
-    <w:p>
-      <w:pPr>
-        <w:rPr>
-          <w:sz w:val="24"/>
-          <w:szCs w:val="24"/>
-        </w:rPr>
-      </w:pPr>
-      <w:r>
-        <w:rPr>
-          <w:sz w:val="24"/>
-          <w:szCs w:val="24"/>
-        </w:rPr>
-        <w:t xml:space="preserve">                </w:t>
-      </w:r>
-    </w:p>
-    <w:p>
-      <w:pPr>
-        <w:rPr>
-          <w:sz w:val="24"/>
-          <w:szCs w:val="24"/>
-        </w:rPr>
-      </w:pPr>
-      <w:r>
-        <w:rPr>
-          <w:sz w:val="24"/>
-          <w:szCs w:val="24"/>
-        </w:rPr>
-        <w:t xml:space="preserve">            if(usuario.getNombreUsuario().equals(nombreUsuario) &amp;&amp;</w:t>
-      </w:r>
-    </w:p>
-    <w:p>
-      <w:pPr>
-        <w:rPr>
-          <w:sz w:val="24"/>
-          <w:szCs w:val="24"/>
-          <w:lang w:val="en-US"/>
-        </w:rPr>
-      </w:pPr>
-      <w:r>
-        <w:rPr>
-          <w:sz w:val="24"/>
-          <w:szCs w:val="24"/>
-        </w:rPr>
-        <w:t xml:space="preserve">                    </w:t>
-      </w:r>
-      <w:r>
-        <w:rPr>
-          <w:sz w:val="24"/>
-          <w:szCs w:val="24"/>
-          <w:lang w:val="en-US"/>
-        </w:rPr>
-        <w:t>usuario.getPassword().equals(password)){</w:t>
-      </w:r>
-    </w:p>
-    <w:p>
-      <w:pPr>
-        <w:rPr>
-          <w:sz w:val="24"/>
-          <w:szCs w:val="24"/>
-          <w:lang w:val="en-US"/>
-        </w:rPr>
-      </w:pPr>
-      <w:r>
-        <w:rPr>
-          <w:sz w:val="24"/>
-          <w:szCs w:val="24"/>
-          <w:lang w:val="en-US"/>
-        </w:rPr>
-        <w:t xml:space="preserve">            </w:t>
-      </w:r>
-    </w:p>
-    <w:p>
-      <w:pPr>
-        <w:rPr>
-          <w:sz w:val="24"/>
-          <w:szCs w:val="24"/>
-          <w:lang w:val="en-US"/>
-        </w:rPr>
-      </w:pPr>
-      <w:r>
-        <w:rPr>
-          <w:sz w:val="24"/>
-          <w:szCs w:val="24"/>
-          <w:lang w:val="en-US"/>
-        </w:rPr>
-        <w:t xml:space="preserve">                return usuario;</w:t>
-      </w:r>
-    </w:p>
-    <w:p>
-      <w:pPr>
-        <w:rPr>
-          <w:sz w:val="24"/>
-          <w:szCs w:val="24"/>
-        </w:rPr>
-      </w:pPr>
-      <w:r>
-        <w:rPr>
-          <w:sz w:val="24"/>
-          <w:szCs w:val="24"/>
-          <w:lang w:val="en-US"/>
-        </w:rPr>
-        <w:t xml:space="preserve">            </w:t>
-      </w:r>
-      <w:r>
-        <w:rPr>
-          <w:sz w:val="24"/>
-          <w:szCs w:val="24"/>
-        </w:rPr>
-        <w:t>}</w:t>
-      </w:r>
-    </w:p>
-    <w:p>
-      <w:pPr>
-        <w:rPr>
-          <w:sz w:val="24"/>
-          <w:szCs w:val="24"/>
-        </w:rPr>
-      </w:pPr>
-      <w:r>
-        <w:rPr>
-          <w:sz w:val="24"/>
-          <w:szCs w:val="24"/>
-        </w:rPr>
-        <w:t xml:space="preserve">        }</w:t>
-      </w:r>
-    </w:p>
-    <w:p>
-      <w:pPr>
-        <w:rPr>
-          <w:sz w:val="24"/>
-          <w:szCs w:val="24"/>
-        </w:rPr>
-      </w:pPr>
-      <w:r>
-        <w:rPr>
-          <w:sz w:val="24"/>
-          <w:szCs w:val="24"/>
-        </w:rPr>
-        <w:t xml:space="preserve">        return null;</w:t>
-      </w:r>
-    </w:p>
-    <w:p>
-      <w:pPr>
-        <w:rPr>
-          <w:sz w:val="24"/>
-          <w:szCs w:val="24"/>
-        </w:rPr>
-      </w:pPr>
-      <w:r>
-        <w:rPr>
-          <w:sz w:val="24"/>
-          <w:szCs w:val="24"/>
-        </w:rPr>
-        <w:t xml:space="preserve">    }</w:t>
+        <w:t>-</w:t>
+      </w:r>
+      <w:r>
+        <w:rPr>
+          <w:sz w:val="24"/>
+          <w:szCs w:val="24"/>
+        </w:rPr>
+        <w:t xml:space="preserve"> </w:t>
+      </w:r>
+      <w:r>
+        <w:rPr>
+          <w:sz w:val="24"/>
+          <w:szCs w:val="24"/>
+        </w:rPr>
+        <w:t>Este método r</w:t>
+      </w:r>
+      <w:r>
+        <w:rPr>
+          <w:sz w:val="24"/>
+          <w:szCs w:val="24"/>
+        </w:rPr>
+        <w:t xml:space="preserve">ecorre la lista de usuarios almacenada en Data. Para cada usuario compara el nombre de usuario y la contraseña utilizando el método </w:t>
+      </w:r>
+      <w:proofErr w:type="spellStart"/>
+      <w:proofErr w:type="gramStart"/>
+      <w:r>
+        <w:rPr>
+          <w:sz w:val="24"/>
+          <w:szCs w:val="24"/>
+        </w:rPr>
+        <w:t>equals</w:t>
+      </w:r>
+      <w:proofErr w:type="spellEnd"/>
+      <w:r>
+        <w:rPr>
+          <w:sz w:val="24"/>
+          <w:szCs w:val="24"/>
+        </w:rPr>
+        <w:t>(</w:t>
+      </w:r>
+      <w:proofErr w:type="gramEnd"/>
+      <w:r>
+        <w:rPr>
+          <w:sz w:val="24"/>
+          <w:szCs w:val="24"/>
+        </w:rPr>
+        <w:t>). Si encuentra un usuario cuyos datos coinciden, devuelve ese objeto Usuario. Si termina de recorrer la lista sin encontrar coincidencias, devuelve null.</w:t>
       </w:r>
     </w:p>
     <w:p>
@@ -1856,44 +2076,15 @@
           <w:sz w:val="24"/>
           <w:szCs w:val="24"/>
         </w:rPr>
-        <w:t>Este método r</w:t>
-      </w:r>
-      <w:r>
-        <w:rPr>
-          <w:sz w:val="24"/>
-          <w:szCs w:val="24"/>
-        </w:rPr>
-        <w:t>ecorre la lista de usuarios almacenada en Data. Para cada usuario compara el nombre de usuario y la contraseña utilizando el método equals(). Si encuentra un usuario cuyos datos coinciden, devuelve ese objeto Usuario. Si termina de recorrer la lista sin encontrar coincidencias, devuelve null.</w:t>
-      </w:r>
-    </w:p>
-    <w:p>
-      <w:pPr>
-        <w:rPr>
-          <w:sz w:val="24"/>
-          <w:szCs w:val="24"/>
-        </w:rPr>
-      </w:pPr>
-      <w:r>
-        <w:rPr>
-          <w:sz w:val="24"/>
-          <w:szCs w:val="24"/>
-          <w:highlight w:val="magenta"/>
-        </w:rPr>
-        <w:t>-</w:t>
-      </w:r>
-      <w:r>
-        <w:rPr>
-          <w:sz w:val="24"/>
-          <w:szCs w:val="24"/>
-        </w:rPr>
-        <w:t xml:space="preserve"> </w:t>
-      </w:r>
-      <w:r>
-        <w:rPr>
-          <w:sz w:val="24"/>
-          <w:szCs w:val="24"/>
-        </w:rPr>
-        <w:t xml:space="preserve">En Java, el método </w:t>
+        <w:t xml:space="preserve">En Java, el </w:t>
+      </w:r>
+      <w:proofErr w:type="gramStart"/>
+      <w:r>
+        <w:rPr>
+          <w:sz w:val="24"/>
+          <w:szCs w:val="24"/>
+        </w:rPr>
+        <w:t xml:space="preserve">método </w:t>
       </w:r>
       <w:r>
         <w:rPr>
@@ -1902,142 +2093,9 @@
           <w:sz w:val="24"/>
           <w:szCs w:val="24"/>
         </w:rPr>
-        <w:t>.equals() se utiliza para comparar si dos objetos son lógicamente iguales en función de su contenido o valor</w:t>
-      </w:r>
-      <w:r>
-        <w:rPr>
-          <w:sz w:val="24"/>
-          <w:szCs w:val="24"/>
-        </w:rPr>
-        <w:t xml:space="preserve">. </w:t>
-      </w:r>
-    </w:p>
-    <w:p>
-      <w:pPr>
-        <w:rPr>
-          <w:sz w:val="24"/>
-          <w:szCs w:val="24"/>
-        </w:rPr>
-      </w:pPr>
-      <w:r>
-        <w:rPr>
-          <w:sz w:val="24"/>
-          <w:szCs w:val="24"/>
-        </w:rPr>
-        <w:t>----------------------------------------------------------------------------------------------------------------------------------------------</w:t>
-      </w:r>
-    </w:p>
-    <w:p>
-      <w:pPr>
-        <w:rPr>
-          <w:sz w:val="24"/>
-          <w:szCs w:val="24"/>
-        </w:rPr>
-      </w:pPr>
-      <w:r>
-        <w:rPr>
-          <w:sz w:val="24"/>
-          <w:szCs w:val="24"/>
-          <w:highlight w:val="magenta"/>
-        </w:rPr>
-        <w:t>En MAIN:</w:t>
-      </w:r>
-    </w:p>
-    <w:p>
-      <w:pPr>
-        <w:rPr>
-          <w:sz w:val="24"/>
-          <w:szCs w:val="24"/>
-        </w:rPr>
-      </w:pPr>
-      <w:r>
-        <w:rPr>
-          <w:sz w:val="24"/>
-          <w:szCs w:val="24"/>
-        </w:rPr>
-        <w:t xml:space="preserve">FrmLogin login = new FrmLogin(data); </w:t>
-      </w:r>
-      <w:r>
-        <w:rPr>
-          <w:sz w:val="24"/>
-          <w:szCs w:val="24"/>
-          <w:lang w:val="en-US"/>
-        </w:rPr>
-        <w:sym w:font="Wingdings" w:char="F0E0"/>
-      </w:r>
-      <w:r>
-        <w:rPr>
-          <w:sz w:val="24"/>
-          <w:szCs w:val="24"/>
-        </w:rPr>
-        <w:t xml:space="preserve"> Crea el formulario y le entrega los datos del sistema.</w:t>
-      </w:r>
-    </w:p>
-    <w:p>
-      <w:pPr>
-        <w:rPr>
-          <w:sz w:val="24"/>
-          <w:szCs w:val="24"/>
-        </w:rPr>
-      </w:pPr>
-      <w:r>
-        <w:rPr>
-          <w:sz w:val="24"/>
-          <w:szCs w:val="24"/>
-        </w:rPr>
-        <w:t>login.setVisible(true);</w:t>
-      </w:r>
-      <w:r>
-        <w:rPr>
-          <w:sz w:val="24"/>
-          <w:szCs w:val="24"/>
-        </w:rPr>
-        <w:t xml:space="preserve"> </w:t>
-      </w:r>
-      <w:r>
-        <w:rPr>
-          <w:sz w:val="24"/>
-          <w:szCs w:val="24"/>
-        </w:rPr>
-        <w:sym w:font="Wingdings" w:char="F0E0"/>
-      </w:r>
-      <w:r>
-        <w:rPr>
-          <w:sz w:val="24"/>
-          <w:szCs w:val="24"/>
-        </w:rPr>
-        <w:t xml:space="preserve"> </w:t>
-      </w:r>
-      <w:r>
-        <w:rPr>
-          <w:sz w:val="24"/>
-          <w:szCs w:val="24"/>
-        </w:rPr>
-        <w:t>Hace visible el formulario.</w:t>
-      </w:r>
-    </w:p>
-    <w:p>
-      <w:pPr>
-        <w:rPr>
-          <w:sz w:val="24"/>
-          <w:szCs w:val="24"/>
-        </w:rPr>
-      </w:pPr>
-    </w:p>
-    <w:p>
-      <w:pPr>
-        <w:rPr>
-          <w:sz w:val="24"/>
-          <w:szCs w:val="24"/>
-        </w:rPr>
-      </w:pPr>
-      <w:r>
-        <w:rPr>
-          <w:sz w:val="24"/>
-          <w:szCs w:val="24"/>
-        </w:rPr>
-        <w:t xml:space="preserve">La clase </w:t>
-      </w:r>
+        <w:t>.</w:t>
+      </w:r>
+      <w:proofErr w:type="spellStart"/>
       <w:r>
         <w:rPr>
           <w:b/>
@@ -2045,63 +2103,197 @@
           <w:sz w:val="24"/>
           <w:szCs w:val="24"/>
         </w:rPr>
-        <w:t>Main</w:t>
-      </w:r>
-      <w:r>
-        <w:rPr>
-          <w:sz w:val="24"/>
-          <w:szCs w:val="24"/>
-        </w:rPr>
-        <w:t xml:space="preserve"> es el punto de entrada de la aplicación. Su responsabilidad es inicializar el sistema, cargando los datos almacenados mediante la clase Persistencia. En la primera ejecución verifica si existe al menos un usuario registrado; de no ser así, crea automáticamente un usuario administrador por defecto y guarda la información. Finalmente, instancia y muestra el formulario de inicio de sesión (FrmLogin), dando comienzo a la interacción con el usuario.</w:t>
-      </w:r>
-    </w:p>
-    <w:p>
-      <w:pPr>
-        <w:rPr>
-          <w:sz w:val="24"/>
-          <w:szCs w:val="24"/>
-        </w:rPr>
-      </w:pPr>
-      <w:r>
-        <w:rPr>
-          <w:sz w:val="24"/>
-          <w:szCs w:val="24"/>
-        </w:rPr>
-        <w:t>----------------------------------------------------------------------------------------------------------------------------------------------</w:t>
-      </w:r>
-    </w:p>
-    <w:p>
-      <w:pPr>
+        <w:t>equals</w:t>
+      </w:r>
+      <w:proofErr w:type="spellEnd"/>
+      <w:proofErr w:type="gramEnd"/>
+      <w:r>
         <w:rPr>
           <w:b/>
           <w:bCs/>
           <w:sz w:val="24"/>
           <w:szCs w:val="24"/>
         </w:rPr>
-      </w:pPr>
+        <w:t>() se utiliza para comparar si dos objetos son lógicamente iguales en función de su contenido o valor</w:t>
+      </w:r>
+      <w:r>
+        <w:rPr>
+          <w:sz w:val="24"/>
+          <w:szCs w:val="24"/>
+        </w:rPr>
+        <w:t xml:space="preserve">. </w:t>
+      </w:r>
+    </w:p>
+    <w:p>
+      <w:pPr>
+        <w:rPr>
+          <w:sz w:val="24"/>
+          <w:szCs w:val="24"/>
+        </w:rPr>
+      </w:pPr>
+    </w:p>
+    <w:p>
+      <w:pPr>
+        <w:rPr>
+          <w:sz w:val="24"/>
+          <w:szCs w:val="24"/>
+          <w:u w:val="single"/>
+        </w:rPr>
+      </w:pPr>
+      <w:r>
+        <w:rPr>
+          <w:sz w:val="24"/>
+          <w:szCs w:val="24"/>
+        </w:rPr>
+        <w:t xml:space="preserve">La clase </w:t>
+      </w:r>
+      <w:proofErr w:type="spellStart"/>
       <w:r>
         <w:rPr>
           <w:b/>
           <w:bCs/>
           <w:sz w:val="24"/>
           <w:szCs w:val="24"/>
+        </w:rPr>
+        <w:t>UsuarioServicio</w:t>
+      </w:r>
+      <w:proofErr w:type="spellEnd"/>
+      <w:r>
+        <w:rPr>
+          <w:sz w:val="24"/>
+          <w:szCs w:val="24"/>
+        </w:rPr>
+        <w:t xml:space="preserve"> concentra la lógica de negocio relacionada con los usuarios del sistema. Actualmente implementa el proceso de autenticación, validando que el nombre de usuario y la contraseña ingresados coincidan con un usuario registrado. De esta forma, separa la lógica de validación de la interfaz gráfica, facilitando el mantenimiento y la reutilización del código.</w:t>
+      </w:r>
+    </w:p>
+    <w:p>
+      <w:pPr>
+        <w:rPr>
+          <w:sz w:val="24"/>
+          <w:szCs w:val="24"/>
+        </w:rPr>
+      </w:pPr>
+      <w:r>
+        <w:rPr>
+          <w:sz w:val="24"/>
+          <w:szCs w:val="24"/>
+        </w:rPr>
+        <w:t>----------------------------------------------------------------------------------------------------------------------------------------------</w:t>
+      </w:r>
+    </w:p>
+    <w:p>
+      <w:pPr>
+        <w:rPr>
+          <w:sz w:val="24"/>
+          <w:szCs w:val="24"/>
+        </w:rPr>
+      </w:pPr>
+      <w:r>
+        <w:rPr>
+          <w:sz w:val="24"/>
+          <w:szCs w:val="24"/>
           <w:highlight w:val="magenta"/>
         </w:rPr>
-        <w:t>Clase UsuarioServicio</w:t>
-      </w:r>
-    </w:p>
-    <w:p>
-      <w:pPr>
-        <w:rPr>
-          <w:sz w:val="24"/>
-          <w:szCs w:val="24"/>
-        </w:rPr>
-      </w:pPr>
-      <w:r>
-        <w:rPr>
-          <w:sz w:val="24"/>
-          <w:szCs w:val="24"/>
-        </w:rPr>
+        <w:t>En MAIN:</w:t>
+      </w:r>
+    </w:p>
+    <w:p>
+      <w:pPr>
+        <w:rPr>
+          <w:sz w:val="24"/>
+          <w:szCs w:val="24"/>
+        </w:rPr>
+      </w:pPr>
+      <w:r>
+        <w:rPr>
+          <w:sz w:val="24"/>
+          <w:szCs w:val="24"/>
+        </w:rPr>
+        <w:t xml:space="preserve">FrmLogin login = new FrmLogin(data); </w:t>
+      </w:r>
+      <w:r>
+        <w:rPr>
+          <w:sz w:val="24"/>
+          <w:szCs w:val="24"/>
+          <w:lang w:val="en-US"/>
+        </w:rPr>
+        <w:sym w:font="Wingdings" w:char="F0E0"/>
+      </w:r>
+      <w:r>
+        <w:rPr>
+          <w:sz w:val="24"/>
+          <w:szCs w:val="24"/>
+        </w:rPr>
+        <w:t xml:space="preserve"> Crea el formulario y le entrega los datos del sistema.</w:t>
+      </w:r>
+    </w:p>
+    <w:p>
+      <w:pPr>
+        <w:rPr>
+          <w:sz w:val="24"/>
+          <w:szCs w:val="24"/>
+        </w:rPr>
+      </w:pPr>
+      <w:proofErr w:type="spellStart"/>
+      <w:proofErr w:type="gramStart"/>
+      <w:r>
+        <w:rPr>
+          <w:sz w:val="24"/>
+          <w:szCs w:val="24"/>
+        </w:rPr>
+        <w:t>login.setVisible</w:t>
+      </w:r>
+      <w:proofErr w:type="spellEnd"/>
+      <w:proofErr w:type="gramEnd"/>
+      <w:r>
+        <w:rPr>
+          <w:sz w:val="24"/>
+          <w:szCs w:val="24"/>
+        </w:rPr>
+        <w:t>(true);</w:t>
+      </w:r>
+      <w:r>
+        <w:rPr>
+          <w:sz w:val="24"/>
+          <w:szCs w:val="24"/>
+        </w:rPr>
+        <w:t xml:space="preserve"> </w:t>
+      </w:r>
+      <w:r>
+        <w:rPr>
+          <w:sz w:val="24"/>
+          <w:szCs w:val="24"/>
+        </w:rPr>
+        <w:sym w:font="Wingdings" w:char="F0E0"/>
+      </w:r>
+      <w:r>
+        <w:rPr>
+          <w:sz w:val="24"/>
+          <w:szCs w:val="24"/>
+        </w:rPr>
+        <w:t xml:space="preserve"> </w:t>
+      </w:r>
+      <w:r>
+        <w:rPr>
+          <w:sz w:val="24"/>
+          <w:szCs w:val="24"/>
+        </w:rPr>
+        <w:t>Hace visible el formulario.</w:t>
+      </w:r>
+    </w:p>
+    <w:p>
+      <w:pPr>
+        <w:rPr>
+          <w:sz w:val="24"/>
+          <w:szCs w:val="24"/>
+        </w:rPr>
+      </w:pPr>
+      <w:r>
+        <w:rPr>
+          <w:sz w:val="24"/>
+          <w:szCs w:val="24"/>
+        </w:rPr>
+        <w:lastRenderedPageBreak/>
         <w:t xml:space="preserve">La clase </w:t>
       </w:r>
       <w:r>
@@ -2111,14 +2303,14 @@
           <w:sz w:val="24"/>
           <w:szCs w:val="24"/>
         </w:rPr>
-        <w:t>UsuarioServicio</w:t>
-      </w:r>
-      <w:r>
-        <w:rPr>
-          <w:sz w:val="24"/>
-          <w:szCs w:val="24"/>
-        </w:rPr>
-        <w:t xml:space="preserve"> concentra la lógica de negocio relacionada con los usuarios del sistema. Actualmente implementa el proceso de autenticación, validando que el nombre de usuario y la contraseña ingresados coincidan con un usuario registrado. De esta forma, separa la lógica de validación de la interfaz gráfica, facilitando el mantenimiento y la reutilización del código.</w:t>
+        <w:t>Main</w:t>
+      </w:r>
+      <w:r>
+        <w:rPr>
+          <w:sz w:val="24"/>
+          <w:szCs w:val="24"/>
+        </w:rPr>
+        <w:t xml:space="preserve"> es el punto de entrada de la aplicación. Su responsabilidad es inicializar el sistema, cargando los datos almacenados mediante la clase Persistencia. En la primera ejecución verifica si existe al menos un usuario registrado; de no ser así, crea automáticamente un usuario administrador por defecto y guarda la información. Finalmente, instancia y muestra el formulario de inicio de sesión (FrmLogin), dando comienzo a la interacción con el usuario.</w:t>
       </w:r>
     </w:p>
     <w:p>
@@ -2145,48 +2337,37 @@
           <w:szCs w:val="24"/>
         </w:rPr>
       </w:pPr>
-    </w:p>
-    <w:p>
-      <w:pPr>
+      <w:r>
         <w:rPr>
           <w:b/>
           <w:bCs/>
           <w:sz w:val="24"/>
           <w:szCs w:val="24"/>
-        </w:rPr>
-      </w:pPr>
+          <w:highlight w:val="magenta"/>
+        </w:rPr>
+        <w:t>Clase FrmLogin</w:t>
+      </w:r>
+    </w:p>
+    <w:p>
+      <w:pPr>
+        <w:rPr>
+          <w:sz w:val="24"/>
+          <w:szCs w:val="24"/>
+        </w:rPr>
+      </w:pPr>
+      <w:r>
+        <w:rPr>
+          <w:sz w:val="24"/>
+          <w:szCs w:val="24"/>
+        </w:rPr>
+        <w:t xml:space="preserve">La clase </w:t>
+      </w:r>
       <w:r>
         <w:rPr>
           <w:b/>
           <w:bCs/>
           <w:sz w:val="24"/>
           <w:szCs w:val="24"/>
-          <w:highlight w:val="magenta"/>
-        </w:rPr>
-        <w:lastRenderedPageBreak/>
-        <w:t>Clase FrmLogin</w:t>
-      </w:r>
-    </w:p>
-    <w:p>
-      <w:pPr>
-        <w:rPr>
-          <w:sz w:val="24"/>
-          <w:szCs w:val="24"/>
-        </w:rPr>
-      </w:pPr>
-      <w:r>
-        <w:rPr>
-          <w:sz w:val="24"/>
-          <w:szCs w:val="24"/>
-        </w:rPr>
-        <w:t xml:space="preserve">La clase </w:t>
-      </w:r>
-      <w:r>
-        <w:rPr>
-          <w:b/>
-          <w:bCs/>
-          <w:sz w:val="24"/>
-          <w:szCs w:val="24"/>
         </w:rPr>
         <w:t>FrmLogin</w:t>
       </w:r>
@@ -2195,7 +2376,23 @@
           <w:sz w:val="24"/>
           <w:szCs w:val="24"/>
         </w:rPr>
-        <w:t xml:space="preserve"> representa la interfaz gráfica de inicio de sesión del sistema. Su función es solicitar al usuario el nombre de usuario y la contraseña, obtener la información ingresada y delegar la validación a la clase UsuarioServicio. Según el resultado de la autenticación, informa si el acceso fue exitoso o si las credenciales ingresadas son incorrectas. Esta clase pertenece a la capa de presentación y no contiene lógica de negocio.</w:t>
+        <w:t xml:space="preserve"> representa la interfaz gráfica de inicio de sesión del sistema. Su función es solicitar al usuario el nombre de usuario y la contraseña, obtener la información ingresada y delegar la validación a la clase </w:t>
+      </w:r>
+      <w:proofErr w:type="spellStart"/>
+      <w:r>
+        <w:rPr>
+          <w:sz w:val="24"/>
+          <w:szCs w:val="24"/>
+        </w:rPr>
+        <w:t>UsuarioServicio</w:t>
+      </w:r>
+      <w:proofErr w:type="spellEnd"/>
+      <w:r>
+        <w:rPr>
+          <w:sz w:val="24"/>
+          <w:szCs w:val="24"/>
+        </w:rPr>
+        <w:t>. Según el resultado de la autenticación, informa si el acceso fue exitoso o si las credenciales ingresadas son incorrectas. Esta clase pertenece a la capa de presentación y no contiene lógica de negocio.</w:t>
       </w:r>
     </w:p>
     <w:p>
@@ -2226,12 +2423,48 @@
           <w:szCs w:val="28"/>
           <w:highlight w:val="yellow"/>
         </w:rPr>
-        <w:t>¿Qué necesita FrmPrincipal?</w:t>
-      </w:r>
-    </w:p>
-    <w:p>
-      <w:r>
-        <w:t>public FrmPrincipal(Data data, Usuario usuario)</w:t>
+        <w:t xml:space="preserve">¿Qué necesita </w:t>
+      </w:r>
+      <w:proofErr w:type="spellStart"/>
+      <w:r>
+        <w:rPr>
+          <w:sz w:val="28"/>
+          <w:szCs w:val="28"/>
+          <w:highlight w:val="yellow"/>
+        </w:rPr>
+        <w:t>FrmPrincipal</w:t>
+      </w:r>
+      <w:proofErr w:type="spellEnd"/>
+      <w:r>
+        <w:rPr>
+          <w:sz w:val="28"/>
+          <w:szCs w:val="28"/>
+          <w:highlight w:val="yellow"/>
+        </w:rPr>
+        <w:t>?</w:t>
+      </w:r>
+    </w:p>
+    <w:p>
+      <w:proofErr w:type="spellStart"/>
+      <w:r>
+        <w:t>public</w:t>
+      </w:r>
+      <w:proofErr w:type="spellEnd"/>
+      <w:r>
+        <w:t xml:space="preserve"> </w:t>
+      </w:r>
+      <w:proofErr w:type="spellStart"/>
+      <w:proofErr w:type="gramStart"/>
+      <w:r>
+        <w:t>FrmPrincipal</w:t>
+      </w:r>
+      <w:proofErr w:type="spellEnd"/>
+      <w:r>
+        <w:t>(</w:t>
+      </w:r>
+      <w:proofErr w:type="gramEnd"/>
+      <w:r>
+        <w:t>Data data, Usuario usuario)</w:t>
       </w:r>
     </w:p>
     <w:p>
@@ -2272,13 +2505,29 @@
         <w:sym w:font="Wingdings" w:char="F0E0"/>
       </w:r>
       <w:r>
-        <w:t xml:space="preserve"> FrmLogin(Data) </w:t>
+        <w:t xml:space="preserve"> </w:t>
+      </w:r>
+      <w:proofErr w:type="gramStart"/>
+      <w:r>
+        <w:t>FrmLogin(</w:t>
+      </w:r>
+      <w:proofErr w:type="gramEnd"/>
+      <w:r>
+        <w:t xml:space="preserve">Data) </w:t>
       </w:r>
       <w:r>
         <w:sym w:font="Wingdings" w:char="F0E0"/>
       </w:r>
       <w:r>
-        <w:t xml:space="preserve"> UsuarioServicio </w:t>
+        <w:t xml:space="preserve"> </w:t>
+      </w:r>
+      <w:proofErr w:type="spellStart"/>
+      <w:r>
+        <w:t>UsuarioServicio</w:t>
+      </w:r>
+      <w:proofErr w:type="spellEnd"/>
+      <w:r>
+        <w:t xml:space="preserve"> </w:t>
       </w:r>
       <w:r>
         <w:sym w:font="Wingdings" w:char="F0E0"/>
@@ -2290,7 +2539,20 @@
         <w:sym w:font="Wingdings" w:char="F0E0"/>
       </w:r>
       <w:r>
-        <w:t xml:space="preserve"> FrmPrincipal(Data, Usuario)</w:t>
+        <w:t xml:space="preserve"> </w:t>
+      </w:r>
+      <w:proofErr w:type="spellStart"/>
+      <w:proofErr w:type="gramStart"/>
+      <w:r>
+        <w:t>FrmPrincipal</w:t>
+      </w:r>
+      <w:proofErr w:type="spellEnd"/>
+      <w:r>
+        <w:t>(</w:t>
+      </w:r>
+      <w:proofErr w:type="gramEnd"/>
+      <w:r>
+        <w:t>Data, Usuario)</w:t>
       </w:r>
     </w:p>
     <w:p/>
@@ -2346,8 +2608,42 @@
       </w:r>
     </w:p>
     <w:p>
-      <w:r>
-        <w:t>public boolean agregar(Categoria categoria) {</w:t>
+      <w:proofErr w:type="spellStart"/>
+      <w:r>
+        <w:t>public</w:t>
+      </w:r>
+      <w:proofErr w:type="spellEnd"/>
+      <w:r>
+        <w:t xml:space="preserve"> </w:t>
+      </w:r>
+      <w:proofErr w:type="spellStart"/>
+      <w:r>
+        <w:t>boolean</w:t>
+      </w:r>
+      <w:proofErr w:type="spellEnd"/>
+      <w:r>
+        <w:t xml:space="preserve"> </w:t>
+      </w:r>
+      <w:proofErr w:type="gramStart"/>
+      <w:r>
+        <w:t>agregar(</w:t>
+      </w:r>
+      <w:proofErr w:type="spellStart"/>
+      <w:proofErr w:type="gramEnd"/>
+      <w:r>
+        <w:t>Categoria</w:t>
+      </w:r>
+      <w:proofErr w:type="spellEnd"/>
+      <w:r>
+        <w:t xml:space="preserve"> </w:t>
+      </w:r>
+      <w:proofErr w:type="spellStart"/>
+      <w:r>
+        <w:t>categoria</w:t>
+      </w:r>
+      <w:proofErr w:type="spellEnd"/>
+      <w:r>
+        <w:t>) {</w:t>
       </w:r>
     </w:p>
     <w:p>
@@ -2357,7 +2653,15 @@
     </w:p>
     <w:p>
       <w:r>
-        <w:t>Recibe un objeto Categoria y devuelve:</w:t>
+        <w:t xml:space="preserve">Recibe un objeto </w:t>
+      </w:r>
+      <w:proofErr w:type="spellStart"/>
+      <w:r>
+        <w:t>Categoria</w:t>
+      </w:r>
+      <w:proofErr w:type="spellEnd"/>
+      <w:r>
+        <w:t xml:space="preserve"> y devuelve:</w:t>
       </w:r>
     </w:p>
     <w:p>
@@ -2441,7 +2745,51 @@
         <w:rPr>
           <w:lang w:val="en-US"/>
         </w:rPr>
-        <w:t>for (Categoria c : data.getCategorias()) {</w:t>
+        <w:t>for (</w:t>
+      </w:r>
+      <w:proofErr w:type="spellStart"/>
+      <w:r>
+        <w:rPr>
+          <w:lang w:val="en-US"/>
+        </w:rPr>
+        <w:t>Categoria</w:t>
+      </w:r>
+      <w:proofErr w:type="spellEnd"/>
+      <w:r>
+        <w:rPr>
+          <w:lang w:val="en-US"/>
+        </w:rPr>
+        <w:t xml:space="preserve"> </w:t>
+      </w:r>
+      <w:proofErr w:type="gramStart"/>
+      <w:r>
+        <w:rPr>
+          <w:lang w:val="en-US"/>
+        </w:rPr>
+        <w:t>c :</w:t>
+      </w:r>
+      <w:proofErr w:type="gramEnd"/>
+      <w:r>
+        <w:rPr>
+          <w:lang w:val="en-US"/>
+        </w:rPr>
+        <w:t xml:space="preserve"> </w:t>
+      </w:r>
+      <w:proofErr w:type="spellStart"/>
+      <w:proofErr w:type="gramStart"/>
+      <w:r>
+        <w:rPr>
+          <w:lang w:val="en-US"/>
+        </w:rPr>
+        <w:t>data.getCategorias</w:t>
+      </w:r>
+      <w:proofErr w:type="spellEnd"/>
+      <w:proofErr w:type="gramEnd"/>
+      <w:r>
+        <w:rPr>
+          <w:lang w:val="en-US"/>
+        </w:rPr>
+        <w:t>()) {</w:t>
       </w:r>
     </w:p>
     <w:p>
@@ -2460,7 +2808,39 @@
         <w:rPr>
           <w:lang w:val="en-US"/>
         </w:rPr>
-        <w:t>if (c.getId() == categoria.getId()) {</w:t>
+        <w:t>if (</w:t>
+      </w:r>
+      <w:proofErr w:type="spellStart"/>
+      <w:proofErr w:type="gramStart"/>
+      <w:r>
+        <w:rPr>
+          <w:lang w:val="en-US"/>
+        </w:rPr>
+        <w:t>c.getId</w:t>
+      </w:r>
+      <w:proofErr w:type="spellEnd"/>
+      <w:proofErr w:type="gramEnd"/>
+      <w:r>
+        <w:rPr>
+          <w:lang w:val="en-US"/>
+        </w:rPr>
+        <w:t xml:space="preserve">() == </w:t>
+      </w:r>
+      <w:proofErr w:type="spellStart"/>
+      <w:proofErr w:type="gramStart"/>
+      <w:r>
+        <w:rPr>
+          <w:lang w:val="en-US"/>
+        </w:rPr>
+        <w:t>categoria.getId</w:t>
+      </w:r>
+      <w:proofErr w:type="spellEnd"/>
+      <w:proofErr w:type="gramEnd"/>
+      <w:r>
+        <w:rPr>
+          <w:lang w:val="en-US"/>
+        </w:rPr>
+        <w:t>()) {</w:t>
       </w:r>
       <w:r>
         <w:rPr>
@@ -2495,11 +2875,49 @@
           <w:lang w:val="en-US"/>
         </w:rPr>
       </w:pPr>
-      <w:r>
-        <w:rPr>
-          <w:lang w:val="en-US"/>
-        </w:rPr>
-        <w:t>data.getCategorias().add(categoria);</w:t>
+      <w:proofErr w:type="spellStart"/>
+      <w:proofErr w:type="gramStart"/>
+      <w:r>
+        <w:rPr>
+          <w:lang w:val="en-US"/>
+        </w:rPr>
+        <w:t>data.getCategorias</w:t>
+      </w:r>
+      <w:proofErr w:type="spellEnd"/>
+      <w:proofErr w:type="gramEnd"/>
+      <w:r>
+        <w:rPr>
+          <w:lang w:val="en-US"/>
+        </w:rPr>
+        <w:t>(</w:t>
+      </w:r>
+      <w:proofErr w:type="gramStart"/>
+      <w:r>
+        <w:rPr>
+          <w:lang w:val="en-US"/>
+        </w:rPr>
+        <w:t>).add</w:t>
+      </w:r>
+      <w:proofErr w:type="gramEnd"/>
+      <w:r>
+        <w:rPr>
+          <w:lang w:val="en-US"/>
+        </w:rPr>
+        <w:t>(</w:t>
+      </w:r>
+      <w:proofErr w:type="spellStart"/>
+      <w:r>
+        <w:rPr>
+          <w:lang w:val="en-US"/>
+        </w:rPr>
+        <w:t>categoria</w:t>
+      </w:r>
+      <w:proofErr w:type="spellEnd"/>
+      <w:r>
+        <w:rPr>
+          <w:lang w:val="en-US"/>
+        </w:rPr>
+        <w:t>);</w:t>
       </w:r>
     </w:p>
     <w:p>
@@ -2509,11 +2927,20 @@
           <w:lang w:val="en-US"/>
         </w:rPr>
       </w:pPr>
-      <w:r>
-        <w:rPr>
-          <w:lang w:val="en-US"/>
-        </w:rPr>
-        <w:t>Persistencia.guardar(data);</w:t>
+      <w:proofErr w:type="spellStart"/>
+      <w:r>
+        <w:rPr>
+          <w:lang w:val="en-US"/>
+        </w:rPr>
+        <w:lastRenderedPageBreak/>
+        <w:t>Persistencia.guardar</w:t>
+      </w:r>
+      <w:proofErr w:type="spellEnd"/>
+      <w:r>
+        <w:rPr>
+          <w:lang w:val="en-US"/>
+        </w:rPr>
+        <w:t>(data);</w:t>
       </w:r>
     </w:p>
     <w:p>
@@ -2539,6 +2966,415 @@
         <w:t>Comparamos los enteros con == para ver si ya existe un ID registrado igual al ingresado, si existe retorna false, si no existe sale del bucle, se guarda y retorna true.</w:t>
       </w:r>
     </w:p>
+    <w:p>
+      <w:r>
+        <w:t>-----------------------------------------------------------------------------------------------------------------------------------------------------------</w:t>
+      </w:r>
+    </w:p>
+    <w:p>
+      <w:pPr>
+        <w:rPr>
+          <w:b/>
+          <w:bCs/>
+          <w:color w:val="EE0000"/>
+          <w:sz w:val="28"/>
+          <w:szCs w:val="28"/>
+        </w:rPr>
+      </w:pPr>
+      <w:r>
+        <w:rPr>
+          <w:b/>
+          <w:bCs/>
+          <w:color w:val="EE0000"/>
+          <w:sz w:val="28"/>
+          <w:szCs w:val="28"/>
+        </w:rPr>
+        <w:t>VISTAS EN FRM:</w:t>
+      </w:r>
+    </w:p>
+    <w:p>
+      <w:pPr>
+        <w:rPr>
+          <w:b/>
+          <w:bCs/>
+        </w:rPr>
+      </w:pPr>
+      <w:proofErr w:type="spellStart"/>
+      <w:r>
+        <w:rPr>
+          <w:b/>
+          <w:bCs/>
+          <w:highlight w:val="yellow"/>
+        </w:rPr>
+        <w:t>JOptionPane</w:t>
+      </w:r>
+      <w:proofErr w:type="spellEnd"/>
+      <w:r>
+        <w:rPr>
+          <w:b/>
+          <w:bCs/>
+        </w:rPr>
+        <w:t xml:space="preserve"> </w:t>
+      </w:r>
+      <w:r>
+        <w:t xml:space="preserve">Es una clase de Swing que sirve para </w:t>
+      </w:r>
+      <w:r>
+        <w:rPr>
+          <w:b/>
+          <w:bCs/>
+        </w:rPr>
+        <w:t>mostrar ventanas de diálogo</w:t>
+      </w:r>
+      <w:r>
+        <w:t>.</w:t>
+      </w:r>
+    </w:p>
+    <w:p>
+      <w:r>
+        <w:t>Nosotros la usamos para:</w:t>
+      </w:r>
+    </w:p>
+    <w:p>
+      <w:pPr>
+        <w:numPr>
+          <w:ilvl w:val="0"/>
+          <w:numId w:val="11"/>
+        </w:numPr>
+      </w:pPr>
+      <w:r>
+        <w:t xml:space="preserve">Mostrar errores. </w:t>
+      </w:r>
+      <w:r>
+        <w:t xml:space="preserve"> </w:t>
+      </w:r>
+      <w:proofErr w:type="spellStart"/>
+      <w:r>
+        <w:t>JOptionPane.showMessageDialog</w:t>
+      </w:r>
+      <w:proofErr w:type="spellEnd"/>
+      <w:r>
+        <w:t>(...)</w:t>
+      </w:r>
+    </w:p>
+    <w:p>
+      <w:pPr>
+        <w:numPr>
+          <w:ilvl w:val="0"/>
+          <w:numId w:val="12"/>
+        </w:numPr>
+      </w:pPr>
+      <w:r>
+        <w:t xml:space="preserve">Mostrar mensajes de éxito. </w:t>
+      </w:r>
+      <w:r>
+        <w:t xml:space="preserve"> </w:t>
+      </w:r>
+      <w:proofErr w:type="spellStart"/>
+      <w:r>
+        <w:t>JOptionPane.showMessageDialog</w:t>
+      </w:r>
+      <w:proofErr w:type="spellEnd"/>
+      <w:r>
+        <w:t>(...)</w:t>
+      </w:r>
+    </w:p>
+    <w:p>
+      <w:pPr>
+        <w:numPr>
+          <w:ilvl w:val="0"/>
+          <w:numId w:val="13"/>
+        </w:numPr>
+      </w:pPr>
+      <w:r>
+        <w:t xml:space="preserve">Pedir confirmación. </w:t>
+      </w:r>
+      <w:r>
+        <w:t xml:space="preserve"> </w:t>
+      </w:r>
+      <w:proofErr w:type="spellStart"/>
+      <w:r>
+        <w:t>JOptionPane.showConfirmDialog</w:t>
+      </w:r>
+      <w:proofErr w:type="spellEnd"/>
+      <w:r>
+        <w:t>(...)</w:t>
+      </w:r>
+    </w:p>
+    <w:p>
+      <w:r>
+        <w:t>Por ejemplo:</w:t>
+      </w:r>
+    </w:p>
+    <w:p>
+      <w:proofErr w:type="spellStart"/>
+      <w:r>
+        <w:t>JOptionPane.showMessageDialog</w:t>
+      </w:r>
+      <w:proofErr w:type="spellEnd"/>
+      <w:r>
+        <w:t>(</w:t>
+      </w:r>
+      <w:r>
+        <w:br/>
+        <w:t xml:space="preserve">    this,</w:t>
+      </w:r>
+      <w:r>
+        <w:br/>
+        <w:t xml:space="preserve">    "Producto registrado correctamente."</w:t>
+      </w:r>
+      <w:r>
+        <w:br/>
+        <w:t>);</w:t>
+      </w:r>
+    </w:p>
+    <w:p>
+      <w:r>
+        <w:t>Muestra una ventana emergente informando al usuario.</w:t>
+      </w:r>
+    </w:p>
+    <w:p>
+      <w:r>
+        <w:t xml:space="preserve">"Es una clase de Swing que permite mostrar cuadros de diálogo al usuario, por </w:t>
+      </w:r>
+      <w:proofErr w:type="gramStart"/>
+      <w:r>
+        <w:t>ejemplo</w:t>
+      </w:r>
+      <w:proofErr w:type="gramEnd"/>
+      <w:r>
+        <w:t xml:space="preserve"> para informar errores, confirmar acciones o mostrar mensajes de éxito."</w:t>
+      </w:r>
+    </w:p>
+    <w:p/>
+    <w:p>
+      <w:pPr>
+        <w:rPr>
+          <w:b/>
+          <w:bCs/>
+        </w:rPr>
+      </w:pPr>
+      <w:proofErr w:type="spellStart"/>
+      <w:r>
+        <w:rPr>
+          <w:b/>
+          <w:bCs/>
+          <w:highlight w:val="yellow"/>
+        </w:rPr>
+        <w:t>DefaultTableModel</w:t>
+      </w:r>
+      <w:proofErr w:type="spellEnd"/>
+    </w:p>
+    <w:p>
+      <w:r>
+        <w:t xml:space="preserve">Es la clase que </w:t>
+      </w:r>
+      <w:r>
+        <w:rPr>
+          <w:b/>
+          <w:bCs/>
+        </w:rPr>
+        <w:t xml:space="preserve">maneja los datos de un </w:t>
+      </w:r>
+      <w:proofErr w:type="spellStart"/>
+      <w:r>
+        <w:rPr>
+          <w:b/>
+          <w:bCs/>
+        </w:rPr>
+        <w:t>JTable</w:t>
+      </w:r>
+      <w:proofErr w:type="spellEnd"/>
+      <w:r>
+        <w:t>.</w:t>
+      </w:r>
+    </w:p>
+    <w:p>
+      <w:r>
+        <w:t xml:space="preserve">La tabla solo muestra información, pero quien agrega, elimina o modifica las filas es el </w:t>
+      </w:r>
+      <w:proofErr w:type="spellStart"/>
+      <w:r>
+        <w:t>DefaultTableModel</w:t>
+      </w:r>
+      <w:proofErr w:type="spellEnd"/>
+      <w:r>
+        <w:t>.</w:t>
+      </w:r>
+    </w:p>
+    <w:p>
+      <w:r>
+        <w:t>Por ejemplo:</w:t>
+      </w:r>
+    </w:p>
+    <w:p>
+      <w:proofErr w:type="spellStart"/>
+      <w:r>
+        <w:t>DefaultTableModel</w:t>
+      </w:r>
+      <w:proofErr w:type="spellEnd"/>
+      <w:r>
+        <w:t xml:space="preserve"> modelo =</w:t>
+      </w:r>
+      <w:r>
+        <w:br/>
+        <w:t xml:space="preserve">     </w:t>
+      </w:r>
+      <w:proofErr w:type="gramStart"/>
+      <w:r>
+        <w:t xml:space="preserve">   (</w:t>
+      </w:r>
+      <w:proofErr w:type="spellStart"/>
+      <w:proofErr w:type="gramEnd"/>
+      <w:r>
+        <w:t>DefaultTableModel</w:t>
+      </w:r>
+      <w:proofErr w:type="spellEnd"/>
+      <w:r>
+        <w:t xml:space="preserve">) </w:t>
+      </w:r>
+      <w:proofErr w:type="spellStart"/>
+      <w:r>
+        <w:t>tblProductos.getModel</w:t>
+      </w:r>
+      <w:proofErr w:type="spellEnd"/>
+      <w:r>
+        <w:t>();</w:t>
+      </w:r>
+    </w:p>
+    <w:p>
+      <w:r>
+        <w:t>Obtiene el modelo de la tabla.</w:t>
+      </w:r>
+    </w:p>
+    <w:p>
+      <w:pPr>
+        <w:rPr>
+          <w:u w:val="single"/>
+        </w:rPr>
+      </w:pPr>
+      <w:r>
+        <w:rPr>
+          <w:u w:val="single"/>
+        </w:rPr>
+        <w:t>Luego:</w:t>
+      </w:r>
+    </w:p>
+    <w:p>
+      <w:proofErr w:type="spellStart"/>
+      <w:proofErr w:type="gramStart"/>
+      <w:r>
+        <w:t>modelo.setRowCount</w:t>
+      </w:r>
+      <w:proofErr w:type="spellEnd"/>
+      <w:proofErr w:type="gramEnd"/>
+      <w:r>
+        <w:t>(0);</w:t>
+      </w:r>
+    </w:p>
+    <w:p>
+      <w:r>
+        <w:t>Borra todas las filas.</w:t>
+      </w:r>
+    </w:p>
+    <w:p>
+      <w:r>
+        <w:t>Y después:</w:t>
+      </w:r>
+    </w:p>
+    <w:p>
+      <w:proofErr w:type="spellStart"/>
+      <w:proofErr w:type="gramStart"/>
+      <w:r>
+        <w:t>modelo.addRow</w:t>
+      </w:r>
+      <w:proofErr w:type="spellEnd"/>
+      <w:proofErr w:type="gramEnd"/>
+      <w:r>
+        <w:t xml:space="preserve">(new </w:t>
+      </w:r>
+      <w:proofErr w:type="spellStart"/>
+      <w:proofErr w:type="gramStart"/>
+      <w:r>
+        <w:t>Object</w:t>
+      </w:r>
+      <w:proofErr w:type="spellEnd"/>
+      <w:r>
+        <w:t>[]{</w:t>
+      </w:r>
+      <w:proofErr w:type="gramEnd"/>
+      <w:r>
+        <w:br/>
+        <w:t xml:space="preserve">    </w:t>
+      </w:r>
+      <w:proofErr w:type="spellStart"/>
+      <w:proofErr w:type="gramStart"/>
+      <w:r>
+        <w:t>producto.getId</w:t>
+      </w:r>
+      <w:proofErr w:type="spellEnd"/>
+      <w:proofErr w:type="gramEnd"/>
+      <w:r>
+        <w:t>(),</w:t>
+      </w:r>
+      <w:r>
+        <w:br/>
+        <w:t xml:space="preserve">    </w:t>
+      </w:r>
+      <w:proofErr w:type="spellStart"/>
+      <w:proofErr w:type="gramStart"/>
+      <w:r>
+        <w:t>producto.getNombre</w:t>
+      </w:r>
+      <w:proofErr w:type="spellEnd"/>
+      <w:proofErr w:type="gramEnd"/>
+      <w:r>
+        <w:t>(),</w:t>
+      </w:r>
+      <w:r>
+        <w:br/>
+        <w:t xml:space="preserve">    </w:t>
+      </w:r>
+      <w:proofErr w:type="spellStart"/>
+      <w:proofErr w:type="gramStart"/>
+      <w:r>
+        <w:t>producto.getPrecio</w:t>
+      </w:r>
+      <w:proofErr w:type="spellEnd"/>
+      <w:proofErr w:type="gramEnd"/>
+      <w:r>
+        <w:t>()</w:t>
+      </w:r>
+      <w:r>
+        <w:br/>
+        <w:t>});</w:t>
+      </w:r>
+    </w:p>
+    <w:p>
+      <w:r>
+        <w:t>Agrega una nueva fila.</w:t>
+      </w:r>
+    </w:p>
+    <w:p>
+      <w:r>
+        <w:lastRenderedPageBreak/>
+        <w:t xml:space="preserve">"Es el modelo de datos de un </w:t>
+      </w:r>
+      <w:proofErr w:type="spellStart"/>
+      <w:r>
+        <w:t>JTable</w:t>
+      </w:r>
+      <w:proofErr w:type="spellEnd"/>
+      <w:r>
+        <w:t>. Lo utilicé para cargar, actualizar y eliminar filas de las tablas que muestran los registros del sistema."</w:t>
+      </w:r>
+    </w:p>
+    <w:p>
+      <w:r>
+        <w:t>-----------------------------------------------------------------------------------------------------------------------------------------------------------</w:t>
+      </w:r>
+    </w:p>
+    <w:p/>
     <w:sectPr>
       <w:pgSz w:w="11906" w:h="16838"/>
       <w:pgMar w:top="720" w:right="720" w:bottom="720" w:left="720" w:header="708" w:footer="708" w:gutter="0"/>
@@ -2701,6 +3537,155 @@
     </w:lvl>
   </w:abstractNum>
   <w:abstractNum w:abstractNumId="1" w15:restartNumberingAfterBreak="0">
+    <w:nsid w:val="0C2C2413"/>
+    <w:multiLevelType w:val="multilevel"/>
+    <w:tmpl w:val="4C84D68C"/>
+    <w:lvl w:ilvl="0">
+      <w:start w:val="1"/>
+      <w:numFmt w:val="bullet"/>
+      <w:lvlText w:val=""/>
+      <w:lvlJc w:val="left"/>
+      <w:pPr>
+        <w:tabs>
+          <w:tab w:val="num" w:pos="720"/>
+        </w:tabs>
+        <w:ind w:left="720" w:hanging="360"/>
+      </w:pPr>
+      <w:rPr>
+        <w:rFonts w:ascii="Symbol" w:hAnsi="Symbol" w:hint="default"/>
+        <w:sz w:val="20"/>
+      </w:rPr>
+    </w:lvl>
+    <w:lvl w:ilvl="1" w:tentative="1">
+      <w:start w:val="1"/>
+      <w:numFmt w:val="bullet"/>
+      <w:lvlText w:val="o"/>
+      <w:lvlJc w:val="left"/>
+      <w:pPr>
+        <w:tabs>
+          <w:tab w:val="num" w:pos="1440"/>
+        </w:tabs>
+        <w:ind w:left="1440" w:hanging="360"/>
+      </w:pPr>
+      <w:rPr>
+        <w:rFonts w:ascii="Courier New" w:hAnsi="Courier New" w:hint="default"/>
+        <w:sz w:val="20"/>
+      </w:rPr>
+    </w:lvl>
+    <w:lvl w:ilvl="2" w:tentative="1">
+      <w:start w:val="1"/>
+      <w:numFmt w:val="bullet"/>
+      <w:lvlText w:val=""/>
+      <w:lvlJc w:val="left"/>
+      <w:pPr>
+        <w:tabs>
+          <w:tab w:val="num" w:pos="2160"/>
+        </w:tabs>
+        <w:ind w:left="2160" w:hanging="360"/>
+      </w:pPr>
+      <w:rPr>
+        <w:rFonts w:ascii="Wingdings" w:hAnsi="Wingdings" w:hint="default"/>
+        <w:sz w:val="20"/>
+      </w:rPr>
+    </w:lvl>
+    <w:lvl w:ilvl="3" w:tentative="1">
+      <w:start w:val="1"/>
+      <w:numFmt w:val="bullet"/>
+      <w:lvlText w:val=""/>
+      <w:lvlJc w:val="left"/>
+      <w:pPr>
+        <w:tabs>
+          <w:tab w:val="num" w:pos="2880"/>
+        </w:tabs>
+        <w:ind w:left="2880" w:hanging="360"/>
+      </w:pPr>
+      <w:rPr>
+        <w:rFonts w:ascii="Wingdings" w:hAnsi="Wingdings" w:hint="default"/>
+        <w:sz w:val="20"/>
+      </w:rPr>
+    </w:lvl>
+    <w:lvl w:ilvl="4" w:tentative="1">
+      <w:start w:val="1"/>
+      <w:numFmt w:val="bullet"/>
+      <w:lvlText w:val=""/>
+      <w:lvlJc w:val="left"/>
+      <w:pPr>
+        <w:tabs>
+          <w:tab w:val="num" w:pos="3600"/>
+        </w:tabs>
+        <w:ind w:left="3600" w:hanging="360"/>
+      </w:pPr>
+      <w:rPr>
+        <w:rFonts w:ascii="Wingdings" w:hAnsi="Wingdings" w:hint="default"/>
+        <w:sz w:val="20"/>
+      </w:rPr>
+    </w:lvl>
+    <w:lvl w:ilvl="5" w:tentative="1">
+      <w:start w:val="1"/>
+      <w:numFmt w:val="bullet"/>
+      <w:lvlText w:val=""/>
+      <w:lvlJc w:val="left"/>
+      <w:pPr>
+        <w:tabs>
+          <w:tab w:val="num" w:pos="4320"/>
+        </w:tabs>
+        <w:ind w:left="4320" w:hanging="360"/>
+      </w:pPr>
+      <w:rPr>
+        <w:rFonts w:ascii="Wingdings" w:hAnsi="Wingdings" w:hint="default"/>
+        <w:sz w:val="20"/>
+      </w:rPr>
+    </w:lvl>
+    <w:lvl w:ilvl="6" w:tentative="1">
+      <w:start w:val="1"/>
+      <w:numFmt w:val="bullet"/>
+      <w:lvlText w:val=""/>
+      <w:lvlJc w:val="left"/>
+      <w:pPr>
+        <w:tabs>
+          <w:tab w:val="num" w:pos="5040"/>
+        </w:tabs>
+        <w:ind w:left="5040" w:hanging="360"/>
+      </w:pPr>
+      <w:rPr>
+        <w:rFonts w:ascii="Wingdings" w:hAnsi="Wingdings" w:hint="default"/>
+        <w:sz w:val="20"/>
+      </w:rPr>
+    </w:lvl>
+    <w:lvl w:ilvl="7" w:tentative="1">
+      <w:start w:val="1"/>
+      <w:numFmt w:val="bullet"/>
+      <w:lvlText w:val=""/>
+      <w:lvlJc w:val="left"/>
+      <w:pPr>
+        <w:tabs>
+          <w:tab w:val="num" w:pos="5760"/>
+        </w:tabs>
+        <w:ind w:left="5760" w:hanging="360"/>
+      </w:pPr>
+      <w:rPr>
+        <w:rFonts w:ascii="Wingdings" w:hAnsi="Wingdings" w:hint="default"/>
+        <w:sz w:val="20"/>
+      </w:rPr>
+    </w:lvl>
+    <w:lvl w:ilvl="8" w:tentative="1">
+      <w:start w:val="1"/>
+      <w:numFmt w:val="bullet"/>
+      <w:lvlText w:val=""/>
+      <w:lvlJc w:val="left"/>
+      <w:pPr>
+        <w:tabs>
+          <w:tab w:val="num" w:pos="6480"/>
+        </w:tabs>
+        <w:ind w:left="6480" w:hanging="360"/>
+      </w:pPr>
+      <w:rPr>
+        <w:rFonts w:ascii="Wingdings" w:hAnsi="Wingdings" w:hint="default"/>
+        <w:sz w:val="20"/>
+      </w:rPr>
+    </w:lvl>
+  </w:abstractNum>
+  <w:abstractNum w:abstractNumId="2" w15:restartNumberingAfterBreak="0">
     <w:nsid w:val="1F000989"/>
     <w:multiLevelType w:val="multilevel"/>
     <w:tmpl w:val="FC7819B8"/>
@@ -2849,7 +3834,156 @@
       </w:rPr>
     </w:lvl>
   </w:abstractNum>
-  <w:abstractNum w:abstractNumId="2" w15:restartNumberingAfterBreak="0">
+  <w:abstractNum w:abstractNumId="3" w15:restartNumberingAfterBreak="0">
+    <w:nsid w:val="26EE404A"/>
+    <w:multiLevelType w:val="multilevel"/>
+    <w:tmpl w:val="2CDEA790"/>
+    <w:lvl w:ilvl="0">
+      <w:start w:val="1"/>
+      <w:numFmt w:val="bullet"/>
+      <w:lvlText w:val=""/>
+      <w:lvlJc w:val="left"/>
+      <w:pPr>
+        <w:tabs>
+          <w:tab w:val="num" w:pos="720"/>
+        </w:tabs>
+        <w:ind w:left="720" w:hanging="360"/>
+      </w:pPr>
+      <w:rPr>
+        <w:rFonts w:ascii="Symbol" w:hAnsi="Symbol" w:hint="default"/>
+        <w:sz w:val="20"/>
+      </w:rPr>
+    </w:lvl>
+    <w:lvl w:ilvl="1" w:tentative="1">
+      <w:start w:val="1"/>
+      <w:numFmt w:val="bullet"/>
+      <w:lvlText w:val="o"/>
+      <w:lvlJc w:val="left"/>
+      <w:pPr>
+        <w:tabs>
+          <w:tab w:val="num" w:pos="1440"/>
+        </w:tabs>
+        <w:ind w:left="1440" w:hanging="360"/>
+      </w:pPr>
+      <w:rPr>
+        <w:rFonts w:ascii="Courier New" w:hAnsi="Courier New" w:hint="default"/>
+        <w:sz w:val="20"/>
+      </w:rPr>
+    </w:lvl>
+    <w:lvl w:ilvl="2" w:tentative="1">
+      <w:start w:val="1"/>
+      <w:numFmt w:val="bullet"/>
+      <w:lvlText w:val=""/>
+      <w:lvlJc w:val="left"/>
+      <w:pPr>
+        <w:tabs>
+          <w:tab w:val="num" w:pos="2160"/>
+        </w:tabs>
+        <w:ind w:left="2160" w:hanging="360"/>
+      </w:pPr>
+      <w:rPr>
+        <w:rFonts w:ascii="Wingdings" w:hAnsi="Wingdings" w:hint="default"/>
+        <w:sz w:val="20"/>
+      </w:rPr>
+    </w:lvl>
+    <w:lvl w:ilvl="3" w:tentative="1">
+      <w:start w:val="1"/>
+      <w:numFmt w:val="bullet"/>
+      <w:lvlText w:val=""/>
+      <w:lvlJc w:val="left"/>
+      <w:pPr>
+        <w:tabs>
+          <w:tab w:val="num" w:pos="2880"/>
+        </w:tabs>
+        <w:ind w:left="2880" w:hanging="360"/>
+      </w:pPr>
+      <w:rPr>
+        <w:rFonts w:ascii="Wingdings" w:hAnsi="Wingdings" w:hint="default"/>
+        <w:sz w:val="20"/>
+      </w:rPr>
+    </w:lvl>
+    <w:lvl w:ilvl="4" w:tentative="1">
+      <w:start w:val="1"/>
+      <w:numFmt w:val="bullet"/>
+      <w:lvlText w:val=""/>
+      <w:lvlJc w:val="left"/>
+      <w:pPr>
+        <w:tabs>
+          <w:tab w:val="num" w:pos="3600"/>
+        </w:tabs>
+        <w:ind w:left="3600" w:hanging="360"/>
+      </w:pPr>
+      <w:rPr>
+        <w:rFonts w:ascii="Wingdings" w:hAnsi="Wingdings" w:hint="default"/>
+        <w:sz w:val="20"/>
+      </w:rPr>
+    </w:lvl>
+    <w:lvl w:ilvl="5" w:tentative="1">
+      <w:start w:val="1"/>
+      <w:numFmt w:val="bullet"/>
+      <w:lvlText w:val=""/>
+      <w:lvlJc w:val="left"/>
+      <w:pPr>
+        <w:tabs>
+          <w:tab w:val="num" w:pos="4320"/>
+        </w:tabs>
+        <w:ind w:left="4320" w:hanging="360"/>
+      </w:pPr>
+      <w:rPr>
+        <w:rFonts w:ascii="Wingdings" w:hAnsi="Wingdings" w:hint="default"/>
+        <w:sz w:val="20"/>
+      </w:rPr>
+    </w:lvl>
+    <w:lvl w:ilvl="6" w:tentative="1">
+      <w:start w:val="1"/>
+      <w:numFmt w:val="bullet"/>
+      <w:lvlText w:val=""/>
+      <w:lvlJc w:val="left"/>
+      <w:pPr>
+        <w:tabs>
+          <w:tab w:val="num" w:pos="5040"/>
+        </w:tabs>
+        <w:ind w:left="5040" w:hanging="360"/>
+      </w:pPr>
+      <w:rPr>
+        <w:rFonts w:ascii="Wingdings" w:hAnsi="Wingdings" w:hint="default"/>
+        <w:sz w:val="20"/>
+      </w:rPr>
+    </w:lvl>
+    <w:lvl w:ilvl="7" w:tentative="1">
+      <w:start w:val="1"/>
+      <w:numFmt w:val="bullet"/>
+      <w:lvlText w:val=""/>
+      <w:lvlJc w:val="left"/>
+      <w:pPr>
+        <w:tabs>
+          <w:tab w:val="num" w:pos="5760"/>
+        </w:tabs>
+        <w:ind w:left="5760" w:hanging="360"/>
+      </w:pPr>
+      <w:rPr>
+        <w:rFonts w:ascii="Wingdings" w:hAnsi="Wingdings" w:hint="default"/>
+        <w:sz w:val="20"/>
+      </w:rPr>
+    </w:lvl>
+    <w:lvl w:ilvl="8" w:tentative="1">
+      <w:start w:val="1"/>
+      <w:numFmt w:val="bullet"/>
+      <w:lvlText w:val=""/>
+      <w:lvlJc w:val="left"/>
+      <w:pPr>
+        <w:tabs>
+          <w:tab w:val="num" w:pos="6480"/>
+        </w:tabs>
+        <w:ind w:left="6480" w:hanging="360"/>
+      </w:pPr>
+      <w:rPr>
+        <w:rFonts w:ascii="Wingdings" w:hAnsi="Wingdings" w:hint="default"/>
+        <w:sz w:val="20"/>
+      </w:rPr>
+    </w:lvl>
+  </w:abstractNum>
+  <w:abstractNum w:abstractNumId="4" w15:restartNumberingAfterBreak="0">
     <w:nsid w:val="2E08323C"/>
     <w:multiLevelType w:val="multilevel"/>
     <w:tmpl w:val="AFAAB058"/>
@@ -2998,7 +4132,7 @@
       </w:rPr>
     </w:lvl>
   </w:abstractNum>
-  <w:abstractNum w:abstractNumId="3" w15:restartNumberingAfterBreak="0">
+  <w:abstractNum w:abstractNumId="5" w15:restartNumberingAfterBreak="0">
     <w:nsid w:val="342C4ACE"/>
     <w:multiLevelType w:val="multilevel"/>
     <w:tmpl w:val="1646E12C"/>
@@ -3147,7 +4281,7 @@
       </w:rPr>
     </w:lvl>
   </w:abstractNum>
-  <w:abstractNum w:abstractNumId="4" w15:restartNumberingAfterBreak="0">
+  <w:abstractNum w:abstractNumId="6" w15:restartNumberingAfterBreak="0">
     <w:nsid w:val="3A0646E3"/>
     <w:multiLevelType w:val="multilevel"/>
     <w:tmpl w:val="917A7900"/>
@@ -3296,7 +4430,7 @@
       </w:rPr>
     </w:lvl>
   </w:abstractNum>
-  <w:abstractNum w:abstractNumId="5" w15:restartNumberingAfterBreak="0">
+  <w:abstractNum w:abstractNumId="7" w15:restartNumberingAfterBreak="0">
     <w:nsid w:val="445D7695"/>
     <w:multiLevelType w:val="multilevel"/>
     <w:tmpl w:val="100E4850"/>
@@ -3445,7 +4579,7 @@
       </w:rPr>
     </w:lvl>
   </w:abstractNum>
-  <w:abstractNum w:abstractNumId="6" w15:restartNumberingAfterBreak="0">
+  <w:abstractNum w:abstractNumId="8" w15:restartNumberingAfterBreak="0">
     <w:nsid w:val="46B14014"/>
     <w:multiLevelType w:val="multilevel"/>
     <w:tmpl w:val="9E2EF664"/>
@@ -3590,7 +4724,7 @@
       </w:rPr>
     </w:lvl>
   </w:abstractNum>
-  <w:abstractNum w:abstractNumId="7" w15:restartNumberingAfterBreak="0">
+  <w:abstractNum w:abstractNumId="9" w15:restartNumberingAfterBreak="0">
     <w:nsid w:val="4B6F3692"/>
     <w:multiLevelType w:val="multilevel"/>
     <w:tmpl w:val="8290525E"/>
@@ -3739,7 +4873,7 @@
       </w:rPr>
     </w:lvl>
   </w:abstractNum>
-  <w:abstractNum w:abstractNumId="8" w15:restartNumberingAfterBreak="0">
+  <w:abstractNum w:abstractNumId="10" w15:restartNumberingAfterBreak="0">
     <w:nsid w:val="60736DEF"/>
     <w:multiLevelType w:val="multilevel"/>
     <w:tmpl w:val="90F8F976"/>
@@ -3888,7 +5022,7 @@
       </w:rPr>
     </w:lvl>
   </w:abstractNum>
-  <w:abstractNum w:abstractNumId="9" w15:restartNumberingAfterBreak="0">
+  <w:abstractNum w:abstractNumId="11" w15:restartNumberingAfterBreak="0">
     <w:nsid w:val="65437A14"/>
     <w:multiLevelType w:val="multilevel"/>
     <w:tmpl w:val="0AFA7890"/>
@@ -4038,35 +5172,193 @@
       </w:rPr>
     </w:lvl>
   </w:abstractNum>
+  <w:abstractNum w:abstractNumId="12" w15:restartNumberingAfterBreak="0">
+    <w:nsid w:val="757C75AE"/>
+    <w:multiLevelType w:val="multilevel"/>
+    <w:tmpl w:val="E760E2B2"/>
+    <w:lvl w:ilvl="0">
+      <w:start w:val="1"/>
+      <w:numFmt w:val="bullet"/>
+      <w:lvlText w:val=""/>
+      <w:lvlJc w:val="left"/>
+      <w:pPr>
+        <w:tabs>
+          <w:tab w:val="num" w:pos="720"/>
+        </w:tabs>
+        <w:ind w:left="720" w:hanging="360"/>
+      </w:pPr>
+      <w:rPr>
+        <w:rFonts w:ascii="Symbol" w:hAnsi="Symbol" w:hint="default"/>
+        <w:sz w:val="20"/>
+      </w:rPr>
+    </w:lvl>
+    <w:lvl w:ilvl="1" w:tentative="1">
+      <w:start w:val="1"/>
+      <w:numFmt w:val="bullet"/>
+      <w:lvlText w:val="o"/>
+      <w:lvlJc w:val="left"/>
+      <w:pPr>
+        <w:tabs>
+          <w:tab w:val="num" w:pos="1440"/>
+        </w:tabs>
+        <w:ind w:left="1440" w:hanging="360"/>
+      </w:pPr>
+      <w:rPr>
+        <w:rFonts w:ascii="Courier New" w:hAnsi="Courier New" w:hint="default"/>
+        <w:sz w:val="20"/>
+      </w:rPr>
+    </w:lvl>
+    <w:lvl w:ilvl="2" w:tentative="1">
+      <w:start w:val="1"/>
+      <w:numFmt w:val="bullet"/>
+      <w:lvlText w:val=""/>
+      <w:lvlJc w:val="left"/>
+      <w:pPr>
+        <w:tabs>
+          <w:tab w:val="num" w:pos="2160"/>
+        </w:tabs>
+        <w:ind w:left="2160" w:hanging="360"/>
+      </w:pPr>
+      <w:rPr>
+        <w:rFonts w:ascii="Wingdings" w:hAnsi="Wingdings" w:hint="default"/>
+        <w:sz w:val="20"/>
+      </w:rPr>
+    </w:lvl>
+    <w:lvl w:ilvl="3" w:tentative="1">
+      <w:start w:val="1"/>
+      <w:numFmt w:val="bullet"/>
+      <w:lvlText w:val=""/>
+      <w:lvlJc w:val="left"/>
+      <w:pPr>
+        <w:tabs>
+          <w:tab w:val="num" w:pos="2880"/>
+        </w:tabs>
+        <w:ind w:left="2880" w:hanging="360"/>
+      </w:pPr>
+      <w:rPr>
+        <w:rFonts w:ascii="Wingdings" w:hAnsi="Wingdings" w:hint="default"/>
+        <w:sz w:val="20"/>
+      </w:rPr>
+    </w:lvl>
+    <w:lvl w:ilvl="4" w:tentative="1">
+      <w:start w:val="1"/>
+      <w:numFmt w:val="bullet"/>
+      <w:lvlText w:val=""/>
+      <w:lvlJc w:val="left"/>
+      <w:pPr>
+        <w:tabs>
+          <w:tab w:val="num" w:pos="3600"/>
+        </w:tabs>
+        <w:ind w:left="3600" w:hanging="360"/>
+      </w:pPr>
+      <w:rPr>
+        <w:rFonts w:ascii="Wingdings" w:hAnsi="Wingdings" w:hint="default"/>
+        <w:sz w:val="20"/>
+      </w:rPr>
+    </w:lvl>
+    <w:lvl w:ilvl="5" w:tentative="1">
+      <w:start w:val="1"/>
+      <w:numFmt w:val="bullet"/>
+      <w:lvlText w:val=""/>
+      <w:lvlJc w:val="left"/>
+      <w:pPr>
+        <w:tabs>
+          <w:tab w:val="num" w:pos="4320"/>
+        </w:tabs>
+        <w:ind w:left="4320" w:hanging="360"/>
+      </w:pPr>
+      <w:rPr>
+        <w:rFonts w:ascii="Wingdings" w:hAnsi="Wingdings" w:hint="default"/>
+        <w:sz w:val="20"/>
+      </w:rPr>
+    </w:lvl>
+    <w:lvl w:ilvl="6" w:tentative="1">
+      <w:start w:val="1"/>
+      <w:numFmt w:val="bullet"/>
+      <w:lvlText w:val=""/>
+      <w:lvlJc w:val="left"/>
+      <w:pPr>
+        <w:tabs>
+          <w:tab w:val="num" w:pos="5040"/>
+        </w:tabs>
+        <w:ind w:left="5040" w:hanging="360"/>
+      </w:pPr>
+      <w:rPr>
+        <w:rFonts w:ascii="Wingdings" w:hAnsi="Wingdings" w:hint="default"/>
+        <w:sz w:val="20"/>
+      </w:rPr>
+    </w:lvl>
+    <w:lvl w:ilvl="7" w:tentative="1">
+      <w:start w:val="1"/>
+      <w:numFmt w:val="bullet"/>
+      <w:lvlText w:val=""/>
+      <w:lvlJc w:val="left"/>
+      <w:pPr>
+        <w:tabs>
+          <w:tab w:val="num" w:pos="5760"/>
+        </w:tabs>
+        <w:ind w:left="5760" w:hanging="360"/>
+      </w:pPr>
+      <w:rPr>
+        <w:rFonts w:ascii="Wingdings" w:hAnsi="Wingdings" w:hint="default"/>
+        <w:sz w:val="20"/>
+      </w:rPr>
+    </w:lvl>
+    <w:lvl w:ilvl="8" w:tentative="1">
+      <w:start w:val="1"/>
+      <w:numFmt w:val="bullet"/>
+      <w:lvlText w:val=""/>
+      <w:lvlJc w:val="left"/>
+      <w:pPr>
+        <w:tabs>
+          <w:tab w:val="num" w:pos="6480"/>
+        </w:tabs>
+        <w:ind w:left="6480" w:hanging="360"/>
+      </w:pPr>
+      <w:rPr>
+        <w:rFonts w:ascii="Wingdings" w:hAnsi="Wingdings" w:hint="default"/>
+        <w:sz w:val="20"/>
+      </w:rPr>
+    </w:lvl>
+  </w:abstractNum>
   <w:num w:numId="1" w16cid:durableId="1049961354">
+    <w:abstractNumId w:val="7"/>
+  </w:num>
+  <w:num w:numId="2" w16cid:durableId="1438983142">
+    <w:abstractNumId w:val="10"/>
+  </w:num>
+  <w:num w:numId="3" w16cid:durableId="1080371069">
+    <w:abstractNumId w:val="8"/>
+  </w:num>
+  <w:num w:numId="4" w16cid:durableId="1988321102">
     <w:abstractNumId w:val="5"/>
   </w:num>
-  <w:num w:numId="2" w16cid:durableId="1438983142">
-    <w:abstractNumId w:val="8"/>
-  </w:num>
-  <w:num w:numId="3" w16cid:durableId="1080371069">
+  <w:num w:numId="5" w16cid:durableId="878123686">
     <w:abstractNumId w:val="6"/>
   </w:num>
-  <w:num w:numId="4" w16cid:durableId="1988321102">
-    <w:abstractNumId w:val="3"/>
-  </w:num>
-  <w:num w:numId="5" w16cid:durableId="878123686">
-    <w:abstractNumId w:val="4"/>
-  </w:num>
   <w:num w:numId="6" w16cid:durableId="2042976483">
-    <w:abstractNumId w:val="1"/>
+    <w:abstractNumId w:val="2"/>
   </w:num>
   <w:num w:numId="7" w16cid:durableId="1801338708">
     <w:abstractNumId w:val="0"/>
   </w:num>
   <w:num w:numId="8" w16cid:durableId="475074607">
-    <w:abstractNumId w:val="7"/>
+    <w:abstractNumId w:val="9"/>
   </w:num>
   <w:num w:numId="9" w16cid:durableId="1270971527">
-    <w:abstractNumId w:val="2"/>
+    <w:abstractNumId w:val="4"/>
   </w:num>
   <w:num w:numId="10" w16cid:durableId="664962">
-    <w:abstractNumId w:val="9"/>
+    <w:abstractNumId w:val="11"/>
+  </w:num>
+  <w:num w:numId="11" w16cid:durableId="1081290921">
+    <w:abstractNumId w:val="12"/>
+  </w:num>
+  <w:num w:numId="12" w16cid:durableId="729302191">
+    <w:abstractNumId w:val="1"/>
+  </w:num>
+  <w:num w:numId="13" w16cid:durableId="1750419423">
+    <w:abstractNumId w:val="3"/>
   </w:num>
 </w:numbering>
 </file>

</xml_diff>